<commit_message>
Updated User Manual to include Search and Filter section
</commit_message>
<xml_diff>
--- a/User manual/User-manual.docx
+++ b/User manual/User-manual.docx
@@ -28,7 +28,7 @@
           <w:lang w:val="en-IN"/>
         </w:rPr>
         <w:pict w14:anchorId="7909E28A">
-          <v:rect id="_x0000_i1073" style="width:0;height:1.5pt" o:hralign="center" o:hrstd="t" o:hr="t" fillcolor="#a0a0a0" stroked="f"/>
+          <v:rect id="_x0000_i1025" style="width:0;height:1.5pt" o:hralign="center" o:hrstd="t" o:hr="t" fillcolor="#a0a0a0" stroked="f"/>
         </w:pict>
       </w:r>
     </w:p>
@@ -163,7 +163,7 @@
           <w:lang w:val="en-IN"/>
         </w:rPr>
         <w:pict w14:anchorId="0B44B754">
-          <v:rect id="_x0000_i1074" style="width:0;height:1.5pt" o:hralign="center" o:hrstd="t" o:hr="t" fillcolor="#a0a0a0" stroked="f"/>
+          <v:rect id="_x0000_i1026" style="width:0;height:1.5pt" o:hralign="center" o:hrstd="t" o:hr="t" fillcolor="#a0a0a0" stroked="f"/>
         </w:pict>
       </w:r>
     </w:p>
@@ -281,7 +281,7 @@
           <w:lang w:val="en-IN"/>
         </w:rPr>
         <w:pict w14:anchorId="6639DA45">
-          <v:rect id="_x0000_i1075" style="width:0;height:1.5pt" o:hralign="center" o:hrstd="t" o:hr="t" fillcolor="#a0a0a0" stroked="f"/>
+          <v:rect id="_x0000_i1027" style="width:0;height:1.5pt" o:hralign="center" o:hrstd="t" o:hr="t" fillcolor="#a0a0a0" stroked="f"/>
         </w:pict>
       </w:r>
     </w:p>
@@ -305,43 +305,46 @@
     <w:p>
       <w:pPr>
         <w:rPr>
-          <w:lang w:val="en-IN"/>
-        </w:rPr>
-      </w:pPr>
-      <w:r>
-        <w:rPr>
           <w:b/>
           <w:bCs/>
           <w:lang w:val="en-IN"/>
         </w:rPr>
-        <w:t>Overview:</w:t>
-      </w:r>
-      <w:r>
-        <w:rPr>
-          <w:lang w:val="en-IN"/>
-        </w:rPr>
-        <w:t xml:space="preserve"> Quickly find courses based on specific criteria.</w:t>
-      </w:r>
-      <w:r>
-        <w:rPr>
-          <w:lang w:val="en-IN"/>
-        </w:rPr>
-        <w:br/>
-      </w:r>
+      </w:pPr>
       <w:r>
         <w:rPr>
           <w:b/>
           <w:bCs/>
           <w:lang w:val="en-IN"/>
         </w:rPr>
+        <w:t>Overview:</w:t>
+      </w:r>
+      <w:r>
+        <w:rPr>
+          <w:lang w:val="en-IN"/>
+        </w:rPr>
+        <w:t xml:space="preserve"> Quickly find courses based on specific criteria.</w:t>
+      </w:r>
+      <w:r>
+        <w:rPr>
+          <w:lang w:val="en-IN"/>
+        </w:rPr>
+        <w:br/>
+      </w:r>
+      <w:r>
+        <w:rPr>
+          <w:b/>
+          <w:bCs/>
+          <w:lang w:val="en-IN"/>
+        </w:rPr>
         <w:t>Steps to Use:</w:t>
       </w:r>
     </w:p>
     <w:p>
       <w:pPr>
+        <w:pStyle w:val="ListParagraph"/>
         <w:numPr>
           <w:ilvl w:val="0"/>
-          <w:numId w:val="3"/>
+          <w:numId w:val="8"/>
         </w:numPr>
         <w:rPr>
           <w:lang w:val="en-IN"/>
@@ -351,14 +354,63 @@
         <w:rPr>
           <w:lang w:val="en-IN"/>
         </w:rPr>
-        <w:t>Navigate to the ‘Courses’ section.</w:t>
-      </w:r>
-    </w:p>
-    <w:p>
-      <w:pPr>
+        <w:t>User can either search for course name using keywords or categories</w:t>
+      </w:r>
+    </w:p>
+    <w:p>
+      <w:pPr>
+        <w:pStyle w:val="ListParagraph"/>
+        <w:rPr>
+          <w:lang w:val="en-IN"/>
+        </w:rPr>
+      </w:pPr>
+      <w:r>
+        <w:rPr>
+          <w:lang w:val="en-IN"/>
+        </w:rPr>
+        <w:drawing>
+          <wp:inline distT="0" distB="0" distL="0" distR="0" wp14:anchorId="6DC83D4D" wp14:editId="657D315C">
+            <wp:extent cx="5731510" cy="2366645"/>
+            <wp:effectExtent l="0" t="0" r="2540" b="0"/>
+            <wp:docPr id="107214140" name="Picture 1" descr="A screenshot of a computer&#10;&#10;AI-generated content may be incorrect."/>
+            <wp:cNvGraphicFramePr>
+              <a:graphicFrameLocks xmlns:a="http://schemas.openxmlformats.org/drawingml/2006/main" noChangeAspect="1"/>
+            </wp:cNvGraphicFramePr>
+            <a:graphic xmlns:a="http://schemas.openxmlformats.org/drawingml/2006/main">
+              <a:graphicData uri="http://schemas.openxmlformats.org/drawingml/2006/picture">
+                <pic:pic xmlns:pic="http://schemas.openxmlformats.org/drawingml/2006/picture">
+                  <pic:nvPicPr>
+                    <pic:cNvPr id="107214140" name="Picture 1" descr="A screenshot of a computer&#10;&#10;AI-generated content may be incorrect."/>
+                    <pic:cNvPicPr/>
+                  </pic:nvPicPr>
+                  <pic:blipFill>
+                    <a:blip r:embed="rId5"/>
+                    <a:stretch>
+                      <a:fillRect/>
+                    </a:stretch>
+                  </pic:blipFill>
+                  <pic:spPr>
+                    <a:xfrm>
+                      <a:off x="0" y="0"/>
+                      <a:ext cx="5731510" cy="2366645"/>
+                    </a:xfrm>
+                    <a:prstGeom prst="rect">
+                      <a:avLst/>
+                    </a:prstGeom>
+                  </pic:spPr>
+                </pic:pic>
+              </a:graphicData>
+            </a:graphic>
+          </wp:inline>
+        </w:drawing>
+      </w:r>
+    </w:p>
+    <w:p>
+      <w:pPr>
+        <w:pStyle w:val="ListParagraph"/>
         <w:numPr>
           <w:ilvl w:val="0"/>
-          <w:numId w:val="3"/>
+          <w:numId w:val="8"/>
         </w:numPr>
         <w:rPr>
           <w:lang w:val="en-IN"/>
@@ -368,14 +420,64 @@
         <w:rPr>
           <w:lang w:val="en-IN"/>
         </w:rPr>
-        <w:t>Use the search bar to enter keywords.</w:t>
-      </w:r>
-    </w:p>
-    <w:p>
-      <w:pPr>
+        <w:t>Click the search button to find the course name</w:t>
+      </w:r>
+    </w:p>
+    <w:p>
+      <w:pPr>
+        <w:ind w:left="720"/>
+        <w:rPr>
+          <w:lang w:val="en-IN"/>
+        </w:rPr>
+      </w:pPr>
+      <w:r>
+        <w:rPr>
+          <w:lang w:val="en-IN"/>
+        </w:rPr>
+        <w:lastRenderedPageBreak/>
+        <w:drawing>
+          <wp:inline distT="0" distB="0" distL="0" distR="0" wp14:anchorId="5A26C0FA" wp14:editId="6710AC32">
+            <wp:extent cx="5731510" cy="2490470"/>
+            <wp:effectExtent l="0" t="0" r="2540" b="5080"/>
+            <wp:docPr id="1366570573" name="Picture 1" descr="A screenshot of a computer&#10;&#10;AI-generated content may be incorrect."/>
+            <wp:cNvGraphicFramePr>
+              <a:graphicFrameLocks xmlns:a="http://schemas.openxmlformats.org/drawingml/2006/main" noChangeAspect="1"/>
+            </wp:cNvGraphicFramePr>
+            <a:graphic xmlns:a="http://schemas.openxmlformats.org/drawingml/2006/main">
+              <a:graphicData uri="http://schemas.openxmlformats.org/drawingml/2006/picture">
+                <pic:pic xmlns:pic="http://schemas.openxmlformats.org/drawingml/2006/picture">
+                  <pic:nvPicPr>
+                    <pic:cNvPr id="1366570573" name="Picture 1" descr="A screenshot of a computer&#10;&#10;AI-generated content may be incorrect."/>
+                    <pic:cNvPicPr/>
+                  </pic:nvPicPr>
+                  <pic:blipFill>
+                    <a:blip r:embed="rId6"/>
+                    <a:stretch>
+                      <a:fillRect/>
+                    </a:stretch>
+                  </pic:blipFill>
+                  <pic:spPr>
+                    <a:xfrm>
+                      <a:off x="0" y="0"/>
+                      <a:ext cx="5731510" cy="2490470"/>
+                    </a:xfrm>
+                    <a:prstGeom prst="rect">
+                      <a:avLst/>
+                    </a:prstGeom>
+                  </pic:spPr>
+                </pic:pic>
+              </a:graphicData>
+            </a:graphic>
+          </wp:inline>
+        </w:drawing>
+      </w:r>
+    </w:p>
+    <w:p>
+      <w:pPr>
+        <w:pStyle w:val="ListParagraph"/>
         <w:numPr>
           <w:ilvl w:val="0"/>
-          <w:numId w:val="3"/>
+          <w:numId w:val="8"/>
         </w:numPr>
         <w:rPr>
           <w:lang w:val="en-IN"/>
@@ -385,24 +487,7 @@
         <w:rPr>
           <w:lang w:val="en-IN"/>
         </w:rPr>
-        <w:t>Apply filters such as category, difficulty level, or instructor.</w:t>
-      </w:r>
-    </w:p>
-    <w:p>
-      <w:pPr>
-        <w:numPr>
-          <w:ilvl w:val="0"/>
-          <w:numId w:val="3"/>
-        </w:numPr>
-        <w:rPr>
-          <w:lang w:val="en-IN"/>
-        </w:rPr>
-      </w:pPr>
-      <w:r>
-        <w:rPr>
-          <w:lang w:val="en-IN"/>
-        </w:rPr>
-        <w:t>Select a course to view details and enroll.</w:t>
+        <w:t>The results are displayed</w:t>
       </w:r>
     </w:p>
     <w:p>
@@ -416,7 +501,7 @@
           <w:lang w:val="en-IN"/>
         </w:rPr>
         <w:pict w14:anchorId="54777137">
-          <v:rect id="_x0000_i1076" style="width:0;height:1.5pt" o:hralign="center" o:hrstd="t" o:hr="t" fillcolor="#a0a0a0" stroked="f"/>
+          <v:rect id="_x0000_i1028" style="width:0;height:1.5pt" o:hralign="center" o:hrstd="t" o:hr="t" fillcolor="#a0a0a0" stroked="f"/>
         </w:pict>
       </w:r>
     </w:p>
@@ -534,7 +619,7 @@
           <w:lang w:val="en-IN"/>
         </w:rPr>
         <w:pict w14:anchorId="053F3741">
-          <v:rect id="_x0000_i1077" style="width:0;height:1.5pt" o:hralign="center" o:hrstd="t" o:hr="t" fillcolor="#a0a0a0" stroked="f"/>
+          <v:rect id="_x0000_i1029" style="width:0;height:1.5pt" o:hralign="center" o:hrstd="t" o:hr="t" fillcolor="#a0a0a0" stroked="f"/>
         </w:pict>
       </w:r>
     </w:p>
@@ -552,7 +637,6 @@
           <w:bCs/>
           <w:lang w:val="en-IN"/>
         </w:rPr>
-        <w:lastRenderedPageBreak/>
         <w:t>5. View Course Stats</w:t>
       </w:r>
     </w:p>
@@ -605,16 +689,8 @@
         <w:rPr>
           <w:lang w:val="en-IN"/>
         </w:rPr>
-        <w:t>Go to ‘Course Stats</w:t>
-      </w:r>
-      <w:proofErr w:type="gramStart"/>
-      <w:r>
-        <w:rPr>
-          <w:lang w:val="en-IN"/>
-        </w:rPr>
-        <w:t>’.</w:t>
-      </w:r>
-      <w:proofErr w:type="gramEnd"/>
+        <w:t>Go to ‘Course Stats’.</w:t>
+      </w:r>
     </w:p>
     <w:p>
       <w:pPr>
@@ -661,7 +737,7 @@
           <w:lang w:val="en-IN"/>
         </w:rPr>
         <w:pict w14:anchorId="65377E25">
-          <v:rect id="_x0000_i1078" style="width:0;height:1.5pt" o:hralign="center" o:hrstd="t" o:hr="t" fillcolor="#a0a0a0" stroked="f"/>
+          <v:rect id="_x0000_i1030" style="width:0;height:1.5pt" o:hralign="center" o:hrstd="t" o:hr="t" fillcolor="#a0a0a0" stroked="f"/>
         </w:pict>
       </w:r>
     </w:p>
@@ -779,7 +855,7 @@
           <w:lang w:val="en-IN"/>
         </w:rPr>
         <w:pict w14:anchorId="1CEF40DD">
-          <v:rect id="_x0000_i1079" style="width:0;height:1.5pt" o:hralign="center" o:hrstd="t" o:hr="t" fillcolor="#a0a0a0" stroked="f"/>
+          <v:rect id="_x0000_i1031" style="width:0;height:1.5pt" o:hralign="center" o:hrstd="t" o:hr="t" fillcolor="#a0a0a0" stroked="f"/>
         </w:pict>
       </w:r>
     </w:p>
@@ -797,6 +873,7 @@
           <w:bCs/>
           <w:lang w:val="en-IN"/>
         </w:rPr>
+        <w:lastRenderedPageBreak/>
         <w:t>7. Earning Badges for Completing Courses</w:t>
       </w:r>
     </w:p>
@@ -897,7 +974,7 @@
           <w:lang w:val="en-IN"/>
         </w:rPr>
         <w:pict w14:anchorId="21981596">
-          <v:rect id="_x0000_i1080" style="width:0;height:1.5pt" o:hralign="center" o:hrstd="t" o:hr="t" fillcolor="#a0a0a0" stroked="f"/>
+          <v:rect id="_x0000_i1032" style="width:0;height:1.5pt" o:hralign="center" o:hrstd="t" o:hr="t" fillcolor="#a0a0a0" stroked="f"/>
         </w:pict>
       </w:r>
     </w:p>
@@ -1382,6 +1459,92 @@
     </w:lvl>
   </w:abstractNum>
   <w:abstractNum w:abstractNumId="4" w15:restartNumberingAfterBreak="0">
+    <w:nsid w:val="534E0C3E"/>
+    <w:multiLevelType w:val="hybridMultilevel"/>
+    <w:tmpl w:val="9988950E"/>
+    <w:lvl w:ilvl="0" w:tplc="0809000F">
+      <w:start w:val="1"/>
+      <w:numFmt w:val="decimal"/>
+      <w:lvlText w:val="%1."/>
+      <w:lvlJc w:val="left"/>
+      <w:pPr>
+        <w:ind w:left="720" w:hanging="360"/>
+      </w:pPr>
+    </w:lvl>
+    <w:lvl w:ilvl="1" w:tplc="08090019" w:tentative="1">
+      <w:start w:val="1"/>
+      <w:numFmt w:val="lowerLetter"/>
+      <w:lvlText w:val="%2."/>
+      <w:lvlJc w:val="left"/>
+      <w:pPr>
+        <w:ind w:left="1440" w:hanging="360"/>
+      </w:pPr>
+    </w:lvl>
+    <w:lvl w:ilvl="2" w:tplc="0809001B" w:tentative="1">
+      <w:start w:val="1"/>
+      <w:numFmt w:val="lowerRoman"/>
+      <w:lvlText w:val="%3."/>
+      <w:lvlJc w:val="right"/>
+      <w:pPr>
+        <w:ind w:left="2160" w:hanging="180"/>
+      </w:pPr>
+    </w:lvl>
+    <w:lvl w:ilvl="3" w:tplc="0809000F" w:tentative="1">
+      <w:start w:val="1"/>
+      <w:numFmt w:val="decimal"/>
+      <w:lvlText w:val="%4."/>
+      <w:lvlJc w:val="left"/>
+      <w:pPr>
+        <w:ind w:left="2880" w:hanging="360"/>
+      </w:pPr>
+    </w:lvl>
+    <w:lvl w:ilvl="4" w:tplc="08090019" w:tentative="1">
+      <w:start w:val="1"/>
+      <w:numFmt w:val="lowerLetter"/>
+      <w:lvlText w:val="%5."/>
+      <w:lvlJc w:val="left"/>
+      <w:pPr>
+        <w:ind w:left="3600" w:hanging="360"/>
+      </w:pPr>
+    </w:lvl>
+    <w:lvl w:ilvl="5" w:tplc="0809001B" w:tentative="1">
+      <w:start w:val="1"/>
+      <w:numFmt w:val="lowerRoman"/>
+      <w:lvlText w:val="%6."/>
+      <w:lvlJc w:val="right"/>
+      <w:pPr>
+        <w:ind w:left="4320" w:hanging="180"/>
+      </w:pPr>
+    </w:lvl>
+    <w:lvl w:ilvl="6" w:tplc="0809000F" w:tentative="1">
+      <w:start w:val="1"/>
+      <w:numFmt w:val="decimal"/>
+      <w:lvlText w:val="%7."/>
+      <w:lvlJc w:val="left"/>
+      <w:pPr>
+        <w:ind w:left="5040" w:hanging="360"/>
+      </w:pPr>
+    </w:lvl>
+    <w:lvl w:ilvl="7" w:tplc="08090019" w:tentative="1">
+      <w:start w:val="1"/>
+      <w:numFmt w:val="lowerLetter"/>
+      <w:lvlText w:val="%8."/>
+      <w:lvlJc w:val="left"/>
+      <w:pPr>
+        <w:ind w:left="5760" w:hanging="360"/>
+      </w:pPr>
+    </w:lvl>
+    <w:lvl w:ilvl="8" w:tplc="0809001B" w:tentative="1">
+      <w:start w:val="1"/>
+      <w:numFmt w:val="lowerRoman"/>
+      <w:lvlText w:val="%9."/>
+      <w:lvlJc w:val="right"/>
+      <w:pPr>
+        <w:ind w:left="6480" w:hanging="180"/>
+      </w:pPr>
+    </w:lvl>
+  </w:abstractNum>
+  <w:abstractNum w:abstractNumId="5" w15:restartNumberingAfterBreak="0">
     <w:nsid w:val="61AB1B8E"/>
     <w:multiLevelType w:val="multilevel"/>
     <w:tmpl w:val="9D56519C"/>
@@ -1494,7 +1657,7 @@
       </w:pPr>
     </w:lvl>
   </w:abstractNum>
-  <w:abstractNum w:abstractNumId="5" w15:restartNumberingAfterBreak="0">
+  <w:abstractNum w:abstractNumId="6" w15:restartNumberingAfterBreak="0">
     <w:nsid w:val="65831052"/>
     <w:multiLevelType w:val="multilevel"/>
     <w:tmpl w:val="B6C8B59E"/>
@@ -1607,7 +1770,7 @@
       </w:pPr>
     </w:lvl>
   </w:abstractNum>
-  <w:abstractNum w:abstractNumId="6" w15:restartNumberingAfterBreak="0">
+  <w:abstractNum w:abstractNumId="7" w15:restartNumberingAfterBreak="0">
     <w:nsid w:val="791D2633"/>
     <w:multiLevelType w:val="multilevel"/>
     <w:tmpl w:val="7C9E5C94"/>
@@ -1721,13 +1884,13 @@
     </w:lvl>
   </w:abstractNum>
   <w:num w:numId="1" w16cid:durableId="322781313">
-    <w:abstractNumId w:val="4"/>
+    <w:abstractNumId w:val="5"/>
   </w:num>
   <w:num w:numId="2" w16cid:durableId="1932002546">
     <w:abstractNumId w:val="3"/>
   </w:num>
   <w:num w:numId="3" w16cid:durableId="1980184016">
-    <w:abstractNumId w:val="6"/>
+    <w:abstractNumId w:val="7"/>
   </w:num>
   <w:num w:numId="4" w16cid:durableId="621499727">
     <w:abstractNumId w:val="2"/>
@@ -1736,10 +1899,13 @@
     <w:abstractNumId w:val="1"/>
   </w:num>
   <w:num w:numId="6" w16cid:durableId="137381822">
-    <w:abstractNumId w:val="5"/>
+    <w:abstractNumId w:val="6"/>
   </w:num>
   <w:num w:numId="7" w16cid:durableId="1560676578">
     <w:abstractNumId w:val="0"/>
+  </w:num>
+  <w:num w:numId="8" w16cid:durableId="1920946206">
+    <w:abstractNumId w:val="4"/>
   </w:num>
 </w:numbering>
 </file>
@@ -2347,6 +2513,7 @@
   <w:style w:type="character" w:default="1" w:styleId="DefaultParagraphFont">
     <w:name w:val="Default Paragraph Font"/>
     <w:uiPriority w:val="1"/>
+    <w:semiHidden/>
     <w:unhideWhenUsed/>
   </w:style>
   <w:style w:type="table" w:default="1" w:styleId="TableNormal">

</xml_diff>

<commit_message>
Updated User Manual to include Leaderboard section
</commit_message>
<xml_diff>
--- a/User manual/User-manual.docx
+++ b/User manual/User-manual.docx
@@ -366,6 +366,7 @@
       </w:pPr>
       <w:r>
         <w:rPr>
+          <w:noProof/>
           <w:lang w:val="en-IN"/>
         </w:rPr>
         <w:drawing>
@@ -432,6 +433,7 @@
       </w:pPr>
       <w:r>
         <w:rPr>
+          <w:noProof/>
           <w:lang w:val="en-IN"/>
         </w:rPr>
         <w:lastRenderedPageBreak/>
@@ -658,7 +660,21 @@
         <w:rPr>
           <w:lang w:val="en-IN"/>
         </w:rPr>
-        <w:t xml:space="preserve"> Analyze course performance metrics.</w:t>
+        <w:t xml:space="preserve"> </w:t>
+      </w:r>
+      <w:proofErr w:type="spellStart"/>
+      <w:r>
+        <w:rPr>
+          <w:lang w:val="en-IN"/>
+        </w:rPr>
+        <w:t>Analyze</w:t>
+      </w:r>
+      <w:proofErr w:type="spellEnd"/>
+      <w:r>
+        <w:rPr>
+          <w:lang w:val="en-IN"/>
+        </w:rPr>
+        <w:t xml:space="preserve"> course performance metrics.</w:t>
       </w:r>
       <w:r>
         <w:rPr>
@@ -768,81 +784,556 @@
         <w:rPr>
           <w:b/>
           <w:bCs/>
-          <w:lang w:val="en-IN"/>
-        </w:rPr>
-        <w:t>Overview:</w:t>
-      </w:r>
-      <w:r>
-        <w:rPr>
-          <w:lang w:val="en-IN"/>
-        </w:rPr>
-        <w:t xml:space="preserve"> See rankings based on course performance.</w:t>
-      </w:r>
-      <w:r>
-        <w:rPr>
-          <w:lang w:val="en-IN"/>
-        </w:rPr>
-        <w:br/>
-      </w:r>
-      <w:r>
-        <w:rPr>
-          <w:b/>
-          <w:bCs/>
-          <w:lang w:val="en-IN"/>
-        </w:rPr>
-        <w:t>Steps to Use:</w:t>
+        </w:rPr>
+        <w:t>Overview</w:t>
+      </w:r>
+    </w:p>
+    <w:p>
+      <w:r>
+        <w:t xml:space="preserve">The </w:t>
+      </w:r>
+      <w:r>
+        <w:rPr>
+          <w:b/>
+          <w:bCs/>
+        </w:rPr>
+        <w:t xml:space="preserve">Student XP Leaderboard </w:t>
+      </w:r>
+      <w:r>
+        <w:t>is a Java Swing-based desktop application that displays a leaderboard of students ranked by their Experience Points (XP). The data is fetched from a MySQL database and presented in a user-friendly graphical interface. The application supports pagination, refreshing, and viewing detailed information about each student.</w:t>
+      </w:r>
+    </w:p>
+    <w:p>
+      <w:r>
+        <w:pict w14:anchorId="195ADB02">
+          <v:rect id="_x0000_i1033" style="width:0;height:0" o:hralign="center" o:hrstd="t" o:hrnoshade="t" o:hr="t" fillcolor="#d1d5db" stroked="f"/>
+        </w:pict>
+      </w:r>
+    </w:p>
+    <w:p>
+      <w:pPr>
+        <w:rPr>
+          <w:b/>
+          <w:bCs/>
+        </w:rPr>
+      </w:pPr>
+      <w:r>
+        <w:rPr>
+          <w:b/>
+          <w:bCs/>
+        </w:rPr>
+        <w:t>Key Features</w:t>
+      </w:r>
+    </w:p>
+    <w:p>
+      <w:pPr>
+        <w:ind w:left="720"/>
+      </w:pPr>
+      <w:r>
+        <w:rPr>
+          <w:b/>
+          <w:bCs/>
+        </w:rPr>
+        <w:lastRenderedPageBreak/>
+        <w:t xml:space="preserve">Dynamic Leaderboard Display </w:t>
+      </w:r>
+      <w:r>
+        <w:t>:</w:t>
       </w:r>
     </w:p>
     <w:p>
       <w:pPr>
         <w:numPr>
-          <w:ilvl w:val="0"/>
-          <w:numId w:val="6"/>
+          <w:ilvl w:val="1"/>
+          <w:numId w:val="9"/>
         </w:numPr>
-        <w:rPr>
-          <w:lang w:val="en-IN"/>
-        </w:rPr>
-      </w:pPr>
-      <w:r>
-        <w:rPr>
-          <w:lang w:val="en-IN"/>
-        </w:rPr>
-        <w:t>Navigate to the ‘Leaderboard’ section.</w:t>
+      </w:pPr>
+      <w:r>
+        <w:t>Displays students' rankings, usernames, and XP scores in a table.</w:t>
       </w:r>
     </w:p>
     <w:p>
       <w:pPr>
         <w:numPr>
-          <w:ilvl w:val="0"/>
-          <w:numId w:val="6"/>
+          <w:ilvl w:val="1"/>
+          <w:numId w:val="9"/>
         </w:numPr>
-        <w:rPr>
-          <w:lang w:val="en-IN"/>
-        </w:rPr>
-      </w:pPr>
-      <w:r>
-        <w:rPr>
-          <w:lang w:val="en-IN"/>
-        </w:rPr>
-        <w:t>View rankings based on badges, grades, or completion rates.</w:t>
+      </w:pPr>
+      <w:r>
+        <w:t>Data is fetched dynamically from a MySQL database.</w:t>
+      </w:r>
+    </w:p>
+    <w:p>
+      <w:pPr>
+        <w:ind w:left="720"/>
+      </w:pPr>
+      <w:r>
+        <w:rPr>
+          <w:b/>
+          <w:bCs/>
+        </w:rPr>
+        <w:t xml:space="preserve">Pagination </w:t>
+      </w:r>
+      <w:r>
+        <w:t>:</w:t>
       </w:r>
     </w:p>
     <w:p>
       <w:pPr>
         <w:numPr>
-          <w:ilvl w:val="0"/>
-          <w:numId w:val="6"/>
+          <w:ilvl w:val="1"/>
+          <w:numId w:val="9"/>
         </w:numPr>
-        <w:rPr>
-          <w:lang w:val="en-IN"/>
-        </w:rPr>
-      </w:pPr>
-      <w:r>
-        <w:rPr>
-          <w:lang w:val="en-IN"/>
-        </w:rPr>
-        <w:t>Compare your performance with other users.</w:t>
-      </w:r>
+      </w:pPr>
+      <w:r>
+        <w:t>Supports navigation between pages using "Previous" and "Next" buttons.</w:t>
+      </w:r>
+    </w:p>
+    <w:p>
+      <w:pPr>
+        <w:numPr>
+          <w:ilvl w:val="1"/>
+          <w:numId w:val="9"/>
+        </w:numPr>
+      </w:pPr>
+      <w:r>
+        <w:t>Each page shows up to 10 students (configurable).</w:t>
+      </w:r>
+    </w:p>
+    <w:p>
+      <w:pPr>
+        <w:ind w:left="720"/>
+      </w:pPr>
+      <w:r>
+        <w:rPr>
+          <w:b/>
+          <w:bCs/>
+        </w:rPr>
+        <w:t xml:space="preserve">Refresh Button </w:t>
+      </w:r>
+      <w:r>
+        <w:t>:</w:t>
+      </w:r>
+    </w:p>
+    <w:p>
+      <w:pPr>
+        <w:numPr>
+          <w:ilvl w:val="1"/>
+          <w:numId w:val="9"/>
+        </w:numPr>
+      </w:pPr>
+      <w:r>
+        <w:t>Reloads the latest data from the database to reflect any updates.</w:t>
+      </w:r>
+    </w:p>
+    <w:p>
+      <w:pPr>
+        <w:ind w:left="720"/>
+      </w:pPr>
+      <w:r>
+        <w:rPr>
+          <w:b/>
+          <w:bCs/>
+        </w:rPr>
+        <w:t xml:space="preserve">Row Details </w:t>
+      </w:r>
+      <w:r>
+        <w:t>:</w:t>
+      </w:r>
+    </w:p>
+    <w:p>
+      <w:pPr>
+        <w:numPr>
+          <w:ilvl w:val="1"/>
+          <w:numId w:val="9"/>
+        </w:numPr>
+      </w:pPr>
+      <w:r>
+        <w:t>Clicking on a row in the table displays a popup with the selected student's username and XP.</w:t>
+      </w:r>
+    </w:p>
+    <w:p>
+      <w:pPr>
+        <w:ind w:left="720"/>
+      </w:pPr>
+      <w:r>
+        <w:rPr>
+          <w:b/>
+          <w:bCs/>
+        </w:rPr>
+        <w:t xml:space="preserve">Styling </w:t>
+      </w:r>
+      <w:r>
+        <w:t>:</w:t>
+      </w:r>
+    </w:p>
+    <w:p>
+      <w:pPr>
+        <w:numPr>
+          <w:ilvl w:val="1"/>
+          <w:numId w:val="9"/>
+        </w:numPr>
+        <w:rPr>
+          <w:b/>
+          <w:bCs/>
+        </w:rPr>
+      </w:pPr>
+      <w:r>
+        <w:t xml:space="preserve">Alternating row </w:t>
+      </w:r>
+      <w:r>
+        <w:t>colours</w:t>
+      </w:r>
+      <w:r>
+        <w:t xml:space="preserve"> for better readability.</w:t>
+      </w:r>
+      <w:r>
+        <w:rPr>
+          <w:b/>
+          <w:bCs/>
+        </w:rPr>
+        <w:t xml:space="preserve"> </w:t>
+      </w:r>
+    </w:p>
+    <w:p>
+      <w:pPr>
+        <w:ind w:left="1440"/>
+      </w:pPr>
+    </w:p>
+    <w:p>
+      <w:pPr>
+        <w:ind w:left="1440"/>
+      </w:pPr>
+    </w:p>
+    <w:p>
+      <w:r>
+        <w:t>The application has three main sections:</w:t>
+      </w:r>
+    </w:p>
+    <w:p>
+      <w:pPr>
+        <w:rPr>
+          <w:b/>
+          <w:bCs/>
+        </w:rPr>
+      </w:pPr>
+      <w:r>
+        <w:rPr>
+          <w:b/>
+          <w:bCs/>
+        </w:rPr>
+        <w:t>Header Panel</w:t>
+      </w:r>
+    </w:p>
+    <w:p>
+      <w:pPr>
+        <w:tabs>
+          <w:tab w:val="num" w:pos="1440"/>
+        </w:tabs>
+      </w:pPr>
+      <w:r>
+        <w:t xml:space="preserve">Displays the title: </w:t>
+      </w:r>
+      <w:r>
+        <w:rPr>
+          <w:b/>
+          <w:bCs/>
+        </w:rPr>
+        <w:t xml:space="preserve">"Student XP Leaderboard" </w:t>
+      </w:r>
+      <w:r>
+        <w:t>.</w:t>
+      </w:r>
+    </w:p>
+    <w:p>
+      <w:pPr>
+        <w:tabs>
+          <w:tab w:val="num" w:pos="1440"/>
+        </w:tabs>
+      </w:pPr>
+      <w:r>
+        <w:t>Provides a clean and professional look with a blue background.</w:t>
+      </w:r>
+    </w:p>
+    <w:p>
+      <w:pPr>
+        <w:rPr>
+          <w:b/>
+          <w:bCs/>
+        </w:rPr>
+      </w:pPr>
+      <w:r>
+        <w:rPr>
+          <w:b/>
+          <w:bCs/>
+        </w:rPr>
+        <w:t>Table</w:t>
+      </w:r>
+    </w:p>
+    <w:p>
+      <w:pPr>
+        <w:tabs>
+          <w:tab w:val="num" w:pos="1440"/>
+        </w:tabs>
+      </w:pPr>
+      <w:r>
+        <w:t>Shows the leaderboard with the following columns:</w:t>
+      </w:r>
+    </w:p>
+    <w:p>
+      <w:r>
+        <w:rPr>
+          <w:b/>
+          <w:bCs/>
+        </w:rPr>
+        <w:t xml:space="preserve">Rank </w:t>
+      </w:r>
+      <w:r>
+        <w:t>: The student's position based on XP.</w:t>
+      </w:r>
+    </w:p>
+    <w:p>
+      <w:r>
+        <w:rPr>
+          <w:b/>
+          <w:bCs/>
+        </w:rPr>
+        <w:t xml:space="preserve">Username </w:t>
+      </w:r>
+      <w:r>
+        <w:t>: The name of the student.</w:t>
+      </w:r>
+    </w:p>
+    <w:p>
+      <w:r>
+        <w:rPr>
+          <w:b/>
+          <w:bCs/>
+        </w:rPr>
+        <w:t xml:space="preserve">XP </w:t>
+      </w:r>
+      <w:r>
+        <w:t>: The student's experience points.</w:t>
+      </w:r>
+    </w:p>
+    <w:p>
+      <w:pPr>
+        <w:tabs>
+          <w:tab w:val="num" w:pos="1440"/>
+        </w:tabs>
+      </w:pPr>
+      <w:r>
+        <w:t xml:space="preserve">Rows are styled with alternating </w:t>
+      </w:r>
+      <w:r>
+        <w:t>colours</w:t>
+      </w:r>
+      <w:r>
+        <w:t xml:space="preserve"> (light blue and white) for readability.</w:t>
+      </w:r>
+    </w:p>
+    <w:p>
+      <w:pPr>
+        <w:ind w:left="1440"/>
+        <w:rPr>
+          <w:b/>
+          <w:bCs/>
+        </w:rPr>
+      </w:pPr>
+      <w:r>
+        <w:rPr>
+          <w:b/>
+          <w:bCs/>
+        </w:rPr>
+        <w:t>Buttons</w:t>
+      </w:r>
+    </w:p>
+    <w:p>
+      <w:pPr>
+        <w:tabs>
+          <w:tab w:val="num" w:pos="1440"/>
+        </w:tabs>
+        <w:ind w:left="1080"/>
+      </w:pPr>
+      <w:r>
+        <w:t>Located at the bottom of the window:</w:t>
+      </w:r>
+    </w:p>
+    <w:p>
+      <w:pPr>
+        <w:ind w:left="1440"/>
+      </w:pPr>
+      <w:r>
+        <w:rPr>
+          <w:b/>
+          <w:bCs/>
+        </w:rPr>
+        <w:t xml:space="preserve">Previous </w:t>
+      </w:r>
+      <w:r>
+        <w:t>: Navigate to the previous page of students.</w:t>
+      </w:r>
+    </w:p>
+    <w:p>
+      <w:pPr>
+        <w:ind w:left="1440"/>
+      </w:pPr>
+      <w:r>
+        <w:rPr>
+          <w:b/>
+          <w:bCs/>
+        </w:rPr>
+        <w:t xml:space="preserve">Next </w:t>
+      </w:r>
+      <w:r>
+        <w:t>: Navigate to the next page of students.</w:t>
+      </w:r>
+    </w:p>
+    <w:p>
+      <w:pPr>
+        <w:ind w:left="1440"/>
+      </w:pPr>
+      <w:r>
+        <w:rPr>
+          <w:b/>
+          <w:bCs/>
+        </w:rPr>
+        <w:t xml:space="preserve">Refresh </w:t>
+      </w:r>
+      <w:r>
+        <w:t>: Reload the data from the database to reflect any changes.</w:t>
+      </w:r>
+    </w:p>
+    <w:p>
+      <w:pPr>
+        <w:ind w:left="1440"/>
+      </w:pPr>
+      <w:r>
+        <w:pict w14:anchorId="4D90AC20">
+          <v:rect id="_x0000_i1034" style="width:0;height:0" o:hralign="center" o:hrstd="t" o:hr="t" fillcolor="#a0a0a0" stroked="f"/>
+        </w:pict>
+      </w:r>
+    </w:p>
+    <w:p>
+      <w:pPr>
+        <w:tabs>
+          <w:tab w:val="num" w:pos="1440"/>
+        </w:tabs>
+        <w:ind w:left="1440"/>
+      </w:pPr>
+      <w:r>
+        <w:rPr>
+          <w:b/>
+          <w:bCs/>
+        </w:rPr>
+        <w:lastRenderedPageBreak/>
+        <w:t xml:space="preserve">View Student Details </w:t>
+      </w:r>
+      <w:r>
+        <w:t>:</w:t>
+      </w:r>
+    </w:p>
+    <w:p>
+      <w:pPr>
+        <w:ind w:left="1440"/>
+      </w:pPr>
+      <w:r>
+        <w:t>Click on any row in the table to see a popup with the selected student's username and XP.</w:t>
+      </w:r>
+    </w:p>
+    <w:p>
+      <w:pPr>
+        <w:tabs>
+          <w:tab w:val="num" w:pos="1440"/>
+        </w:tabs>
+        <w:ind w:left="1440"/>
+      </w:pPr>
+      <w:r>
+        <w:rPr>
+          <w:b/>
+          <w:bCs/>
+        </w:rPr>
+        <w:t xml:space="preserve">Navigate Pages </w:t>
+      </w:r>
+      <w:r>
+        <w:t>:</w:t>
+      </w:r>
+    </w:p>
+    <w:p>
+      <w:pPr>
+        <w:ind w:left="1440"/>
+      </w:pPr>
+      <w:r>
+        <w:t xml:space="preserve">Use the </w:t>
+      </w:r>
+      <w:r>
+        <w:rPr>
+          <w:b/>
+          <w:bCs/>
+        </w:rPr>
+        <w:t xml:space="preserve">Previous </w:t>
+      </w:r>
+      <w:r>
+        <w:t xml:space="preserve">and </w:t>
+      </w:r>
+      <w:r>
+        <w:rPr>
+          <w:b/>
+          <w:bCs/>
+        </w:rPr>
+        <w:t xml:space="preserve">Next </w:t>
+      </w:r>
+      <w:r>
+        <w:t>buttons to move between pages if there are more than 10 students.</w:t>
+      </w:r>
+    </w:p>
+    <w:p>
+      <w:pPr>
+        <w:tabs>
+          <w:tab w:val="num" w:pos="1440"/>
+        </w:tabs>
+        <w:ind w:left="1440"/>
+      </w:pPr>
+      <w:r>
+        <w:rPr>
+          <w:b/>
+          <w:bCs/>
+        </w:rPr>
+        <w:t xml:space="preserve">Refresh Data </w:t>
+      </w:r>
+      <w:r>
+        <w:t>:</w:t>
+      </w:r>
+    </w:p>
+    <w:p>
+      <w:pPr>
+        <w:ind w:left="1440"/>
+      </w:pPr>
+      <w:r>
+        <w:t xml:space="preserve">If new students are added to the database or XP values are updated, click the </w:t>
+      </w:r>
+      <w:r>
+        <w:rPr>
+          <w:b/>
+          <w:bCs/>
+        </w:rPr>
+        <w:t xml:space="preserve">Refresh </w:t>
+      </w:r>
+      <w:r>
+        <w:t>button to reload the latest data.</w:t>
+      </w:r>
+    </w:p>
+    <w:p>
+      <w:pPr>
+        <w:ind w:left="1440"/>
+      </w:pPr>
+    </w:p>
+    <w:p>
+      <w:pPr>
+        <w:rPr>
+          <w:lang w:val="en-IN"/>
+        </w:rPr>
+      </w:pPr>
     </w:p>
     <w:p>
       <w:pPr>
@@ -873,7 +1364,6 @@
           <w:bCs/>
           <w:lang w:val="en-IN"/>
         </w:rPr>
-        <w:lastRenderedPageBreak/>
         <w:t>7. Earning Badges for Completing Courses</w:t>
       </w:r>
     </w:p>
@@ -1346,6 +1836,123 @@
     </w:lvl>
   </w:abstractNum>
   <w:abstractNum w:abstractNumId="3" w15:restartNumberingAfterBreak="0">
+    <w:nsid w:val="479448F6"/>
+    <w:multiLevelType w:val="multilevel"/>
+    <w:tmpl w:val="9184EEAE"/>
+    <w:lvl w:ilvl="0">
+      <w:start w:val="1"/>
+      <w:numFmt w:val="decimal"/>
+      <w:lvlText w:val="%1."/>
+      <w:lvlJc w:val="left"/>
+      <w:pPr>
+        <w:tabs>
+          <w:tab w:val="num" w:pos="720"/>
+        </w:tabs>
+        <w:ind w:left="720" w:hanging="360"/>
+      </w:pPr>
+    </w:lvl>
+    <w:lvl w:ilvl="1">
+      <w:start w:val="1"/>
+      <w:numFmt w:val="bullet"/>
+      <w:lvlText w:val=""/>
+      <w:lvlJc w:val="left"/>
+      <w:pPr>
+        <w:tabs>
+          <w:tab w:val="num" w:pos="1440"/>
+        </w:tabs>
+        <w:ind w:left="1440" w:hanging="360"/>
+      </w:pPr>
+      <w:rPr>
+        <w:rFonts w:ascii="Symbol" w:hAnsi="Symbol" w:hint="default"/>
+        <w:sz w:val="20"/>
+      </w:rPr>
+    </w:lvl>
+    <w:lvl w:ilvl="2" w:tentative="1">
+      <w:start w:val="1"/>
+      <w:numFmt w:val="decimal"/>
+      <w:lvlText w:val="%3."/>
+      <w:lvlJc w:val="left"/>
+      <w:pPr>
+        <w:tabs>
+          <w:tab w:val="num" w:pos="2160"/>
+        </w:tabs>
+        <w:ind w:left="2160" w:hanging="360"/>
+      </w:pPr>
+    </w:lvl>
+    <w:lvl w:ilvl="3" w:tentative="1">
+      <w:start w:val="1"/>
+      <w:numFmt w:val="decimal"/>
+      <w:lvlText w:val="%4."/>
+      <w:lvlJc w:val="left"/>
+      <w:pPr>
+        <w:tabs>
+          <w:tab w:val="num" w:pos="2880"/>
+        </w:tabs>
+        <w:ind w:left="2880" w:hanging="360"/>
+      </w:pPr>
+    </w:lvl>
+    <w:lvl w:ilvl="4" w:tentative="1">
+      <w:start w:val="1"/>
+      <w:numFmt w:val="decimal"/>
+      <w:lvlText w:val="%5."/>
+      <w:lvlJc w:val="left"/>
+      <w:pPr>
+        <w:tabs>
+          <w:tab w:val="num" w:pos="3600"/>
+        </w:tabs>
+        <w:ind w:left="3600" w:hanging="360"/>
+      </w:pPr>
+    </w:lvl>
+    <w:lvl w:ilvl="5" w:tentative="1">
+      <w:start w:val="1"/>
+      <w:numFmt w:val="decimal"/>
+      <w:lvlText w:val="%6."/>
+      <w:lvlJc w:val="left"/>
+      <w:pPr>
+        <w:tabs>
+          <w:tab w:val="num" w:pos="4320"/>
+        </w:tabs>
+        <w:ind w:left="4320" w:hanging="360"/>
+      </w:pPr>
+    </w:lvl>
+    <w:lvl w:ilvl="6" w:tentative="1">
+      <w:start w:val="1"/>
+      <w:numFmt w:val="decimal"/>
+      <w:lvlText w:val="%7."/>
+      <w:lvlJc w:val="left"/>
+      <w:pPr>
+        <w:tabs>
+          <w:tab w:val="num" w:pos="5040"/>
+        </w:tabs>
+        <w:ind w:left="5040" w:hanging="360"/>
+      </w:pPr>
+    </w:lvl>
+    <w:lvl w:ilvl="7" w:tentative="1">
+      <w:start w:val="1"/>
+      <w:numFmt w:val="decimal"/>
+      <w:lvlText w:val="%8."/>
+      <w:lvlJc w:val="left"/>
+      <w:pPr>
+        <w:tabs>
+          <w:tab w:val="num" w:pos="5760"/>
+        </w:tabs>
+        <w:ind w:left="5760" w:hanging="360"/>
+      </w:pPr>
+    </w:lvl>
+    <w:lvl w:ilvl="8" w:tentative="1">
+      <w:start w:val="1"/>
+      <w:numFmt w:val="decimal"/>
+      <w:lvlText w:val="%9."/>
+      <w:lvlJc w:val="left"/>
+      <w:pPr>
+        <w:tabs>
+          <w:tab w:val="num" w:pos="6480"/>
+        </w:tabs>
+        <w:ind w:left="6480" w:hanging="360"/>
+      </w:pPr>
+    </w:lvl>
+  </w:abstractNum>
+  <w:abstractNum w:abstractNumId="4" w15:restartNumberingAfterBreak="0">
     <w:nsid w:val="4EEE51E6"/>
     <w:multiLevelType w:val="multilevel"/>
     <w:tmpl w:val="39C0F4FA"/>
@@ -1458,7 +2065,7 @@
       </w:pPr>
     </w:lvl>
   </w:abstractNum>
-  <w:abstractNum w:abstractNumId="4" w15:restartNumberingAfterBreak="0">
+  <w:abstractNum w:abstractNumId="5" w15:restartNumberingAfterBreak="0">
     <w:nsid w:val="534E0C3E"/>
     <w:multiLevelType w:val="hybridMultilevel"/>
     <w:tmpl w:val="9988950E"/>
@@ -1544,7 +2151,7 @@
       </w:pPr>
     </w:lvl>
   </w:abstractNum>
-  <w:abstractNum w:abstractNumId="5" w15:restartNumberingAfterBreak="0">
+  <w:abstractNum w:abstractNumId="6" w15:restartNumberingAfterBreak="0">
     <w:nsid w:val="61AB1B8E"/>
     <w:multiLevelType w:val="multilevel"/>
     <w:tmpl w:val="9D56519C"/>
@@ -1657,7 +2264,7 @@
       </w:pPr>
     </w:lvl>
   </w:abstractNum>
-  <w:abstractNum w:abstractNumId="6" w15:restartNumberingAfterBreak="0">
+  <w:abstractNum w:abstractNumId="7" w15:restartNumberingAfterBreak="0">
     <w:nsid w:val="65831052"/>
     <w:multiLevelType w:val="multilevel"/>
     <w:tmpl w:val="B6C8B59E"/>
@@ -1770,7 +2377,7 @@
       </w:pPr>
     </w:lvl>
   </w:abstractNum>
-  <w:abstractNum w:abstractNumId="7" w15:restartNumberingAfterBreak="0">
+  <w:abstractNum w:abstractNumId="8" w15:restartNumberingAfterBreak="0">
     <w:nsid w:val="791D2633"/>
     <w:multiLevelType w:val="multilevel"/>
     <w:tmpl w:val="7C9E5C94"/>
@@ -1884,13 +2491,13 @@
     </w:lvl>
   </w:abstractNum>
   <w:num w:numId="1" w16cid:durableId="322781313">
-    <w:abstractNumId w:val="5"/>
+    <w:abstractNumId w:val="6"/>
   </w:num>
   <w:num w:numId="2" w16cid:durableId="1932002546">
-    <w:abstractNumId w:val="3"/>
+    <w:abstractNumId w:val="4"/>
   </w:num>
   <w:num w:numId="3" w16cid:durableId="1980184016">
-    <w:abstractNumId w:val="7"/>
+    <w:abstractNumId w:val="8"/>
   </w:num>
   <w:num w:numId="4" w16cid:durableId="621499727">
     <w:abstractNumId w:val="2"/>
@@ -1899,13 +2506,16 @@
     <w:abstractNumId w:val="1"/>
   </w:num>
   <w:num w:numId="6" w16cid:durableId="137381822">
-    <w:abstractNumId w:val="6"/>
+    <w:abstractNumId w:val="7"/>
   </w:num>
   <w:num w:numId="7" w16cid:durableId="1560676578">
     <w:abstractNumId w:val="0"/>
   </w:num>
   <w:num w:numId="8" w16cid:durableId="1920946206">
-    <w:abstractNumId w:val="4"/>
+    <w:abstractNumId w:val="5"/>
+  </w:num>
+  <w:num w:numId="9" w16cid:durableId="495341639">
+    <w:abstractNumId w:val="3"/>
   </w:num>
 </w:numbering>
 </file>

</xml_diff>

<commit_message>
Updated User Manual to include all the sections of each user story
</commit_message>
<xml_diff>
--- a/User manual/User-manual.docx
+++ b/User manual/User-manual.docx
@@ -103,6 +103,94 @@
     </w:p>
     <w:p>
       <w:pPr>
+        <w:ind w:left="720"/>
+        <w:rPr>
+          <w:lang w:val="en-IN"/>
+        </w:rPr>
+      </w:pPr>
+      <w:r>
+        <w:rPr>
+          <w:lang w:val="en-IN"/>
+        </w:rPr>
+        <w:drawing>
+          <wp:inline distT="0" distB="0" distL="0" distR="0" wp14:anchorId="065E9158" wp14:editId="0451AEAC">
+            <wp:extent cx="5731510" cy="2341245"/>
+            <wp:effectExtent l="0" t="0" r="2540" b="1905"/>
+            <wp:docPr id="1597181567" name="Picture 1" descr="A screenshot of a computer&#10;&#10;AI-generated content may be incorrect."/>
+            <wp:cNvGraphicFramePr>
+              <a:graphicFrameLocks xmlns:a="http://schemas.openxmlformats.org/drawingml/2006/main" noChangeAspect="1"/>
+            </wp:cNvGraphicFramePr>
+            <a:graphic xmlns:a="http://schemas.openxmlformats.org/drawingml/2006/main">
+              <a:graphicData uri="http://schemas.openxmlformats.org/drawingml/2006/picture">
+                <pic:pic xmlns:pic="http://schemas.openxmlformats.org/drawingml/2006/picture">
+                  <pic:nvPicPr>
+                    <pic:cNvPr id="1597181567" name="Picture 1" descr="A screenshot of a computer&#10;&#10;AI-generated content may be incorrect."/>
+                    <pic:cNvPicPr/>
+                  </pic:nvPicPr>
+                  <pic:blipFill>
+                    <a:blip r:embed="rId5"/>
+                    <a:stretch>
+                      <a:fillRect/>
+                    </a:stretch>
+                  </pic:blipFill>
+                  <pic:spPr>
+                    <a:xfrm>
+                      <a:off x="0" y="0"/>
+                      <a:ext cx="5731510" cy="2341245"/>
+                    </a:xfrm>
+                    <a:prstGeom prst="rect">
+                      <a:avLst/>
+                    </a:prstGeom>
+                  </pic:spPr>
+                </pic:pic>
+              </a:graphicData>
+            </a:graphic>
+          </wp:inline>
+        </w:drawing>
+      </w:r>
+      <w:r>
+        <w:rPr>
+          <w:lang w:val="en-IN"/>
+        </w:rPr>
+        <w:drawing>
+          <wp:inline distT="0" distB="0" distL="0" distR="0" wp14:anchorId="52441CE9" wp14:editId="136CF5DC">
+            <wp:extent cx="5731510" cy="2286000"/>
+            <wp:effectExtent l="0" t="0" r="2540" b="0"/>
+            <wp:docPr id="1282547045" name="Picture 1" descr="A screenshot of a login box&#10;&#10;AI-generated content may be incorrect."/>
+            <wp:cNvGraphicFramePr>
+              <a:graphicFrameLocks xmlns:a="http://schemas.openxmlformats.org/drawingml/2006/main" noChangeAspect="1"/>
+            </wp:cNvGraphicFramePr>
+            <a:graphic xmlns:a="http://schemas.openxmlformats.org/drawingml/2006/main">
+              <a:graphicData uri="http://schemas.openxmlformats.org/drawingml/2006/picture">
+                <pic:pic xmlns:pic="http://schemas.openxmlformats.org/drawingml/2006/picture">
+                  <pic:nvPicPr>
+                    <pic:cNvPr id="1282547045" name="Picture 1" descr="A screenshot of a login box&#10;&#10;AI-generated content may be incorrect."/>
+                    <pic:cNvPicPr/>
+                  </pic:nvPicPr>
+                  <pic:blipFill>
+                    <a:blip r:embed="rId6"/>
+                    <a:stretch>
+                      <a:fillRect/>
+                    </a:stretch>
+                  </pic:blipFill>
+                  <pic:spPr>
+                    <a:xfrm>
+                      <a:off x="0" y="0"/>
+                      <a:ext cx="5731510" cy="2286000"/>
+                    </a:xfrm>
+                    <a:prstGeom prst="rect">
+                      <a:avLst/>
+                    </a:prstGeom>
+                  </pic:spPr>
+                </pic:pic>
+              </a:graphicData>
+            </a:graphic>
+          </wp:inline>
+        </w:drawing>
+      </w:r>
+    </w:p>
+    <w:p>
+      <w:pPr>
         <w:numPr>
           <w:ilvl w:val="0"/>
           <w:numId w:val="1"/>
@@ -117,6 +205,12 @@
         </w:rPr>
         <w:t>Enter your email and password.</w:t>
       </w:r>
+      <w:r>
+        <w:rPr>
+          <w:lang w:val="en-IN"/>
+        </w:rPr>
+        <w:t xml:space="preserve"> </w:t>
+      </w:r>
     </w:p>
     <w:p>
       <w:pPr>
@@ -154,6 +248,63 @@
     </w:p>
     <w:p>
       <w:pPr>
+        <w:ind w:left="720"/>
+        <w:rPr>
+          <w:lang w:val="en-IN"/>
+        </w:rPr>
+      </w:pPr>
+      <w:r>
+        <w:rPr>
+          <w:lang w:val="en-IN"/>
+        </w:rPr>
+        <w:lastRenderedPageBreak/>
+        <w:drawing>
+          <wp:inline distT="0" distB="0" distL="0" distR="0" wp14:anchorId="167EF7FA" wp14:editId="62D157EB">
+            <wp:extent cx="5731510" cy="2314575"/>
+            <wp:effectExtent l="0" t="0" r="2540" b="9525"/>
+            <wp:docPr id="1275517939" name="Picture 1" descr="A screenshot of a computer&#10;&#10;AI-generated content may be incorrect."/>
+            <wp:cNvGraphicFramePr>
+              <a:graphicFrameLocks xmlns:a="http://schemas.openxmlformats.org/drawingml/2006/main" noChangeAspect="1"/>
+            </wp:cNvGraphicFramePr>
+            <a:graphic xmlns:a="http://schemas.openxmlformats.org/drawingml/2006/main">
+              <a:graphicData uri="http://schemas.openxmlformats.org/drawingml/2006/picture">
+                <pic:pic xmlns:pic="http://schemas.openxmlformats.org/drawingml/2006/picture">
+                  <pic:nvPicPr>
+                    <pic:cNvPr id="1275517939" name="Picture 1" descr="A screenshot of a computer&#10;&#10;AI-generated content may be incorrect."/>
+                    <pic:cNvPicPr/>
+                  </pic:nvPicPr>
+                  <pic:blipFill>
+                    <a:blip r:embed="rId7"/>
+                    <a:stretch>
+                      <a:fillRect/>
+                    </a:stretch>
+                  </pic:blipFill>
+                  <pic:spPr>
+                    <a:xfrm>
+                      <a:off x="0" y="0"/>
+                      <a:ext cx="5731510" cy="2314575"/>
+                    </a:xfrm>
+                    <a:prstGeom prst="rect">
+                      <a:avLst/>
+                    </a:prstGeom>
+                  </pic:spPr>
+                </pic:pic>
+              </a:graphicData>
+            </a:graphic>
+          </wp:inline>
+        </w:drawing>
+      </w:r>
+    </w:p>
+    <w:p>
+      <w:pPr>
+        <w:ind w:left="720"/>
+        <w:rPr>
+          <w:lang w:val="en-IN"/>
+        </w:rPr>
+      </w:pPr>
+    </w:p>
+    <w:p>
+      <w:pPr>
         <w:rPr>
           <w:lang w:val="en-IN"/>
         </w:rPr>
@@ -238,6 +389,54 @@
     </w:p>
     <w:p>
       <w:pPr>
+        <w:ind w:left="720"/>
+        <w:rPr>
+          <w:lang w:val="en-IN"/>
+        </w:rPr>
+      </w:pPr>
+      <w:r>
+        <w:rPr>
+          <w:lang w:val="en-IN"/>
+        </w:rPr>
+        <w:drawing>
+          <wp:inline distT="0" distB="0" distL="0" distR="0" wp14:anchorId="70ABC4FF" wp14:editId="2B623464">
+            <wp:extent cx="5731510" cy="2314575"/>
+            <wp:effectExtent l="0" t="0" r="2540" b="9525"/>
+            <wp:docPr id="1140762668" name="Picture 1" descr="A screenshot of a computer&#10;&#10;AI-generated content may be incorrect."/>
+            <wp:cNvGraphicFramePr>
+              <a:graphicFrameLocks xmlns:a="http://schemas.openxmlformats.org/drawingml/2006/main" noChangeAspect="1"/>
+            </wp:cNvGraphicFramePr>
+            <a:graphic xmlns:a="http://schemas.openxmlformats.org/drawingml/2006/main">
+              <a:graphicData uri="http://schemas.openxmlformats.org/drawingml/2006/picture">
+                <pic:pic xmlns:pic="http://schemas.openxmlformats.org/drawingml/2006/picture">
+                  <pic:nvPicPr>
+                    <pic:cNvPr id="1140762668" name="Picture 1" descr="A screenshot of a computer&#10;&#10;AI-generated content may be incorrect."/>
+                    <pic:cNvPicPr/>
+                  </pic:nvPicPr>
+                  <pic:blipFill>
+                    <a:blip r:embed="rId7"/>
+                    <a:stretch>
+                      <a:fillRect/>
+                    </a:stretch>
+                  </pic:blipFill>
+                  <pic:spPr>
+                    <a:xfrm>
+                      <a:off x="0" y="0"/>
+                      <a:ext cx="5731510" cy="2314575"/>
+                    </a:xfrm>
+                    <a:prstGeom prst="rect">
+                      <a:avLst/>
+                    </a:prstGeom>
+                  </pic:spPr>
+                </pic:pic>
+              </a:graphicData>
+            </a:graphic>
+          </wp:inline>
+        </w:drawing>
+      </w:r>
+    </w:p>
+    <w:p>
+      <w:pPr>
         <w:numPr>
           <w:ilvl w:val="0"/>
           <w:numId w:val="2"/>
@@ -269,6 +468,14 @@
         </w:rPr>
         <w:t>Click on any item for more details.</w:t>
       </w:r>
+    </w:p>
+    <w:p>
+      <w:pPr>
+        <w:ind w:left="360"/>
+        <w:rPr>
+          <w:lang w:val="en-IN"/>
+        </w:rPr>
+      </w:pPr>
     </w:p>
     <w:p>
       <w:pPr>
@@ -369,6 +576,7 @@
           <w:noProof/>
           <w:lang w:val="en-IN"/>
         </w:rPr>
+        <w:lastRenderedPageBreak/>
         <w:drawing>
           <wp:inline distT="0" distB="0" distL="0" distR="0" wp14:anchorId="6DC83D4D" wp14:editId="657D315C">
             <wp:extent cx="5731510" cy="2366645"/>
@@ -385,7 +593,7 @@
                     <pic:cNvPicPr/>
                   </pic:nvPicPr>
                   <pic:blipFill>
-                    <a:blip r:embed="rId5"/>
+                    <a:blip r:embed="rId8"/>
                     <a:stretch>
                       <a:fillRect/>
                     </a:stretch>
@@ -436,7 +644,6 @@
           <w:noProof/>
           <w:lang w:val="en-IN"/>
         </w:rPr>
-        <w:lastRenderedPageBreak/>
         <w:drawing>
           <wp:inline distT="0" distB="0" distL="0" distR="0" wp14:anchorId="5A26C0FA" wp14:editId="6710AC32">
             <wp:extent cx="5731510" cy="2490470"/>
@@ -453,7 +660,7 @@
                     <pic:cNvPicPr/>
                   </pic:nvPicPr>
                   <pic:blipFill>
-                    <a:blip r:embed="rId6"/>
+                    <a:blip r:embed="rId9"/>
                     <a:stretch>
                       <a:fillRect/>
                     </a:stretch>
@@ -527,6 +734,8 @@
     <w:p>
       <w:pPr>
         <w:rPr>
+          <w:b/>
+          <w:bCs/>
           <w:lang w:val="en-IN"/>
         </w:rPr>
       </w:pPr>
@@ -561,9 +770,10 @@
     </w:p>
     <w:p>
       <w:pPr>
+        <w:pStyle w:val="ListParagraph"/>
         <w:numPr>
           <w:ilvl w:val="0"/>
-          <w:numId w:val="4"/>
+          <w:numId w:val="12"/>
         </w:numPr>
         <w:rPr>
           <w:lang w:val="en-IN"/>
@@ -573,14 +783,56 @@
         <w:rPr>
           <w:lang w:val="en-IN"/>
         </w:rPr>
-        <w:t>Go to the ‘Grade Tracker’ section.</w:t>
-      </w:r>
-    </w:p>
-    <w:p>
-      <w:pPr>
+        <w:lastRenderedPageBreak/>
+        <w:t>User enters course name and weight</w:t>
+      </w:r>
+      <w:r>
+        <w:rPr>
+          <w:lang w:val="en-IN"/>
+        </w:rPr>
+        <w:drawing>
+          <wp:inline distT="0" distB="0" distL="0" distR="0" wp14:anchorId="4F44B47E" wp14:editId="4D0EFADE">
+            <wp:extent cx="5731510" cy="2455545"/>
+            <wp:effectExtent l="0" t="0" r="2540" b="1905"/>
+            <wp:docPr id="926389155" name="Picture 1" descr="A screenshot of a computer&#10;&#10;AI-generated content may be incorrect."/>
+            <wp:cNvGraphicFramePr>
+              <a:graphicFrameLocks xmlns:a="http://schemas.openxmlformats.org/drawingml/2006/main" noChangeAspect="1"/>
+            </wp:cNvGraphicFramePr>
+            <a:graphic xmlns:a="http://schemas.openxmlformats.org/drawingml/2006/main">
+              <a:graphicData uri="http://schemas.openxmlformats.org/drawingml/2006/picture">
+                <pic:pic xmlns:pic="http://schemas.openxmlformats.org/drawingml/2006/picture">
+                  <pic:nvPicPr>
+                    <pic:cNvPr id="926389155" name="Picture 1" descr="A screenshot of a computer&#10;&#10;AI-generated content may be incorrect."/>
+                    <pic:cNvPicPr/>
+                  </pic:nvPicPr>
+                  <pic:blipFill>
+                    <a:blip r:embed="rId10"/>
+                    <a:stretch>
+                      <a:fillRect/>
+                    </a:stretch>
+                  </pic:blipFill>
+                  <pic:spPr>
+                    <a:xfrm>
+                      <a:off x="0" y="0"/>
+                      <a:ext cx="5731510" cy="2455545"/>
+                    </a:xfrm>
+                    <a:prstGeom prst="rect">
+                      <a:avLst/>
+                    </a:prstGeom>
+                  </pic:spPr>
+                </pic:pic>
+              </a:graphicData>
+            </a:graphic>
+          </wp:inline>
+        </w:drawing>
+      </w:r>
+    </w:p>
+    <w:p>
+      <w:pPr>
+        <w:pStyle w:val="ListParagraph"/>
         <w:numPr>
           <w:ilvl w:val="0"/>
-          <w:numId w:val="4"/>
+          <w:numId w:val="12"/>
         </w:numPr>
         <w:rPr>
           <w:lang w:val="en-IN"/>
@@ -590,14 +842,68 @@
         <w:rPr>
           <w:lang w:val="en-IN"/>
         </w:rPr>
-        <w:t>View grades for assignments, quizzes, and exams.</w:t>
-      </w:r>
-    </w:p>
-    <w:p>
-      <w:pPr>
+        <w:t>User clicks the add course button to add the course</w:t>
+      </w:r>
+      <w:r>
+        <w:rPr>
+          <w:lang w:val="en-IN"/>
+        </w:rPr>
+        <w:t xml:space="preserve"> to the course manager</w:t>
+      </w:r>
+    </w:p>
+    <w:p>
+      <w:pPr>
+        <w:rPr>
+          <w:lang w:val="en-IN"/>
+        </w:rPr>
+      </w:pPr>
+      <w:r>
+        <w:rPr>
+          <w:lang w:val="en-IN"/>
+        </w:rPr>
+        <w:drawing>
+          <wp:inline distT="0" distB="0" distL="0" distR="0" wp14:anchorId="3703D67C" wp14:editId="5C068411">
+            <wp:extent cx="5731510" cy="2457450"/>
+            <wp:effectExtent l="0" t="0" r="2540" b="0"/>
+            <wp:docPr id="2031259934" name="Picture 1" descr="A screenshot of a course manager&#10;&#10;AI-generated content may be incorrect."/>
+            <wp:cNvGraphicFramePr>
+              <a:graphicFrameLocks xmlns:a="http://schemas.openxmlformats.org/drawingml/2006/main" noChangeAspect="1"/>
+            </wp:cNvGraphicFramePr>
+            <a:graphic xmlns:a="http://schemas.openxmlformats.org/drawingml/2006/main">
+              <a:graphicData uri="http://schemas.openxmlformats.org/drawingml/2006/picture">
+                <pic:pic xmlns:pic="http://schemas.openxmlformats.org/drawingml/2006/picture">
+                  <pic:nvPicPr>
+                    <pic:cNvPr id="2031259934" name="Picture 1" descr="A screenshot of a course manager&#10;&#10;AI-generated content may be incorrect."/>
+                    <pic:cNvPicPr/>
+                  </pic:nvPicPr>
+                  <pic:blipFill>
+                    <a:blip r:embed="rId11"/>
+                    <a:stretch>
+                      <a:fillRect/>
+                    </a:stretch>
+                  </pic:blipFill>
+                  <pic:spPr>
+                    <a:xfrm>
+                      <a:off x="0" y="0"/>
+                      <a:ext cx="5731510" cy="2457450"/>
+                    </a:xfrm>
+                    <a:prstGeom prst="rect">
+                      <a:avLst/>
+                    </a:prstGeom>
+                  </pic:spPr>
+                </pic:pic>
+              </a:graphicData>
+            </a:graphic>
+          </wp:inline>
+        </w:drawing>
+      </w:r>
+    </w:p>
+    <w:p>
+      <w:pPr>
+        <w:pStyle w:val="ListParagraph"/>
         <w:numPr>
           <w:ilvl w:val="0"/>
-          <w:numId w:val="4"/>
+          <w:numId w:val="12"/>
         </w:numPr>
         <w:rPr>
           <w:lang w:val="en-IN"/>
@@ -607,7 +913,60 @@
         <w:rPr>
           <w:lang w:val="en-IN"/>
         </w:rPr>
-        <w:t>Check progress toward course completion.</w:t>
+        <w:t>User clicks on edit course and enters the edit course menu</w:t>
+      </w:r>
+      <w:r>
+        <w:rPr>
+          <w:lang w:val="en-IN"/>
+        </w:rPr>
+        <w:t>`</w:t>
+      </w:r>
+    </w:p>
+    <w:p>
+      <w:pPr>
+        <w:rPr>
+          <w:lang w:val="en-IN"/>
+        </w:rPr>
+      </w:pPr>
+      <w:r>
+        <w:rPr>
+          <w:lang w:val="en-IN"/>
+        </w:rPr>
+        <w:drawing>
+          <wp:inline distT="0" distB="0" distL="0" distR="0" wp14:anchorId="6B5ED26A" wp14:editId="30FE10EE">
+            <wp:extent cx="5731510" cy="2460625"/>
+            <wp:effectExtent l="0" t="0" r="2540" b="0"/>
+            <wp:docPr id="975468142" name="Picture 1" descr="A screen shot of a computer&#10;&#10;AI-generated content may be incorrect."/>
+            <wp:cNvGraphicFramePr>
+              <a:graphicFrameLocks xmlns:a="http://schemas.openxmlformats.org/drawingml/2006/main" noChangeAspect="1"/>
+            </wp:cNvGraphicFramePr>
+            <a:graphic xmlns:a="http://schemas.openxmlformats.org/drawingml/2006/main">
+              <a:graphicData uri="http://schemas.openxmlformats.org/drawingml/2006/picture">
+                <pic:pic xmlns:pic="http://schemas.openxmlformats.org/drawingml/2006/picture">
+                  <pic:nvPicPr>
+                    <pic:cNvPr id="975468142" name="Picture 1" descr="A screen shot of a computer&#10;&#10;AI-generated content may be incorrect."/>
+                    <pic:cNvPicPr/>
+                  </pic:nvPicPr>
+                  <pic:blipFill>
+                    <a:blip r:embed="rId12"/>
+                    <a:stretch>
+                      <a:fillRect/>
+                    </a:stretch>
+                  </pic:blipFill>
+                  <pic:spPr>
+                    <a:xfrm>
+                      <a:off x="0" y="0"/>
+                      <a:ext cx="5731510" cy="2460625"/>
+                    </a:xfrm>
+                    <a:prstGeom prst="rect">
+                      <a:avLst/>
+                    </a:prstGeom>
+                  </pic:spPr>
+                </pic:pic>
+              </a:graphicData>
+            </a:graphic>
+          </wp:inline>
+        </w:drawing>
       </w:r>
     </w:p>
     <w:p>
@@ -654,6 +1013,7 @@
           <w:bCs/>
           <w:lang w:val="en-IN"/>
         </w:rPr>
+        <w:lastRenderedPageBreak/>
         <w:t>Overview:</w:t>
       </w:r>
       <w:r>
@@ -662,14 +1022,12 @@
         </w:rPr>
         <w:t xml:space="preserve"> </w:t>
       </w:r>
-      <w:proofErr w:type="spellStart"/>
-      <w:r>
-        <w:rPr>
-          <w:lang w:val="en-IN"/>
-        </w:rPr>
-        <w:t>Analyze</w:t>
-      </w:r>
-      <w:proofErr w:type="spellEnd"/>
+      <w:r>
+        <w:rPr>
+          <w:lang w:val="en-IN"/>
+        </w:rPr>
+        <w:t>Analyse</w:t>
+      </w:r>
       <w:r>
         <w:rPr>
           <w:lang w:val="en-IN"/>
@@ -722,7 +1080,7 @@
         <w:rPr>
           <w:lang w:val="en-IN"/>
         </w:rPr>
-        <w:t>View completion rates, average scores, and engagement data.</w:t>
+        <w:t>View completed courses, active courses and total study time.</w:t>
       </w:r>
     </w:p>
     <w:p>
@@ -744,6 +1102,54 @@
     </w:p>
     <w:p>
       <w:pPr>
+        <w:ind w:left="720"/>
+        <w:rPr>
+          <w:lang w:val="en-IN"/>
+        </w:rPr>
+      </w:pPr>
+      <w:r>
+        <w:rPr>
+          <w:lang w:val="en-IN"/>
+        </w:rPr>
+        <w:drawing>
+          <wp:inline distT="0" distB="0" distL="0" distR="0" wp14:anchorId="142B3613" wp14:editId="1466D548">
+            <wp:extent cx="5731510" cy="2661285"/>
+            <wp:effectExtent l="0" t="0" r="2540" b="5715"/>
+            <wp:docPr id="1032669050" name="Picture 1" descr="A screenshot of a graph&#10;&#10;AI-generated content may be incorrect."/>
+            <wp:cNvGraphicFramePr>
+              <a:graphicFrameLocks xmlns:a="http://schemas.openxmlformats.org/drawingml/2006/main" noChangeAspect="1"/>
+            </wp:cNvGraphicFramePr>
+            <a:graphic xmlns:a="http://schemas.openxmlformats.org/drawingml/2006/main">
+              <a:graphicData uri="http://schemas.openxmlformats.org/drawingml/2006/picture">
+                <pic:pic xmlns:pic="http://schemas.openxmlformats.org/drawingml/2006/picture">
+                  <pic:nvPicPr>
+                    <pic:cNvPr id="1032669050" name="Picture 1" descr="A screenshot of a graph&#10;&#10;AI-generated content may be incorrect."/>
+                    <pic:cNvPicPr/>
+                  </pic:nvPicPr>
+                  <pic:blipFill>
+                    <a:blip r:embed="rId13"/>
+                    <a:stretch>
+                      <a:fillRect/>
+                    </a:stretch>
+                  </pic:blipFill>
+                  <pic:spPr>
+                    <a:xfrm>
+                      <a:off x="0" y="0"/>
+                      <a:ext cx="5731510" cy="2661285"/>
+                    </a:xfrm>
+                    <a:prstGeom prst="rect">
+                      <a:avLst/>
+                    </a:prstGeom>
+                  </pic:spPr>
+                </pic:pic>
+              </a:graphicData>
+            </a:graphic>
+          </wp:inline>
+        </w:drawing>
+      </w:r>
+    </w:p>
+    <w:p>
+      <w:pPr>
         <w:rPr>
           <w:lang w:val="en-IN"/>
         </w:rPr>
@@ -806,7 +1212,7 @@
     <w:p>
       <w:r>
         <w:pict w14:anchorId="195ADB02">
-          <v:rect id="_x0000_i1033" style="width:0;height:0" o:hralign="center" o:hrstd="t" o:hrnoshade="t" o:hr="t" fillcolor="#d1d5db" stroked="f"/>
+          <v:rect id="_x0000_i1031" style="width:0;height:0" o:hralign="center" o:hrstd="t" o:hrnoshade="t" o:hr="t" fillcolor="#d1d5db" stroked="f"/>
         </w:pict>
       </w:r>
     </w:p>
@@ -822,6 +1228,63 @@
           <w:b/>
           <w:bCs/>
         </w:rPr>
+        <w:lastRenderedPageBreak/>
+        <w:drawing>
+          <wp:inline distT="0" distB="0" distL="0" distR="0" wp14:anchorId="0C086EAB" wp14:editId="46CFCCBE">
+            <wp:extent cx="5731510" cy="8063865"/>
+            <wp:effectExtent l="0" t="0" r="2540" b="0"/>
+            <wp:docPr id="891773799" name="Picture 1" descr="A screenshot of a computer&#10;&#10;AI-generated content may be incorrect."/>
+            <wp:cNvGraphicFramePr>
+              <a:graphicFrameLocks xmlns:a="http://schemas.openxmlformats.org/drawingml/2006/main" noChangeAspect="1"/>
+            </wp:cNvGraphicFramePr>
+            <a:graphic xmlns:a="http://schemas.openxmlformats.org/drawingml/2006/main">
+              <a:graphicData uri="http://schemas.openxmlformats.org/drawingml/2006/picture">
+                <pic:pic xmlns:pic="http://schemas.openxmlformats.org/drawingml/2006/picture">
+                  <pic:nvPicPr>
+                    <pic:cNvPr id="891773799" name="Picture 1" descr="A screenshot of a computer&#10;&#10;AI-generated content may be incorrect."/>
+                    <pic:cNvPicPr/>
+                  </pic:nvPicPr>
+                  <pic:blipFill>
+                    <a:blip r:embed="rId14"/>
+                    <a:stretch>
+                      <a:fillRect/>
+                    </a:stretch>
+                  </pic:blipFill>
+                  <pic:spPr>
+                    <a:xfrm>
+                      <a:off x="0" y="0"/>
+                      <a:ext cx="5731510" cy="8063865"/>
+                    </a:xfrm>
+                    <a:prstGeom prst="rect">
+                      <a:avLst/>
+                    </a:prstGeom>
+                  </pic:spPr>
+                </pic:pic>
+              </a:graphicData>
+            </a:graphic>
+          </wp:inline>
+        </w:drawing>
+      </w:r>
+      <w:r>
+        <w:rPr>
+          <w:b/>
+          <w:bCs/>
+        </w:rPr>
+        <w:t>`</w:t>
+      </w:r>
+    </w:p>
+    <w:p>
+      <w:pPr>
+        <w:rPr>
+          <w:b/>
+          <w:bCs/>
+        </w:rPr>
+      </w:pPr>
+      <w:r>
+        <w:rPr>
+          <w:b/>
+          <w:bCs/>
+        </w:rPr>
         <w:t>Key Features</w:t>
       </w:r>
     </w:p>
@@ -834,7 +1297,6 @@
           <w:b/>
           <w:bCs/>
         </w:rPr>
-        <w:lastRenderedPageBreak/>
         <w:t xml:space="preserve">Dynamic Leaderboard Display </w:t>
       </w:r>
       <w:r>
@@ -849,6 +1311,7 @@
         </w:numPr>
       </w:pPr>
       <w:r>
+        <w:lastRenderedPageBreak/>
         <w:t>Displays students' rankings, usernames, and XP scores in a table.</w:t>
       </w:r>
     </w:p>
@@ -979,50 +1442,233 @@
         </w:rPr>
       </w:pPr>
       <w:r>
-        <w:t xml:space="preserve">Alternating row </w:t>
+        <w:t>Alternating row colours for better readability.</w:t>
+      </w:r>
+      <w:r>
+        <w:rPr>
+          <w:b/>
+          <w:bCs/>
+        </w:rPr>
+        <w:t xml:space="preserve"> </w:t>
+      </w:r>
+    </w:p>
+    <w:p>
+      <w:pPr>
+        <w:ind w:left="1440"/>
+      </w:pPr>
+    </w:p>
+    <w:p>
+      <w:pPr>
+        <w:ind w:left="1440"/>
+      </w:pPr>
+    </w:p>
+    <w:p>
+      <w:r>
+        <w:t>The application has three main sections:</w:t>
+      </w:r>
+    </w:p>
+    <w:p>
+      <w:pPr>
+        <w:rPr>
+          <w:b/>
+          <w:bCs/>
+        </w:rPr>
+      </w:pPr>
+      <w:r>
+        <w:rPr>
+          <w:b/>
+          <w:bCs/>
+        </w:rPr>
+        <w:t>Header Panel</w:t>
+      </w:r>
+    </w:p>
+    <w:p>
+      <w:pPr>
+        <w:tabs>
+          <w:tab w:val="num" w:pos="1440"/>
+        </w:tabs>
+      </w:pPr>
+      <w:r>
+        <w:t xml:space="preserve">Displays the title: </w:t>
+      </w:r>
+      <w:r>
+        <w:rPr>
+          <w:b/>
+          <w:bCs/>
+        </w:rPr>
+        <w:t xml:space="preserve">"Student XP Leaderboard" </w:t>
+      </w:r>
+      <w:r>
+        <w:t>.</w:t>
+      </w:r>
+    </w:p>
+    <w:p>
+      <w:pPr>
+        <w:tabs>
+          <w:tab w:val="num" w:pos="1440"/>
+        </w:tabs>
+      </w:pPr>
+      <w:r>
+        <w:t>Provides a clean and professional look with a blue background.</w:t>
+      </w:r>
+    </w:p>
+    <w:p>
+      <w:pPr>
+        <w:rPr>
+          <w:b/>
+          <w:bCs/>
+        </w:rPr>
+      </w:pPr>
+      <w:r>
+        <w:rPr>
+          <w:b/>
+          <w:bCs/>
+        </w:rPr>
+        <w:t>Table</w:t>
+      </w:r>
+    </w:p>
+    <w:p>
+      <w:pPr>
+        <w:tabs>
+          <w:tab w:val="num" w:pos="1440"/>
+        </w:tabs>
+      </w:pPr>
+      <w:r>
+        <w:t>Shows the leaderboard with the following columns:</w:t>
+      </w:r>
+    </w:p>
+    <w:p>
+      <w:r>
+        <w:rPr>
+          <w:b/>
+          <w:bCs/>
+        </w:rPr>
+        <w:t xml:space="preserve">Rank </w:t>
+      </w:r>
+      <w:r>
+        <w:t>: The student's position based on XP.</w:t>
+      </w:r>
+    </w:p>
+    <w:p>
+      <w:r>
+        <w:rPr>
+          <w:b/>
+          <w:bCs/>
+        </w:rPr>
+        <w:t xml:space="preserve">Username </w:t>
+      </w:r>
+      <w:r>
+        <w:t>: The name of the student.</w:t>
+      </w:r>
+    </w:p>
+    <w:p>
+      <w:r>
+        <w:rPr>
+          <w:b/>
+          <w:bCs/>
+        </w:rPr>
+        <w:t xml:space="preserve">XP </w:t>
+      </w:r>
+      <w:r>
+        <w:t>: The student's experience points.</w:t>
+      </w:r>
+    </w:p>
+    <w:p>
+      <w:pPr>
+        <w:tabs>
+          <w:tab w:val="num" w:pos="1440"/>
+        </w:tabs>
+      </w:pPr>
+      <w:r>
+        <w:t xml:space="preserve">Rows are styled with alternating </w:t>
       </w:r>
       <w:r>
         <w:t>colours</w:t>
       </w:r>
       <w:r>
-        <w:t xml:space="preserve"> for better readability.</w:t>
-      </w:r>
-      <w:r>
-        <w:rPr>
-          <w:b/>
-          <w:bCs/>
-        </w:rPr>
-        <w:t xml:space="preserve"> </w:t>
+        <w:t xml:space="preserve"> (light blue and white) for readability.</w:t>
       </w:r>
     </w:p>
     <w:p>
       <w:pPr>
         <w:ind w:left="1440"/>
-      </w:pPr>
+        <w:rPr>
+          <w:b/>
+          <w:bCs/>
+        </w:rPr>
+      </w:pPr>
+      <w:r>
+        <w:rPr>
+          <w:b/>
+          <w:bCs/>
+        </w:rPr>
+        <w:t>Buttons</w:t>
+      </w:r>
+    </w:p>
+    <w:p>
+      <w:pPr>
+        <w:tabs>
+          <w:tab w:val="num" w:pos="1440"/>
+        </w:tabs>
+        <w:ind w:left="1080"/>
+      </w:pPr>
+      <w:r>
+        <w:t>Located at the bottom of the window:</w:t>
+      </w:r>
     </w:p>
     <w:p>
       <w:pPr>
         <w:ind w:left="1440"/>
       </w:pPr>
-    </w:p>
-    <w:p>
-      <w:r>
-        <w:t>The application has three main sections:</w:t>
-      </w:r>
-    </w:p>
-    <w:p>
-      <w:pPr>
-        <w:rPr>
-          <w:b/>
-          <w:bCs/>
-        </w:rPr>
-      </w:pPr>
-      <w:r>
-        <w:rPr>
-          <w:b/>
-          <w:bCs/>
-        </w:rPr>
-        <w:t>Header Panel</w:t>
+      <w:r>
+        <w:rPr>
+          <w:b/>
+          <w:bCs/>
+        </w:rPr>
+        <w:t xml:space="preserve">Previous </w:t>
+      </w:r>
+      <w:r>
+        <w:t>: Navigate to the previous page of students.</w:t>
+      </w:r>
+    </w:p>
+    <w:p>
+      <w:pPr>
+        <w:ind w:left="1440"/>
+      </w:pPr>
+      <w:r>
+        <w:rPr>
+          <w:b/>
+          <w:bCs/>
+        </w:rPr>
+        <w:t xml:space="preserve">Next </w:t>
+      </w:r>
+      <w:r>
+        <w:t>: Navigate to the next page of students.</w:t>
+      </w:r>
+    </w:p>
+    <w:p>
+      <w:pPr>
+        <w:ind w:left="1440"/>
+      </w:pPr>
+      <w:r>
+        <w:rPr>
+          <w:b/>
+          <w:bCs/>
+        </w:rPr>
+        <w:t xml:space="preserve">Refresh </w:t>
+      </w:r>
+      <w:r>
+        <w:t>: Reload the data from the database to reflect any changes.</w:t>
+      </w:r>
+    </w:p>
+    <w:p>
+      <w:pPr>
+        <w:ind w:left="1440"/>
+      </w:pPr>
+      <w:r>
+        <w:pict w14:anchorId="4D90AC20">
+          <v:rect id="_x0000_i1032" style="width:0;height:0" o:hralign="center" o:hrstd="t" o:hr="t" fillcolor="#a0a0a0" stroked="f"/>
+        </w:pict>
       </w:r>
     </w:p>
     <w:p>
@@ -1030,19 +1676,26 @@
         <w:tabs>
           <w:tab w:val="num" w:pos="1440"/>
         </w:tabs>
-      </w:pPr>
-      <w:r>
-        <w:t xml:space="preserve">Displays the title: </w:t>
-      </w:r>
-      <w:r>
-        <w:rPr>
-          <w:b/>
-          <w:bCs/>
-        </w:rPr>
-        <w:t xml:space="preserve">"Student XP Leaderboard" </w:t>
-      </w:r>
-      <w:r>
-        <w:t>.</w:t>
+        <w:ind w:left="1440"/>
+      </w:pPr>
+      <w:r>
+        <w:rPr>
+          <w:b/>
+          <w:bCs/>
+        </w:rPr>
+        <w:t xml:space="preserve">View Student Details </w:t>
+      </w:r>
+      <w:r>
+        <w:t>:</w:t>
+      </w:r>
+    </w:p>
+    <w:p>
+      <w:pPr>
+        <w:ind w:left="1440"/>
+      </w:pPr>
+      <w:r>
+        <w:lastRenderedPageBreak/>
+        <w:t>Click on any row in the table to see a popup with the selected student's username and XP.</w:t>
       </w:r>
     </w:p>
     <w:p>
@@ -1050,24 +1703,45 @@
         <w:tabs>
           <w:tab w:val="num" w:pos="1440"/>
         </w:tabs>
-      </w:pPr>
-      <w:r>
-        <w:t>Provides a clean and professional look with a blue background.</w:t>
-      </w:r>
-    </w:p>
-    <w:p>
-      <w:pPr>
-        <w:rPr>
-          <w:b/>
-          <w:bCs/>
-        </w:rPr>
-      </w:pPr>
-      <w:r>
-        <w:rPr>
-          <w:b/>
-          <w:bCs/>
-        </w:rPr>
-        <w:t>Table</w:t>
+        <w:ind w:left="1440"/>
+      </w:pPr>
+      <w:r>
+        <w:rPr>
+          <w:b/>
+          <w:bCs/>
+        </w:rPr>
+        <w:t xml:space="preserve">Navigate Pages </w:t>
+      </w:r>
+      <w:r>
+        <w:t>:</w:t>
+      </w:r>
+    </w:p>
+    <w:p>
+      <w:pPr>
+        <w:ind w:left="1440"/>
+      </w:pPr>
+      <w:r>
+        <w:t xml:space="preserve">Use the </w:t>
+      </w:r>
+      <w:r>
+        <w:rPr>
+          <w:b/>
+          <w:bCs/>
+        </w:rPr>
+        <w:t xml:space="preserve">Previous </w:t>
+      </w:r>
+      <w:r>
+        <w:t xml:space="preserve">and </w:t>
+      </w:r>
+      <w:r>
+        <w:rPr>
+          <w:b/>
+          <w:bCs/>
+        </w:rPr>
+        <w:t xml:space="preserve">Next </w:t>
+      </w:r>
+      <w:r>
+        <w:t>buttons to move between pages if there are more than 10 students.</w:t>
       </w:r>
     </w:p>
     <w:p>
@@ -1075,88 +1749,17 @@
         <w:tabs>
           <w:tab w:val="num" w:pos="1440"/>
         </w:tabs>
-      </w:pPr>
-      <w:r>
-        <w:t>Shows the leaderboard with the following columns:</w:t>
-      </w:r>
-    </w:p>
-    <w:p>
-      <w:r>
-        <w:rPr>
-          <w:b/>
-          <w:bCs/>
-        </w:rPr>
-        <w:t xml:space="preserve">Rank </w:t>
-      </w:r>
-      <w:r>
-        <w:t>: The student's position based on XP.</w:t>
-      </w:r>
-    </w:p>
-    <w:p>
-      <w:r>
-        <w:rPr>
-          <w:b/>
-          <w:bCs/>
-        </w:rPr>
-        <w:t xml:space="preserve">Username </w:t>
-      </w:r>
-      <w:r>
-        <w:t>: The name of the student.</w:t>
-      </w:r>
-    </w:p>
-    <w:p>
-      <w:r>
-        <w:rPr>
-          <w:b/>
-          <w:bCs/>
-        </w:rPr>
-        <w:t xml:space="preserve">XP </w:t>
-      </w:r>
-      <w:r>
-        <w:t>: The student's experience points.</w:t>
-      </w:r>
-    </w:p>
-    <w:p>
-      <w:pPr>
-        <w:tabs>
-          <w:tab w:val="num" w:pos="1440"/>
-        </w:tabs>
-      </w:pPr>
-      <w:r>
-        <w:t xml:space="preserve">Rows are styled with alternating </w:t>
-      </w:r>
-      <w:r>
-        <w:t>colours</w:t>
-      </w:r>
-      <w:r>
-        <w:t xml:space="preserve"> (light blue and white) for readability.</w:t>
-      </w:r>
-    </w:p>
-    <w:p>
-      <w:pPr>
         <w:ind w:left="1440"/>
-        <w:rPr>
-          <w:b/>
-          <w:bCs/>
-        </w:rPr>
-      </w:pPr>
-      <w:r>
-        <w:rPr>
-          <w:b/>
-          <w:bCs/>
-        </w:rPr>
-        <w:t>Buttons</w:t>
-      </w:r>
-    </w:p>
-    <w:p>
-      <w:pPr>
-        <w:tabs>
-          <w:tab w:val="num" w:pos="1440"/>
-        </w:tabs>
-        <w:ind w:left="1080"/>
-      </w:pPr>
-      <w:r>
-        <w:t>Located at the bottom of the window:</w:t>
+      </w:pPr>
+      <w:r>
+        <w:rPr>
+          <w:b/>
+          <w:bCs/>
+        </w:rPr>
+        <w:t xml:space="preserve">Refresh Data </w:t>
+      </w:r>
+      <w:r>
+        <w:t>:</w:t>
       </w:r>
     </w:p>
     <w:p>
@@ -1164,194 +1767,53 @@
         <w:ind w:left="1440"/>
       </w:pPr>
       <w:r>
-        <w:rPr>
-          <w:b/>
-          <w:bCs/>
-        </w:rPr>
-        <w:t xml:space="preserve">Previous </w:t>
-      </w:r>
-      <w:r>
-        <w:t>: Navigate to the previous page of students.</w:t>
+        <w:t xml:space="preserve">If new students are added to the database or XP values are updated, click the </w:t>
+      </w:r>
+      <w:r>
+        <w:rPr>
+          <w:b/>
+          <w:bCs/>
+        </w:rPr>
+        <w:t xml:space="preserve">Refresh </w:t>
+      </w:r>
+      <w:r>
+        <w:t>button to reload the latest data.</w:t>
       </w:r>
     </w:p>
     <w:p>
       <w:pPr>
         <w:ind w:left="1440"/>
       </w:pPr>
-      <w:r>
-        <w:rPr>
-          <w:b/>
-          <w:bCs/>
-        </w:rPr>
-        <w:t xml:space="preserve">Next </w:t>
-      </w:r>
-      <w:r>
-        <w:t>: Navigate to the next page of students.</w:t>
-      </w:r>
     </w:p>
     <w:p>
       <w:pPr>
         <w:ind w:left="1440"/>
       </w:pPr>
-      <w:r>
-        <w:rPr>
-          <w:b/>
-          <w:bCs/>
-        </w:rPr>
-        <w:t xml:space="preserve">Refresh </w:t>
-      </w:r>
-      <w:r>
-        <w:t>: Reload the data from the database to reflect any changes.</w:t>
-      </w:r>
-    </w:p>
-    <w:p>
-      <w:pPr>
-        <w:ind w:left="1440"/>
-      </w:pPr>
-      <w:r>
-        <w:pict w14:anchorId="4D90AC20">
-          <v:rect id="_x0000_i1034" style="width:0;height:0" o:hralign="center" o:hrstd="t" o:hr="t" fillcolor="#a0a0a0" stroked="f"/>
+    </w:p>
+    <w:p>
+      <w:pPr>
+        <w:rPr>
+          <w:lang w:val="en-IN"/>
+        </w:rPr>
+      </w:pPr>
+    </w:p>
+    <w:p>
+      <w:pPr>
+        <w:rPr>
+          <w:lang w:val="en-IN"/>
+        </w:rPr>
+      </w:pPr>
+      <w:r>
+        <w:rPr>
+          <w:lang w:val="en-IN"/>
+        </w:rPr>
+        <w:pict w14:anchorId="1CEF40DD">
+          <v:rect id="_x0000_i1033" style="width:0;height:1.5pt" o:hralign="center" o:hrstd="t" o:hr="t" fillcolor="#a0a0a0" stroked="f"/>
         </w:pict>
       </w:r>
     </w:p>
     <w:p>
       <w:pPr>
-        <w:tabs>
-          <w:tab w:val="num" w:pos="1440"/>
-        </w:tabs>
-        <w:ind w:left="1440"/>
-      </w:pPr>
-      <w:r>
-        <w:rPr>
-          <w:b/>
-          <w:bCs/>
-        </w:rPr>
-        <w:lastRenderedPageBreak/>
-        <w:t xml:space="preserve">View Student Details </w:t>
-      </w:r>
-      <w:r>
-        <w:t>:</w:t>
-      </w:r>
-    </w:p>
-    <w:p>
-      <w:pPr>
-        <w:ind w:left="1440"/>
-      </w:pPr>
-      <w:r>
-        <w:t>Click on any row in the table to see a popup with the selected student's username and XP.</w:t>
-      </w:r>
-    </w:p>
-    <w:p>
-      <w:pPr>
-        <w:tabs>
-          <w:tab w:val="num" w:pos="1440"/>
-        </w:tabs>
-        <w:ind w:left="1440"/>
-      </w:pPr>
-      <w:r>
-        <w:rPr>
-          <w:b/>
-          <w:bCs/>
-        </w:rPr>
-        <w:t xml:space="preserve">Navigate Pages </w:t>
-      </w:r>
-      <w:r>
-        <w:t>:</w:t>
-      </w:r>
-    </w:p>
-    <w:p>
-      <w:pPr>
-        <w:ind w:left="1440"/>
-      </w:pPr>
-      <w:r>
-        <w:t xml:space="preserve">Use the </w:t>
-      </w:r>
-      <w:r>
-        <w:rPr>
-          <w:b/>
-          <w:bCs/>
-        </w:rPr>
-        <w:t xml:space="preserve">Previous </w:t>
-      </w:r>
-      <w:r>
-        <w:t xml:space="preserve">and </w:t>
-      </w:r>
-      <w:r>
-        <w:rPr>
-          <w:b/>
-          <w:bCs/>
-        </w:rPr>
-        <w:t xml:space="preserve">Next </w:t>
-      </w:r>
-      <w:r>
-        <w:t>buttons to move between pages if there are more than 10 students.</w:t>
-      </w:r>
-    </w:p>
-    <w:p>
-      <w:pPr>
-        <w:tabs>
-          <w:tab w:val="num" w:pos="1440"/>
-        </w:tabs>
-        <w:ind w:left="1440"/>
-      </w:pPr>
-      <w:r>
-        <w:rPr>
-          <w:b/>
-          <w:bCs/>
-        </w:rPr>
-        <w:t xml:space="preserve">Refresh Data </w:t>
-      </w:r>
-      <w:r>
-        <w:t>:</w:t>
-      </w:r>
-    </w:p>
-    <w:p>
-      <w:pPr>
-        <w:ind w:left="1440"/>
-      </w:pPr>
-      <w:r>
-        <w:t xml:space="preserve">If new students are added to the database or XP values are updated, click the </w:t>
-      </w:r>
-      <w:r>
-        <w:rPr>
-          <w:b/>
-          <w:bCs/>
-        </w:rPr>
-        <w:t xml:space="preserve">Refresh </w:t>
-      </w:r>
-      <w:r>
-        <w:t>button to reload the latest data.</w:t>
-      </w:r>
-    </w:p>
-    <w:p>
-      <w:pPr>
-        <w:ind w:left="1440"/>
-      </w:pPr>
-    </w:p>
-    <w:p>
-      <w:pPr>
-        <w:rPr>
-          <w:lang w:val="en-IN"/>
-        </w:rPr>
-      </w:pPr>
-    </w:p>
-    <w:p>
-      <w:pPr>
-        <w:rPr>
-          <w:lang w:val="en-IN"/>
-        </w:rPr>
-      </w:pPr>
-      <w:r>
-        <w:rPr>
-          <w:lang w:val="en-IN"/>
-        </w:rPr>
-        <w:pict w14:anchorId="1CEF40DD">
-          <v:rect id="_x0000_i1031" style="width:0;height:1.5pt" o:hralign="center" o:hrstd="t" o:hr="t" fillcolor="#a0a0a0" stroked="f"/>
-        </w:pict>
-      </w:r>
-    </w:p>
-    <w:p>
-      <w:pPr>
         <w:rPr>
           <w:b/>
           <w:bCs/>
@@ -1370,6 +1832,8 @@
     <w:p>
       <w:pPr>
         <w:rPr>
+          <w:b/>
+          <w:bCs/>
           <w:lang w:val="en-IN"/>
         </w:rPr>
       </w:pPr>
@@ -1404,9 +1868,10 @@
     </w:p>
     <w:p>
       <w:pPr>
+        <w:pStyle w:val="ListParagraph"/>
         <w:numPr>
           <w:ilvl w:val="0"/>
-          <w:numId w:val="7"/>
+          <w:numId w:val="11"/>
         </w:numPr>
         <w:rPr>
           <w:lang w:val="en-IN"/>
@@ -1416,14 +1881,63 @@
         <w:rPr>
           <w:lang w:val="en-IN"/>
         </w:rPr>
-        <w:t>Complete all required lessons and assessments in a course.</w:t>
-      </w:r>
-    </w:p>
-    <w:p>
-      <w:pPr>
+        <w:t>User enters the course ID they have completed</w:t>
+      </w:r>
+    </w:p>
+    <w:p>
+      <w:pPr>
+        <w:pStyle w:val="ListParagraph"/>
+        <w:rPr>
+          <w:lang w:val="en-IN"/>
+        </w:rPr>
+      </w:pPr>
+      <w:r>
+        <w:rPr>
+          <w:lang w:val="en-IN"/>
+        </w:rPr>
+        <w:drawing>
+          <wp:inline distT="0" distB="0" distL="0" distR="0" wp14:anchorId="385345AC" wp14:editId="71C381DF">
+            <wp:extent cx="5731510" cy="2665095"/>
+            <wp:effectExtent l="0" t="0" r="2540" b="1905"/>
+            <wp:docPr id="499364169" name="Picture 1" descr="A screenshot of a computer&#10;&#10;AI-generated content may be incorrect."/>
+            <wp:cNvGraphicFramePr>
+              <a:graphicFrameLocks xmlns:a="http://schemas.openxmlformats.org/drawingml/2006/main" noChangeAspect="1"/>
+            </wp:cNvGraphicFramePr>
+            <a:graphic xmlns:a="http://schemas.openxmlformats.org/drawingml/2006/main">
+              <a:graphicData uri="http://schemas.openxmlformats.org/drawingml/2006/picture">
+                <pic:pic xmlns:pic="http://schemas.openxmlformats.org/drawingml/2006/picture">
+                  <pic:nvPicPr>
+                    <pic:cNvPr id="499364169" name="Picture 1" descr="A screenshot of a computer&#10;&#10;AI-generated content may be incorrect."/>
+                    <pic:cNvPicPr/>
+                  </pic:nvPicPr>
+                  <pic:blipFill>
+                    <a:blip r:embed="rId15"/>
+                    <a:stretch>
+                      <a:fillRect/>
+                    </a:stretch>
+                  </pic:blipFill>
+                  <pic:spPr>
+                    <a:xfrm>
+                      <a:off x="0" y="0"/>
+                      <a:ext cx="5731510" cy="2665095"/>
+                    </a:xfrm>
+                    <a:prstGeom prst="rect">
+                      <a:avLst/>
+                    </a:prstGeom>
+                  </pic:spPr>
+                </pic:pic>
+              </a:graphicData>
+            </a:graphic>
+          </wp:inline>
+        </w:drawing>
+      </w:r>
+    </w:p>
+    <w:p>
+      <w:pPr>
+        <w:pStyle w:val="ListParagraph"/>
         <w:numPr>
           <w:ilvl w:val="0"/>
-          <w:numId w:val="7"/>
+          <w:numId w:val="11"/>
         </w:numPr>
         <w:rPr>
           <w:lang w:val="en-IN"/>
@@ -1433,14 +1947,64 @@
         <w:rPr>
           <w:lang w:val="en-IN"/>
         </w:rPr>
-        <w:t>The system will verify completion.</w:t>
-      </w:r>
-    </w:p>
-    <w:p>
-      <w:pPr>
+        <w:t>User clicks on complete course</w:t>
+      </w:r>
+    </w:p>
+    <w:p>
+      <w:pPr>
+        <w:pStyle w:val="ListParagraph"/>
+        <w:rPr>
+          <w:lang w:val="en-IN"/>
+        </w:rPr>
+      </w:pPr>
+      <w:r>
+        <w:rPr>
+          <w:lang w:val="en-IN"/>
+        </w:rPr>
+        <w:lastRenderedPageBreak/>
+        <w:drawing>
+          <wp:inline distT="0" distB="0" distL="0" distR="0" wp14:anchorId="21350F84" wp14:editId="171380EC">
+            <wp:extent cx="5731510" cy="2644140"/>
+            <wp:effectExtent l="0" t="0" r="2540" b="3810"/>
+            <wp:docPr id="1703606555" name="Picture 1" descr="A screenshot of a computer&#10;&#10;AI-generated content may be incorrect."/>
+            <wp:cNvGraphicFramePr>
+              <a:graphicFrameLocks xmlns:a="http://schemas.openxmlformats.org/drawingml/2006/main" noChangeAspect="1"/>
+            </wp:cNvGraphicFramePr>
+            <a:graphic xmlns:a="http://schemas.openxmlformats.org/drawingml/2006/main">
+              <a:graphicData uri="http://schemas.openxmlformats.org/drawingml/2006/picture">
+                <pic:pic xmlns:pic="http://schemas.openxmlformats.org/drawingml/2006/picture">
+                  <pic:nvPicPr>
+                    <pic:cNvPr id="1703606555" name="Picture 1" descr="A screenshot of a computer&#10;&#10;AI-generated content may be incorrect."/>
+                    <pic:cNvPicPr/>
+                  </pic:nvPicPr>
+                  <pic:blipFill>
+                    <a:blip r:embed="rId16"/>
+                    <a:stretch>
+                      <a:fillRect/>
+                    </a:stretch>
+                  </pic:blipFill>
+                  <pic:spPr>
+                    <a:xfrm>
+                      <a:off x="0" y="0"/>
+                      <a:ext cx="5731510" cy="2644140"/>
+                    </a:xfrm>
+                    <a:prstGeom prst="rect">
+                      <a:avLst/>
+                    </a:prstGeom>
+                  </pic:spPr>
+                </pic:pic>
+              </a:graphicData>
+            </a:graphic>
+          </wp:inline>
+        </w:drawing>
+      </w:r>
+    </w:p>
+    <w:p>
+      <w:pPr>
+        <w:pStyle w:val="ListParagraph"/>
         <w:numPr>
           <w:ilvl w:val="0"/>
-          <w:numId w:val="7"/>
+          <w:numId w:val="11"/>
         </w:numPr>
         <w:rPr>
           <w:lang w:val="en-IN"/>
@@ -1450,8 +2014,335 @@
         <w:rPr>
           <w:lang w:val="en-IN"/>
         </w:rPr>
-        <w:t>A badge is automatically awarded and displayed on your profile.</w:t>
-      </w:r>
+        <w:t>Course is marked as completed</w:t>
+      </w:r>
+    </w:p>
+    <w:p>
+      <w:pPr>
+        <w:pStyle w:val="ListParagraph"/>
+        <w:rPr>
+          <w:lang w:val="en-IN"/>
+        </w:rPr>
+      </w:pPr>
+      <w:r>
+        <w:rPr>
+          <w:lang w:val="en-IN"/>
+        </w:rPr>
+        <w:drawing>
+          <wp:inline distT="0" distB="0" distL="0" distR="0" wp14:anchorId="34B204F4" wp14:editId="66131466">
+            <wp:extent cx="5731510" cy="2644140"/>
+            <wp:effectExtent l="0" t="0" r="2540" b="3810"/>
+            <wp:docPr id="1894425435" name="Picture 1" descr="A screenshot of a computer&#10;&#10;AI-generated content may be incorrect."/>
+            <wp:cNvGraphicFramePr>
+              <a:graphicFrameLocks xmlns:a="http://schemas.openxmlformats.org/drawingml/2006/main" noChangeAspect="1"/>
+            </wp:cNvGraphicFramePr>
+            <a:graphic xmlns:a="http://schemas.openxmlformats.org/drawingml/2006/main">
+              <a:graphicData uri="http://schemas.openxmlformats.org/drawingml/2006/picture">
+                <pic:pic xmlns:pic="http://schemas.openxmlformats.org/drawingml/2006/picture">
+                  <pic:nvPicPr>
+                    <pic:cNvPr id="1894425435" name="Picture 1" descr="A screenshot of a computer&#10;&#10;AI-generated content may be incorrect."/>
+                    <pic:cNvPicPr/>
+                  </pic:nvPicPr>
+                  <pic:blipFill>
+                    <a:blip r:embed="rId17"/>
+                    <a:stretch>
+                      <a:fillRect/>
+                    </a:stretch>
+                  </pic:blipFill>
+                  <pic:spPr>
+                    <a:xfrm>
+                      <a:off x="0" y="0"/>
+                      <a:ext cx="5731510" cy="2644140"/>
+                    </a:xfrm>
+                    <a:prstGeom prst="rect">
+                      <a:avLst/>
+                    </a:prstGeom>
+                  </pic:spPr>
+                </pic:pic>
+              </a:graphicData>
+            </a:graphic>
+          </wp:inline>
+        </w:drawing>
+      </w:r>
+    </w:p>
+    <w:p>
+      <w:pPr>
+        <w:pStyle w:val="ListParagraph"/>
+        <w:numPr>
+          <w:ilvl w:val="0"/>
+          <w:numId w:val="11"/>
+        </w:numPr>
+        <w:rPr>
+          <w:lang w:val="en-IN"/>
+        </w:rPr>
+      </w:pPr>
+      <w:r>
+        <w:rPr>
+          <w:lang w:val="en-IN"/>
+        </w:rPr>
+        <w:t xml:space="preserve">After 5 </w:t>
+      </w:r>
+      <w:r>
+        <w:rPr>
+          <w:lang w:val="en-IN"/>
+        </w:rPr>
+        <w:t>courses</w:t>
+      </w:r>
+      <w:r>
+        <w:rPr>
+          <w:lang w:val="en-IN"/>
+        </w:rPr>
+        <w:t xml:space="preserve"> have been marked as completed, the bronze badge will be awarded</w:t>
+      </w:r>
+    </w:p>
+    <w:p>
+      <w:pPr>
+        <w:pStyle w:val="ListParagraph"/>
+        <w:rPr>
+          <w:lang w:val="en-IN"/>
+        </w:rPr>
+      </w:pPr>
+      <w:r>
+        <w:rPr>
+          <w:lang w:val="en-IN"/>
+        </w:rPr>
+        <w:drawing>
+          <wp:inline distT="0" distB="0" distL="0" distR="0" wp14:anchorId="1BB348A5" wp14:editId="00B21643">
+            <wp:extent cx="5731510" cy="2660650"/>
+            <wp:effectExtent l="0" t="0" r="2540" b="6350"/>
+            <wp:docPr id="645820143" name="Picture 1" descr="A screenshot of a computer&#10;&#10;AI-generated content may be incorrect."/>
+            <wp:cNvGraphicFramePr>
+              <a:graphicFrameLocks xmlns:a="http://schemas.openxmlformats.org/drawingml/2006/main" noChangeAspect="1"/>
+            </wp:cNvGraphicFramePr>
+            <a:graphic xmlns:a="http://schemas.openxmlformats.org/drawingml/2006/main">
+              <a:graphicData uri="http://schemas.openxmlformats.org/drawingml/2006/picture">
+                <pic:pic xmlns:pic="http://schemas.openxmlformats.org/drawingml/2006/picture">
+                  <pic:nvPicPr>
+                    <pic:cNvPr id="645820143" name="Picture 1" descr="A screenshot of a computer&#10;&#10;AI-generated content may be incorrect."/>
+                    <pic:cNvPicPr/>
+                  </pic:nvPicPr>
+                  <pic:blipFill>
+                    <a:blip r:embed="rId18"/>
+                    <a:stretch>
+                      <a:fillRect/>
+                    </a:stretch>
+                  </pic:blipFill>
+                  <pic:spPr>
+                    <a:xfrm>
+                      <a:off x="0" y="0"/>
+                      <a:ext cx="5731510" cy="2660650"/>
+                    </a:xfrm>
+                    <a:prstGeom prst="rect">
+                      <a:avLst/>
+                    </a:prstGeom>
+                  </pic:spPr>
+                </pic:pic>
+              </a:graphicData>
+            </a:graphic>
+          </wp:inline>
+        </w:drawing>
+      </w:r>
+    </w:p>
+    <w:p>
+      <w:pPr>
+        <w:pStyle w:val="ListParagraph"/>
+        <w:numPr>
+          <w:ilvl w:val="0"/>
+          <w:numId w:val="11"/>
+        </w:numPr>
+        <w:rPr>
+          <w:lang w:val="en-IN"/>
+        </w:rPr>
+      </w:pPr>
+      <w:r>
+        <w:rPr>
+          <w:lang w:val="en-IN"/>
+        </w:rPr>
+        <w:t xml:space="preserve">After </w:t>
+      </w:r>
+      <w:r>
+        <w:rPr>
+          <w:lang w:val="en-IN"/>
+        </w:rPr>
+        <w:t>10</w:t>
+      </w:r>
+      <w:r>
+        <w:rPr>
+          <w:lang w:val="en-IN"/>
+        </w:rPr>
+        <w:t xml:space="preserve"> </w:t>
+      </w:r>
+      <w:r>
+        <w:rPr>
+          <w:lang w:val="en-IN"/>
+        </w:rPr>
+        <w:t>courses</w:t>
+      </w:r>
+      <w:r>
+        <w:rPr>
+          <w:lang w:val="en-IN"/>
+        </w:rPr>
+        <w:t xml:space="preserve"> have been marked as completed, the </w:t>
+      </w:r>
+      <w:r>
+        <w:rPr>
+          <w:lang w:val="en-IN"/>
+        </w:rPr>
+        <w:t>silver</w:t>
+      </w:r>
+      <w:r>
+        <w:rPr>
+          <w:lang w:val="en-IN"/>
+        </w:rPr>
+        <w:t xml:space="preserve"> badge will be awarded</w:t>
+      </w:r>
+    </w:p>
+    <w:p>
+      <w:pPr>
+        <w:pStyle w:val="ListParagraph"/>
+        <w:rPr>
+          <w:lang w:val="en-IN"/>
+        </w:rPr>
+      </w:pPr>
+      <w:r>
+        <w:rPr>
+          <w:lang w:val="en-IN"/>
+        </w:rPr>
+        <w:lastRenderedPageBreak/>
+        <w:drawing>
+          <wp:inline distT="0" distB="0" distL="0" distR="0" wp14:anchorId="1AB4A735" wp14:editId="125E2603">
+            <wp:extent cx="5731510" cy="2675890"/>
+            <wp:effectExtent l="0" t="0" r="2540" b="0"/>
+            <wp:docPr id="1456588118" name="Picture 1" descr="A screenshot of a computer&#10;&#10;AI-generated content may be incorrect."/>
+            <wp:cNvGraphicFramePr>
+              <a:graphicFrameLocks xmlns:a="http://schemas.openxmlformats.org/drawingml/2006/main" noChangeAspect="1"/>
+            </wp:cNvGraphicFramePr>
+            <a:graphic xmlns:a="http://schemas.openxmlformats.org/drawingml/2006/main">
+              <a:graphicData uri="http://schemas.openxmlformats.org/drawingml/2006/picture">
+                <pic:pic xmlns:pic="http://schemas.openxmlformats.org/drawingml/2006/picture">
+                  <pic:nvPicPr>
+                    <pic:cNvPr id="1456588118" name="Picture 1" descr="A screenshot of a computer&#10;&#10;AI-generated content may be incorrect."/>
+                    <pic:cNvPicPr/>
+                  </pic:nvPicPr>
+                  <pic:blipFill>
+                    <a:blip r:embed="rId19"/>
+                    <a:stretch>
+                      <a:fillRect/>
+                    </a:stretch>
+                  </pic:blipFill>
+                  <pic:spPr>
+                    <a:xfrm>
+                      <a:off x="0" y="0"/>
+                      <a:ext cx="5731510" cy="2675890"/>
+                    </a:xfrm>
+                    <a:prstGeom prst="rect">
+                      <a:avLst/>
+                    </a:prstGeom>
+                  </pic:spPr>
+                </pic:pic>
+              </a:graphicData>
+            </a:graphic>
+          </wp:inline>
+        </w:drawing>
+      </w:r>
+    </w:p>
+    <w:p>
+      <w:pPr>
+        <w:pStyle w:val="ListParagraph"/>
+        <w:numPr>
+          <w:ilvl w:val="0"/>
+          <w:numId w:val="11"/>
+        </w:numPr>
+        <w:rPr>
+          <w:lang w:val="en-IN"/>
+        </w:rPr>
+      </w:pPr>
+      <w:r>
+        <w:rPr>
+          <w:lang w:val="en-IN"/>
+        </w:rPr>
+        <w:t xml:space="preserve">After </w:t>
+      </w:r>
+      <w:r>
+        <w:rPr>
+          <w:lang w:val="en-IN"/>
+        </w:rPr>
+        <w:t>20</w:t>
+      </w:r>
+      <w:r>
+        <w:rPr>
+          <w:lang w:val="en-IN"/>
+        </w:rPr>
+        <w:t xml:space="preserve"> courses have been marked as completed, the </w:t>
+      </w:r>
+      <w:r>
+        <w:rPr>
+          <w:lang w:val="en-IN"/>
+        </w:rPr>
+        <w:t>gold</w:t>
+      </w:r>
+      <w:r>
+        <w:rPr>
+          <w:lang w:val="en-IN"/>
+        </w:rPr>
+        <w:t xml:space="preserve"> badge will be awarded</w:t>
+      </w:r>
+    </w:p>
+    <w:p>
+      <w:pPr>
+        <w:pStyle w:val="ListParagraph"/>
+        <w:rPr>
+          <w:lang w:val="en-IN"/>
+        </w:rPr>
+      </w:pPr>
+      <w:r>
+        <w:rPr>
+          <w:lang w:val="en-IN"/>
+        </w:rPr>
+        <w:drawing>
+          <wp:inline distT="0" distB="0" distL="0" distR="0" wp14:anchorId="1EDC4340" wp14:editId="5E199B5E">
+            <wp:extent cx="5731510" cy="2616835"/>
+            <wp:effectExtent l="0" t="0" r="2540" b="0"/>
+            <wp:docPr id="338356328" name="Picture 1" descr="A screenshot of a computer&#10;&#10;AI-generated content may be incorrect."/>
+            <wp:cNvGraphicFramePr>
+              <a:graphicFrameLocks xmlns:a="http://schemas.openxmlformats.org/drawingml/2006/main" noChangeAspect="1"/>
+            </wp:cNvGraphicFramePr>
+            <a:graphic xmlns:a="http://schemas.openxmlformats.org/drawingml/2006/main">
+              <a:graphicData uri="http://schemas.openxmlformats.org/drawingml/2006/picture">
+                <pic:pic xmlns:pic="http://schemas.openxmlformats.org/drawingml/2006/picture">
+                  <pic:nvPicPr>
+                    <pic:cNvPr id="338356328" name="Picture 1" descr="A screenshot of a computer&#10;&#10;AI-generated content may be incorrect."/>
+                    <pic:cNvPicPr/>
+                  </pic:nvPicPr>
+                  <pic:blipFill>
+                    <a:blip r:embed="rId20"/>
+                    <a:stretch>
+                      <a:fillRect/>
+                    </a:stretch>
+                  </pic:blipFill>
+                  <pic:spPr>
+                    <a:xfrm>
+                      <a:off x="0" y="0"/>
+                      <a:ext cx="5731510" cy="2616835"/>
+                    </a:xfrm>
+                    <a:prstGeom prst="rect">
+                      <a:avLst/>
+                    </a:prstGeom>
+                  </pic:spPr>
+                </pic:pic>
+              </a:graphicData>
+            </a:graphic>
+          </wp:inline>
+        </w:drawing>
+      </w:r>
+    </w:p>
+    <w:p>
+      <w:pPr>
+        <w:pStyle w:val="ListParagraph"/>
+        <w:rPr>
+          <w:lang w:val="en-IN"/>
+        </w:rPr>
+      </w:pPr>
     </w:p>
     <w:p>
       <w:pPr>
@@ -1464,7 +2355,7 @@
           <w:lang w:val="en-IN"/>
         </w:rPr>
         <w:pict w14:anchorId="21981596">
-          <v:rect id="_x0000_i1032" style="width:0;height:1.5pt" o:hralign="center" o:hrstd="t" o:hr="t" fillcolor="#a0a0a0" stroked="f"/>
+          <v:rect id="_x0000_i1034" style="width:0;height:1.5pt" o:hralign="center" o:hrstd="t" o:hr="t" fillcolor="#a0a0a0" stroked="f"/>
         </w:pict>
       </w:r>
     </w:p>
@@ -1953,6 +2844,184 @@
     </w:lvl>
   </w:abstractNum>
   <w:abstractNum w:abstractNumId="4" w15:restartNumberingAfterBreak="0">
+    <w:nsid w:val="4BEB4509"/>
+    <w:multiLevelType w:val="hybridMultilevel"/>
+    <w:tmpl w:val="5ABEBBA0"/>
+    <w:lvl w:ilvl="0" w:tplc="5F5EF14A">
+      <w:start w:val="1"/>
+      <w:numFmt w:val="decimal"/>
+      <w:lvlText w:val="%1."/>
+      <w:lvlJc w:val="left"/>
+      <w:pPr>
+        <w:ind w:left="1080" w:hanging="360"/>
+      </w:pPr>
+      <w:rPr>
+        <w:rFonts w:hint="default"/>
+      </w:rPr>
+    </w:lvl>
+    <w:lvl w:ilvl="1" w:tplc="08090019" w:tentative="1">
+      <w:start w:val="1"/>
+      <w:numFmt w:val="lowerLetter"/>
+      <w:lvlText w:val="%2."/>
+      <w:lvlJc w:val="left"/>
+      <w:pPr>
+        <w:ind w:left="1800" w:hanging="360"/>
+      </w:pPr>
+    </w:lvl>
+    <w:lvl w:ilvl="2" w:tplc="0809001B" w:tentative="1">
+      <w:start w:val="1"/>
+      <w:numFmt w:val="lowerRoman"/>
+      <w:lvlText w:val="%3."/>
+      <w:lvlJc w:val="right"/>
+      <w:pPr>
+        <w:ind w:left="2520" w:hanging="180"/>
+      </w:pPr>
+    </w:lvl>
+    <w:lvl w:ilvl="3" w:tplc="0809000F" w:tentative="1">
+      <w:start w:val="1"/>
+      <w:numFmt w:val="decimal"/>
+      <w:lvlText w:val="%4."/>
+      <w:lvlJc w:val="left"/>
+      <w:pPr>
+        <w:ind w:left="3240" w:hanging="360"/>
+      </w:pPr>
+    </w:lvl>
+    <w:lvl w:ilvl="4" w:tplc="08090019" w:tentative="1">
+      <w:start w:val="1"/>
+      <w:numFmt w:val="lowerLetter"/>
+      <w:lvlText w:val="%5."/>
+      <w:lvlJc w:val="left"/>
+      <w:pPr>
+        <w:ind w:left="3960" w:hanging="360"/>
+      </w:pPr>
+    </w:lvl>
+    <w:lvl w:ilvl="5" w:tplc="0809001B" w:tentative="1">
+      <w:start w:val="1"/>
+      <w:numFmt w:val="lowerRoman"/>
+      <w:lvlText w:val="%6."/>
+      <w:lvlJc w:val="right"/>
+      <w:pPr>
+        <w:ind w:left="4680" w:hanging="180"/>
+      </w:pPr>
+    </w:lvl>
+    <w:lvl w:ilvl="6" w:tplc="0809000F" w:tentative="1">
+      <w:start w:val="1"/>
+      <w:numFmt w:val="decimal"/>
+      <w:lvlText w:val="%7."/>
+      <w:lvlJc w:val="left"/>
+      <w:pPr>
+        <w:ind w:left="5400" w:hanging="360"/>
+      </w:pPr>
+    </w:lvl>
+    <w:lvl w:ilvl="7" w:tplc="08090019" w:tentative="1">
+      <w:start w:val="1"/>
+      <w:numFmt w:val="lowerLetter"/>
+      <w:lvlText w:val="%8."/>
+      <w:lvlJc w:val="left"/>
+      <w:pPr>
+        <w:ind w:left="6120" w:hanging="360"/>
+      </w:pPr>
+    </w:lvl>
+    <w:lvl w:ilvl="8" w:tplc="0809001B" w:tentative="1">
+      <w:start w:val="1"/>
+      <w:numFmt w:val="lowerRoman"/>
+      <w:lvlText w:val="%9."/>
+      <w:lvlJc w:val="right"/>
+      <w:pPr>
+        <w:ind w:left="6840" w:hanging="180"/>
+      </w:pPr>
+    </w:lvl>
+  </w:abstractNum>
+  <w:abstractNum w:abstractNumId="5" w15:restartNumberingAfterBreak="0">
+    <w:nsid w:val="4DAA422B"/>
+    <w:multiLevelType w:val="hybridMultilevel"/>
+    <w:tmpl w:val="F33AA234"/>
+    <w:lvl w:ilvl="0" w:tplc="0809000F">
+      <w:start w:val="1"/>
+      <w:numFmt w:val="decimal"/>
+      <w:lvlText w:val="%1."/>
+      <w:lvlJc w:val="left"/>
+      <w:pPr>
+        <w:ind w:left="720" w:hanging="360"/>
+      </w:pPr>
+      <w:rPr>
+        <w:rFonts w:hint="default"/>
+      </w:rPr>
+    </w:lvl>
+    <w:lvl w:ilvl="1" w:tplc="08090019" w:tentative="1">
+      <w:start w:val="1"/>
+      <w:numFmt w:val="lowerLetter"/>
+      <w:lvlText w:val="%2."/>
+      <w:lvlJc w:val="left"/>
+      <w:pPr>
+        <w:ind w:left="1440" w:hanging="360"/>
+      </w:pPr>
+    </w:lvl>
+    <w:lvl w:ilvl="2" w:tplc="0809001B" w:tentative="1">
+      <w:start w:val="1"/>
+      <w:numFmt w:val="lowerRoman"/>
+      <w:lvlText w:val="%3."/>
+      <w:lvlJc w:val="right"/>
+      <w:pPr>
+        <w:ind w:left="2160" w:hanging="180"/>
+      </w:pPr>
+    </w:lvl>
+    <w:lvl w:ilvl="3" w:tplc="0809000F" w:tentative="1">
+      <w:start w:val="1"/>
+      <w:numFmt w:val="decimal"/>
+      <w:lvlText w:val="%4."/>
+      <w:lvlJc w:val="left"/>
+      <w:pPr>
+        <w:ind w:left="2880" w:hanging="360"/>
+      </w:pPr>
+    </w:lvl>
+    <w:lvl w:ilvl="4" w:tplc="08090019" w:tentative="1">
+      <w:start w:val="1"/>
+      <w:numFmt w:val="lowerLetter"/>
+      <w:lvlText w:val="%5."/>
+      <w:lvlJc w:val="left"/>
+      <w:pPr>
+        <w:ind w:left="3600" w:hanging="360"/>
+      </w:pPr>
+    </w:lvl>
+    <w:lvl w:ilvl="5" w:tplc="0809001B" w:tentative="1">
+      <w:start w:val="1"/>
+      <w:numFmt w:val="lowerRoman"/>
+      <w:lvlText w:val="%6."/>
+      <w:lvlJc w:val="right"/>
+      <w:pPr>
+        <w:ind w:left="4320" w:hanging="180"/>
+      </w:pPr>
+    </w:lvl>
+    <w:lvl w:ilvl="6" w:tplc="0809000F" w:tentative="1">
+      <w:start w:val="1"/>
+      <w:numFmt w:val="decimal"/>
+      <w:lvlText w:val="%7."/>
+      <w:lvlJc w:val="left"/>
+      <w:pPr>
+        <w:ind w:left="5040" w:hanging="360"/>
+      </w:pPr>
+    </w:lvl>
+    <w:lvl w:ilvl="7" w:tplc="08090019" w:tentative="1">
+      <w:start w:val="1"/>
+      <w:numFmt w:val="lowerLetter"/>
+      <w:lvlText w:val="%8."/>
+      <w:lvlJc w:val="left"/>
+      <w:pPr>
+        <w:ind w:left="5760" w:hanging="360"/>
+      </w:pPr>
+    </w:lvl>
+    <w:lvl w:ilvl="8" w:tplc="0809001B" w:tentative="1">
+      <w:start w:val="1"/>
+      <w:numFmt w:val="lowerRoman"/>
+      <w:lvlText w:val="%9."/>
+      <w:lvlJc w:val="right"/>
+      <w:pPr>
+        <w:ind w:left="6480" w:hanging="180"/>
+      </w:pPr>
+    </w:lvl>
+  </w:abstractNum>
+  <w:abstractNum w:abstractNumId="6" w15:restartNumberingAfterBreak="0">
     <w:nsid w:val="4EEE51E6"/>
     <w:multiLevelType w:val="multilevel"/>
     <w:tmpl w:val="39C0F4FA"/>
@@ -2065,10 +3134,10 @@
       </w:pPr>
     </w:lvl>
   </w:abstractNum>
-  <w:abstractNum w:abstractNumId="5" w15:restartNumberingAfterBreak="0">
+  <w:abstractNum w:abstractNumId="7" w15:restartNumberingAfterBreak="0">
     <w:nsid w:val="534E0C3E"/>
     <w:multiLevelType w:val="hybridMultilevel"/>
-    <w:tmpl w:val="9988950E"/>
+    <w:tmpl w:val="F1EEC7E0"/>
     <w:lvl w:ilvl="0" w:tplc="0809000F">
       <w:start w:val="1"/>
       <w:numFmt w:val="decimal"/>
@@ -2151,7 +3220,7 @@
       </w:pPr>
     </w:lvl>
   </w:abstractNum>
-  <w:abstractNum w:abstractNumId="6" w15:restartNumberingAfterBreak="0">
+  <w:abstractNum w:abstractNumId="8" w15:restartNumberingAfterBreak="0">
     <w:nsid w:val="61AB1B8E"/>
     <w:multiLevelType w:val="multilevel"/>
     <w:tmpl w:val="9D56519C"/>
@@ -2264,7 +3333,7 @@
       </w:pPr>
     </w:lvl>
   </w:abstractNum>
-  <w:abstractNum w:abstractNumId="7" w15:restartNumberingAfterBreak="0">
+  <w:abstractNum w:abstractNumId="9" w15:restartNumberingAfterBreak="0">
     <w:nsid w:val="65831052"/>
     <w:multiLevelType w:val="multilevel"/>
     <w:tmpl w:val="B6C8B59E"/>
@@ -2377,7 +3446,7 @@
       </w:pPr>
     </w:lvl>
   </w:abstractNum>
-  <w:abstractNum w:abstractNumId="8" w15:restartNumberingAfterBreak="0">
+  <w:abstractNum w:abstractNumId="10" w15:restartNumberingAfterBreak="0">
     <w:nsid w:val="791D2633"/>
     <w:multiLevelType w:val="multilevel"/>
     <w:tmpl w:val="7C9E5C94"/>
@@ -2490,14 +3559,103 @@
       </w:pPr>
     </w:lvl>
   </w:abstractNum>
+  <w:abstractNum w:abstractNumId="11" w15:restartNumberingAfterBreak="0">
+    <w:nsid w:val="7B7210C2"/>
+    <w:multiLevelType w:val="hybridMultilevel"/>
+    <w:tmpl w:val="59244B4C"/>
+    <w:lvl w:ilvl="0" w:tplc="0809000F">
+      <w:start w:val="1"/>
+      <w:numFmt w:val="decimal"/>
+      <w:lvlText w:val="%1."/>
+      <w:lvlJc w:val="left"/>
+      <w:pPr>
+        <w:ind w:left="720" w:hanging="360"/>
+      </w:pPr>
+      <w:rPr>
+        <w:rFonts w:hint="default"/>
+      </w:rPr>
+    </w:lvl>
+    <w:lvl w:ilvl="1" w:tplc="08090019" w:tentative="1">
+      <w:start w:val="1"/>
+      <w:numFmt w:val="lowerLetter"/>
+      <w:lvlText w:val="%2."/>
+      <w:lvlJc w:val="left"/>
+      <w:pPr>
+        <w:ind w:left="1440" w:hanging="360"/>
+      </w:pPr>
+    </w:lvl>
+    <w:lvl w:ilvl="2" w:tplc="0809001B" w:tentative="1">
+      <w:start w:val="1"/>
+      <w:numFmt w:val="lowerRoman"/>
+      <w:lvlText w:val="%3."/>
+      <w:lvlJc w:val="right"/>
+      <w:pPr>
+        <w:ind w:left="2160" w:hanging="180"/>
+      </w:pPr>
+    </w:lvl>
+    <w:lvl w:ilvl="3" w:tplc="0809000F" w:tentative="1">
+      <w:start w:val="1"/>
+      <w:numFmt w:val="decimal"/>
+      <w:lvlText w:val="%4."/>
+      <w:lvlJc w:val="left"/>
+      <w:pPr>
+        <w:ind w:left="2880" w:hanging="360"/>
+      </w:pPr>
+    </w:lvl>
+    <w:lvl w:ilvl="4" w:tplc="08090019" w:tentative="1">
+      <w:start w:val="1"/>
+      <w:numFmt w:val="lowerLetter"/>
+      <w:lvlText w:val="%5."/>
+      <w:lvlJc w:val="left"/>
+      <w:pPr>
+        <w:ind w:left="3600" w:hanging="360"/>
+      </w:pPr>
+    </w:lvl>
+    <w:lvl w:ilvl="5" w:tplc="0809001B" w:tentative="1">
+      <w:start w:val="1"/>
+      <w:numFmt w:val="lowerRoman"/>
+      <w:lvlText w:val="%6."/>
+      <w:lvlJc w:val="right"/>
+      <w:pPr>
+        <w:ind w:left="4320" w:hanging="180"/>
+      </w:pPr>
+    </w:lvl>
+    <w:lvl w:ilvl="6" w:tplc="0809000F" w:tentative="1">
+      <w:start w:val="1"/>
+      <w:numFmt w:val="decimal"/>
+      <w:lvlText w:val="%7."/>
+      <w:lvlJc w:val="left"/>
+      <w:pPr>
+        <w:ind w:left="5040" w:hanging="360"/>
+      </w:pPr>
+    </w:lvl>
+    <w:lvl w:ilvl="7" w:tplc="08090019" w:tentative="1">
+      <w:start w:val="1"/>
+      <w:numFmt w:val="lowerLetter"/>
+      <w:lvlText w:val="%8."/>
+      <w:lvlJc w:val="left"/>
+      <w:pPr>
+        <w:ind w:left="5760" w:hanging="360"/>
+      </w:pPr>
+    </w:lvl>
+    <w:lvl w:ilvl="8" w:tplc="0809001B" w:tentative="1">
+      <w:start w:val="1"/>
+      <w:numFmt w:val="lowerRoman"/>
+      <w:lvlText w:val="%9."/>
+      <w:lvlJc w:val="right"/>
+      <w:pPr>
+        <w:ind w:left="6480" w:hanging="180"/>
+      </w:pPr>
+    </w:lvl>
+  </w:abstractNum>
   <w:num w:numId="1" w16cid:durableId="322781313">
+    <w:abstractNumId w:val="8"/>
+  </w:num>
+  <w:num w:numId="2" w16cid:durableId="1932002546">
     <w:abstractNumId w:val="6"/>
   </w:num>
-  <w:num w:numId="2" w16cid:durableId="1932002546">
-    <w:abstractNumId w:val="4"/>
-  </w:num>
   <w:num w:numId="3" w16cid:durableId="1980184016">
-    <w:abstractNumId w:val="8"/>
+    <w:abstractNumId w:val="10"/>
   </w:num>
   <w:num w:numId="4" w16cid:durableId="621499727">
     <w:abstractNumId w:val="2"/>
@@ -2506,16 +3664,25 @@
     <w:abstractNumId w:val="1"/>
   </w:num>
   <w:num w:numId="6" w16cid:durableId="137381822">
-    <w:abstractNumId w:val="7"/>
+    <w:abstractNumId w:val="9"/>
   </w:num>
   <w:num w:numId="7" w16cid:durableId="1560676578">
     <w:abstractNumId w:val="0"/>
   </w:num>
   <w:num w:numId="8" w16cid:durableId="1920946206">
-    <w:abstractNumId w:val="5"/>
+    <w:abstractNumId w:val="7"/>
   </w:num>
   <w:num w:numId="9" w16cid:durableId="495341639">
     <w:abstractNumId w:val="3"/>
+  </w:num>
+  <w:num w:numId="10" w16cid:durableId="1086001390">
+    <w:abstractNumId w:val="4"/>
+  </w:num>
+  <w:num w:numId="11" w16cid:durableId="692538983">
+    <w:abstractNumId w:val="5"/>
+  </w:num>
+  <w:num w:numId="12" w16cid:durableId="1651787774">
+    <w:abstractNumId w:val="11"/>
   </w:num>
 </w:numbering>
 </file>

</xml_diff>

<commit_message>
Added Title page to user manual
</commit_message>
<xml_diff>
--- a/User manual/User-manual.docx
+++ b/User manual/User-manual.docx
@@ -2,50 +2,923 @@
 <file path=word/document.xml><?xml version="1.0" encoding="utf-8"?>
 <w:document xmlns:wpc="http://schemas.microsoft.com/office/word/2010/wordprocessingCanvas" xmlns:cx="http://schemas.microsoft.com/office/drawing/2014/chartex" xmlns:cx1="http://schemas.microsoft.com/office/drawing/2015/9/8/chartex" xmlns:cx2="http://schemas.microsoft.com/office/drawing/2015/10/21/chartex" xmlns:cx3="http://schemas.microsoft.com/office/drawing/2016/5/9/chartex" xmlns:cx4="http://schemas.microsoft.com/office/drawing/2016/5/10/chartex" xmlns:cx5="http://schemas.microsoft.com/office/drawing/2016/5/11/chartex" xmlns:cx6="http://schemas.microsoft.com/office/drawing/2016/5/12/chartex" xmlns:cx7="http://schemas.microsoft.com/office/drawing/2016/5/13/chartex" xmlns:cx8="http://schemas.microsoft.com/office/drawing/2016/5/14/chartex" xmlns:mc="http://schemas.openxmlformats.org/markup-compatibility/2006" xmlns:aink="http://schemas.microsoft.com/office/drawing/2016/ink" xmlns:am3d="http://schemas.microsoft.com/office/drawing/2017/model3d" xmlns:o="urn:schemas-microsoft-com:office:office" xmlns:oel="http://schemas.microsoft.com/office/2019/extlst" xmlns:r="http://schemas.openxmlformats.org/officeDocument/2006/relationships" xmlns:m="http://schemas.openxmlformats.org/officeDocument/2006/math" xmlns:v="urn:schemas-microsoft-com:vml" xmlns:wp14="http://schemas.microsoft.com/office/word/2010/wordprocessingDrawing" xmlns:wp="http://schemas.openxmlformats.org/drawingml/2006/wordprocessingDrawing" xmlns:w10="urn:schemas-microsoft-com:office:word" xmlns:w="http://schemas.openxmlformats.org/wordprocessingml/2006/main" xmlns:w14="http://schemas.microsoft.com/office/word/2010/wordml" xmlns:w15="http://schemas.microsoft.com/office/word/2012/wordml" xmlns:w16cex="http://schemas.microsoft.com/office/word/2018/wordml/cex" xmlns:w16cid="http://schemas.microsoft.com/office/word/2016/wordml/cid" xmlns:w16="http://schemas.microsoft.com/office/word/2018/wordml" xmlns:w16du="http://schemas.microsoft.com/office/word/2023/wordml/word16du" xmlns:w16sdtdh="http://schemas.microsoft.com/office/word/2020/wordml/sdtdatahash" xmlns:w16sdtfl="http://schemas.microsoft.com/office/word/2024/wordml/sdtformatlock" xmlns:w16se="http://schemas.microsoft.com/office/word/2015/wordml/symex" xmlns:wpg="http://schemas.microsoft.com/office/word/2010/wordprocessingGroup" xmlns:wpi="http://schemas.microsoft.com/office/word/2010/wordprocessingInk" xmlns:wne="http://schemas.microsoft.com/office/word/2006/wordml" xmlns:wps="http://schemas.microsoft.com/office/word/2010/wordprocessingShape" mc:Ignorable="w14 w15 w16se w16cid w16 w16cex w16sdtdh w16sdtfl w16du wp14">
   <w:body>
-    <w:p>
-      <w:pPr>
-        <w:rPr>
-          <w:lang w:val="en-IN"/>
-        </w:rPr>
-      </w:pPr>
-      <w:r>
-        <w:rPr>
-          <w:b/>
-          <w:bCs/>
-          <w:lang w:val="en-IN"/>
-        </w:rPr>
-        <w:t>User Manual for Course Management System</w:t>
-      </w:r>
-    </w:p>
-    <w:p>
-      <w:pPr>
-        <w:rPr>
-          <w:lang w:val="en-IN"/>
-        </w:rPr>
-      </w:pPr>
-      <w:r>
-        <w:rPr>
-          <w:lang w:val="en-IN"/>
-        </w:rPr>
-        <w:pict w14:anchorId="7909E28A">
-          <v:rect id="_x0000_i1025" style="width:0;height:1.5pt" o:hralign="center" o:hrstd="t" o:hr="t" fillcolor="#a0a0a0" stroked="f"/>
-        </w:pict>
-      </w:r>
-    </w:p>
-    <w:p>
-      <w:pPr>
-        <w:rPr>
-          <w:b/>
-          <w:bCs/>
-          <w:lang w:val="en-IN"/>
-        </w:rPr>
-      </w:pPr>
-      <w:r>
-        <w:rPr>
-          <w:b/>
-          <w:bCs/>
-          <w:lang w:val="en-IN"/>
-        </w:rPr>
+    <w:sdt>
+      <w:sdtPr>
+        <w:id w:val="1655183599"/>
+        <w:docPartObj>
+          <w:docPartGallery w:val="Cover Pages"/>
+          <w:docPartUnique/>
+        </w:docPartObj>
+      </w:sdtPr>
+      <w:sdtEndPr>
+        <w:rPr>
+          <w:noProof/>
+          <w:lang w:val="en-IN"/>
+        </w:rPr>
+      </w:sdtEndPr>
+      <w:sdtContent>
+        <w:p>
+          <w:r>
+            <w:rPr>
+              <w:noProof/>
+            </w:rPr>
+            <mc:AlternateContent>
+              <mc:Choice Requires="wpg">
+                <w:drawing>
+                  <wp:anchor distT="0" distB="0" distL="114300" distR="114300" simplePos="0" relativeHeight="251662336" behindDoc="0" locked="0" layoutInCell="1" allowOverlap="1" wp14:anchorId="719735AB" wp14:editId="50F2CB85">
+                    <wp:simplePos x="0" y="0"/>
+                    <wp:positionH relativeFrom="page">
+                      <wp:align>center</wp:align>
+                    </wp:positionH>
+                    <mc:AlternateContent>
+                      <mc:Choice Requires="wp14">
+                        <wp:positionV relativeFrom="page">
+                          <wp14:pctPosVOffset>2300</wp14:pctPosVOffset>
+                        </wp:positionV>
+                      </mc:Choice>
+                      <mc:Fallback>
+                        <wp:positionV relativeFrom="page">
+                          <wp:posOffset>245745</wp:posOffset>
+                        </wp:positionV>
+                      </mc:Fallback>
+                    </mc:AlternateContent>
+                    <wp:extent cx="7315200" cy="1215391"/>
+                    <wp:effectExtent l="0" t="0" r="1270" b="1905"/>
+                    <wp:wrapNone/>
+                    <wp:docPr id="149" name="Group 157"/>
+                    <wp:cNvGraphicFramePr/>
+                    <a:graphic xmlns:a="http://schemas.openxmlformats.org/drawingml/2006/main">
+                      <a:graphicData uri="http://schemas.microsoft.com/office/word/2010/wordprocessingGroup">
+                        <wpg:wgp>
+                          <wpg:cNvGrpSpPr/>
+                          <wpg:grpSpPr>
+                            <a:xfrm>
+                              <a:off x="0" y="0"/>
+                              <a:ext cx="7315200" cy="1215391"/>
+                              <a:chOff x="0" y="-1"/>
+                              <a:chExt cx="7315200" cy="1216153"/>
+                            </a:xfrm>
+                          </wpg:grpSpPr>
+                          <wps:wsp>
+                            <wps:cNvPr id="150" name="Rectangle 51"/>
+                            <wps:cNvSpPr/>
+                            <wps:spPr>
+                              <a:xfrm>
+                                <a:off x="0" y="-1"/>
+                                <a:ext cx="7315200" cy="1130373"/>
+                              </a:xfrm>
+                              <a:custGeom>
+                                <a:avLst/>
+                                <a:gdLst>
+                                  <a:gd name="connsiteX0" fmla="*/ 0 w 7312660"/>
+                                  <a:gd name="connsiteY0" fmla="*/ 0 h 1215390"/>
+                                  <a:gd name="connsiteX1" fmla="*/ 7312660 w 7312660"/>
+                                  <a:gd name="connsiteY1" fmla="*/ 0 h 1215390"/>
+                                  <a:gd name="connsiteX2" fmla="*/ 7312660 w 7312660"/>
+                                  <a:gd name="connsiteY2" fmla="*/ 1215390 h 1215390"/>
+                                  <a:gd name="connsiteX3" fmla="*/ 0 w 7312660"/>
+                                  <a:gd name="connsiteY3" fmla="*/ 1215390 h 1215390"/>
+                                  <a:gd name="connsiteX4" fmla="*/ 0 w 7312660"/>
+                                  <a:gd name="connsiteY4" fmla="*/ 0 h 1215390"/>
+                                  <a:gd name="connsiteX0" fmla="*/ 0 w 7312660"/>
+                                  <a:gd name="connsiteY0" fmla="*/ 0 h 1215390"/>
+                                  <a:gd name="connsiteX1" fmla="*/ 7312660 w 7312660"/>
+                                  <a:gd name="connsiteY1" fmla="*/ 0 h 1215390"/>
+                                  <a:gd name="connsiteX2" fmla="*/ 7312660 w 7312660"/>
+                                  <a:gd name="connsiteY2" fmla="*/ 1215390 h 1215390"/>
+                                  <a:gd name="connsiteX3" fmla="*/ 3667125 w 7312660"/>
+                                  <a:gd name="connsiteY3" fmla="*/ 1209675 h 1215390"/>
+                                  <a:gd name="connsiteX4" fmla="*/ 0 w 7312660"/>
+                                  <a:gd name="connsiteY4" fmla="*/ 1215390 h 1215390"/>
+                                  <a:gd name="connsiteX5" fmla="*/ 0 w 7312660"/>
+                                  <a:gd name="connsiteY5" fmla="*/ 0 h 1215390"/>
+                                  <a:gd name="connsiteX0" fmla="*/ 0 w 7312660"/>
+                                  <a:gd name="connsiteY0" fmla="*/ 0 h 1215390"/>
+                                  <a:gd name="connsiteX1" fmla="*/ 7312660 w 7312660"/>
+                                  <a:gd name="connsiteY1" fmla="*/ 0 h 1215390"/>
+                                  <a:gd name="connsiteX2" fmla="*/ 7312660 w 7312660"/>
+                                  <a:gd name="connsiteY2" fmla="*/ 1215390 h 1215390"/>
+                                  <a:gd name="connsiteX3" fmla="*/ 3619500 w 7312660"/>
+                                  <a:gd name="connsiteY3" fmla="*/ 733425 h 1215390"/>
+                                  <a:gd name="connsiteX4" fmla="*/ 0 w 7312660"/>
+                                  <a:gd name="connsiteY4" fmla="*/ 1215390 h 1215390"/>
+                                  <a:gd name="connsiteX5" fmla="*/ 0 w 7312660"/>
+                                  <a:gd name="connsiteY5" fmla="*/ 0 h 1215390"/>
+                                  <a:gd name="connsiteX0" fmla="*/ 0 w 7312660"/>
+                                  <a:gd name="connsiteY0" fmla="*/ 0 h 1215390"/>
+                                  <a:gd name="connsiteX1" fmla="*/ 7312660 w 7312660"/>
+                                  <a:gd name="connsiteY1" fmla="*/ 0 h 1215390"/>
+                                  <a:gd name="connsiteX2" fmla="*/ 7312660 w 7312660"/>
+                                  <a:gd name="connsiteY2" fmla="*/ 1129665 h 1215390"/>
+                                  <a:gd name="connsiteX3" fmla="*/ 3619500 w 7312660"/>
+                                  <a:gd name="connsiteY3" fmla="*/ 733425 h 1215390"/>
+                                  <a:gd name="connsiteX4" fmla="*/ 0 w 7312660"/>
+                                  <a:gd name="connsiteY4" fmla="*/ 1215390 h 1215390"/>
+                                  <a:gd name="connsiteX5" fmla="*/ 0 w 7312660"/>
+                                  <a:gd name="connsiteY5" fmla="*/ 0 h 1215390"/>
+                                  <a:gd name="connsiteX0" fmla="*/ 9525 w 7322185"/>
+                                  <a:gd name="connsiteY0" fmla="*/ 0 h 1129665"/>
+                                  <a:gd name="connsiteX1" fmla="*/ 7322185 w 7322185"/>
+                                  <a:gd name="connsiteY1" fmla="*/ 0 h 1129665"/>
+                                  <a:gd name="connsiteX2" fmla="*/ 7322185 w 7322185"/>
+                                  <a:gd name="connsiteY2" fmla="*/ 1129665 h 1129665"/>
+                                  <a:gd name="connsiteX3" fmla="*/ 3629025 w 7322185"/>
+                                  <a:gd name="connsiteY3" fmla="*/ 733425 h 1129665"/>
+                                  <a:gd name="connsiteX4" fmla="*/ 0 w 7322185"/>
+                                  <a:gd name="connsiteY4" fmla="*/ 1091565 h 1129665"/>
+                                  <a:gd name="connsiteX5" fmla="*/ 9525 w 7322185"/>
+                                  <a:gd name="connsiteY5" fmla="*/ 0 h 1129665"/>
+                                  <a:gd name="connsiteX0" fmla="*/ 0 w 7312660"/>
+                                  <a:gd name="connsiteY0" fmla="*/ 0 h 1129665"/>
+                                  <a:gd name="connsiteX1" fmla="*/ 7312660 w 7312660"/>
+                                  <a:gd name="connsiteY1" fmla="*/ 0 h 1129665"/>
+                                  <a:gd name="connsiteX2" fmla="*/ 7312660 w 7312660"/>
+                                  <a:gd name="connsiteY2" fmla="*/ 1129665 h 1129665"/>
+                                  <a:gd name="connsiteX3" fmla="*/ 3619500 w 7312660"/>
+                                  <a:gd name="connsiteY3" fmla="*/ 733425 h 1129665"/>
+                                  <a:gd name="connsiteX4" fmla="*/ 0 w 7312660"/>
+                                  <a:gd name="connsiteY4" fmla="*/ 1091565 h 1129665"/>
+                                  <a:gd name="connsiteX5" fmla="*/ 0 w 7312660"/>
+                                  <a:gd name="connsiteY5" fmla="*/ 0 h 1129665"/>
+                                </a:gdLst>
+                                <a:ahLst/>
+                                <a:cxnLst>
+                                  <a:cxn ang="0">
+                                    <a:pos x="connsiteX0" y="connsiteY0"/>
+                                  </a:cxn>
+                                  <a:cxn ang="0">
+                                    <a:pos x="connsiteX1" y="connsiteY1"/>
+                                  </a:cxn>
+                                  <a:cxn ang="0">
+                                    <a:pos x="connsiteX2" y="connsiteY2"/>
+                                  </a:cxn>
+                                  <a:cxn ang="0">
+                                    <a:pos x="connsiteX3" y="connsiteY3"/>
+                                  </a:cxn>
+                                  <a:cxn ang="0">
+                                    <a:pos x="connsiteX4" y="connsiteY4"/>
+                                  </a:cxn>
+                                  <a:cxn ang="0">
+                                    <a:pos x="connsiteX5" y="connsiteY5"/>
+                                  </a:cxn>
+                                </a:cxnLst>
+                                <a:rect l="l" t="t" r="r" b="b"/>
+                                <a:pathLst>
+                                  <a:path w="7312660" h="1129665">
+                                    <a:moveTo>
+                                      <a:pt x="0" y="0"/>
+                                    </a:moveTo>
+                                    <a:lnTo>
+                                      <a:pt x="7312660" y="0"/>
+                                    </a:lnTo>
+                                    <a:lnTo>
+                                      <a:pt x="7312660" y="1129665"/>
+                                    </a:lnTo>
+                                    <a:lnTo>
+                                      <a:pt x="3619500" y="733425"/>
+                                    </a:lnTo>
+                                    <a:lnTo>
+                                      <a:pt x="0" y="1091565"/>
+                                    </a:lnTo>
+                                    <a:lnTo>
+                                      <a:pt x="0" y="0"/>
+                                    </a:lnTo>
+                                    <a:close/>
+                                  </a:path>
+                                </a:pathLst>
+                              </a:custGeom>
+                              <a:ln>
+                                <a:noFill/>
+                              </a:ln>
+                            </wps:spPr>
+                            <wps:style>
+                              <a:lnRef idx="2">
+                                <a:schemeClr val="accent1">
+                                  <a:shade val="50000"/>
+                                </a:schemeClr>
+                              </a:lnRef>
+                              <a:fillRef idx="1">
+                                <a:schemeClr val="accent1"/>
+                              </a:fillRef>
+                              <a:effectRef idx="0">
+                                <a:schemeClr val="accent1"/>
+                              </a:effectRef>
+                              <a:fontRef idx="minor">
+                                <a:schemeClr val="lt1"/>
+                              </a:fontRef>
+                            </wps:style>
+                            <wps:bodyPr rot="0" spcFirstLastPara="0" vertOverflow="overflow" horzOverflow="overflow" vert="horz" wrap="square" lIns="91440" tIns="45720" rIns="91440" bIns="45720" numCol="1" spcCol="0" rtlCol="0" fromWordArt="0" anchor="ctr" anchorCtr="0" forceAA="0" compatLnSpc="1">
+                              <a:prstTxWarp prst="textNoShape">
+                                <a:avLst/>
+                              </a:prstTxWarp>
+                              <a:noAutofit/>
+                            </wps:bodyPr>
+                          </wps:wsp>
+                          <wps:wsp>
+                            <wps:cNvPr id="151" name="Rectangle 151"/>
+                            <wps:cNvSpPr/>
+                            <wps:spPr>
+                              <a:xfrm>
+                                <a:off x="0" y="0"/>
+                                <a:ext cx="7315200" cy="1216152"/>
+                              </a:xfrm>
+                              <a:prstGeom prst="rect">
+                                <a:avLst/>
+                              </a:prstGeom>
+                              <a:blipFill>
+                                <a:blip r:embed="rId8"/>
+                                <a:stretch>
+                                  <a:fillRect r="-7574"/>
+                                </a:stretch>
+                              </a:blipFill>
+                              <a:ln>
+                                <a:noFill/>
+                              </a:ln>
+                            </wps:spPr>
+                            <wps:style>
+                              <a:lnRef idx="2">
+                                <a:schemeClr val="accent1">
+                                  <a:shade val="50000"/>
+                                </a:schemeClr>
+                              </a:lnRef>
+                              <a:fillRef idx="1">
+                                <a:schemeClr val="accent1"/>
+                              </a:fillRef>
+                              <a:effectRef idx="0">
+                                <a:schemeClr val="accent1"/>
+                              </a:effectRef>
+                              <a:fontRef idx="minor">
+                                <a:schemeClr val="lt1"/>
+                              </a:fontRef>
+                            </wps:style>
+                            <wps:bodyPr rot="0" spcFirstLastPara="0" vertOverflow="overflow" horzOverflow="overflow" vert="horz" wrap="square" lIns="91440" tIns="45720" rIns="91440" bIns="45720" numCol="1" spcCol="0" rtlCol="0" fromWordArt="0" anchor="ctr" anchorCtr="0" forceAA="0" compatLnSpc="1">
+                              <a:prstTxWarp prst="textNoShape">
+                                <a:avLst/>
+                              </a:prstTxWarp>
+                              <a:noAutofit/>
+                            </wps:bodyPr>
+                          </wps:wsp>
+                        </wpg:wgp>
+                      </a:graphicData>
+                    </a:graphic>
+                    <wp14:sizeRelH relativeFrom="page">
+                      <wp14:pctWidth>94100</wp14:pctWidth>
+                    </wp14:sizeRelH>
+                    <wp14:sizeRelV relativeFrom="page">
+                      <wp14:pctHeight>12100</wp14:pctHeight>
+                    </wp14:sizeRelV>
+                  </wp:anchor>
+                </w:drawing>
+              </mc:Choice>
+              <mc:Fallback>
+                <w:pict>
+                  <v:group w14:anchorId="5FE506E8" id="Group 157" o:spid="_x0000_s1026" style="position:absolute;margin-left:0;margin-top:0;width:8in;height:95.7pt;z-index:251662336;mso-width-percent:941;mso-height-percent:121;mso-top-percent:23;mso-position-horizontal:center;mso-position-horizontal-relative:page;mso-position-vertical-relative:page;mso-width-percent:941;mso-height-percent:121;mso-top-percent:23" coordorigin="" coordsize="73152,12161" o:gfxdata="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">
+                    <v:shape id="Rectangle 51" o:spid="_x0000_s1027" style="position:absolute;width:73152;height:11303;visibility:visible;mso-wrap-style:square;v-text-anchor:middle" coordsize="7312660,1129665" o:gfxdata="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" path="m,l7312660,r,1129665l3619500,733425,,1091565,,xe" fillcolor="#156082 [3204]" stroked="f" strokeweight="1pt">
+                      <v:stroke joinstyle="miter"/>
+                      <v:path arrowok="t" o:connecttype="custom" o:connectlocs="0,0;7315200,0;7315200,1130373;3620757,733885;0,1092249;0,0" o:connectangles="0,0,0,0,0,0"/>
+                    </v:shape>
+                    <v:rect id="Rectangle 151" o:spid="_x0000_s1028" style="position:absolute;width:73152;height:12161;visibility:visible;mso-wrap-style:square;v-text-anchor:middle" o:gfxdata="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" stroked="f" strokeweight="1pt">
+                      <v:fill r:id="rId9" o:title="" recolor="t" rotate="t" type="frame"/>
+                    </v:rect>
+                    <w10:wrap anchorx="page" anchory="page"/>
+                  </v:group>
+                </w:pict>
+              </mc:Fallback>
+            </mc:AlternateContent>
+          </w:r>
+          <w:r>
+            <w:rPr>
+              <w:noProof/>
+            </w:rPr>
+            <mc:AlternateContent>
+              <mc:Choice Requires="wps">
+                <w:drawing>
+                  <wp:anchor distT="0" distB="0" distL="114300" distR="114300" simplePos="0" relativeHeight="251661312" behindDoc="0" locked="0" layoutInCell="1" allowOverlap="1" wp14:anchorId="069E4F38" wp14:editId="1E8EE5A3">
+                    <wp:simplePos x="0" y="0"/>
+                    <wp:positionH relativeFrom="page">
+                      <wp:align>center</wp:align>
+                    </wp:positionH>
+                    <mc:AlternateContent>
+                      <mc:Choice Requires="wp14">
+                        <wp:positionV relativeFrom="page">
+                          <wp14:pctPosVOffset>70000</wp14:pctPosVOffset>
+                        </wp:positionV>
+                      </mc:Choice>
+                      <mc:Fallback>
+                        <wp:positionV relativeFrom="page">
+                          <wp:posOffset>7484110</wp:posOffset>
+                        </wp:positionV>
+                      </mc:Fallback>
+                    </mc:AlternateContent>
+                    <wp:extent cx="7315200" cy="1009650"/>
+                    <wp:effectExtent l="0" t="0" r="0" b="0"/>
+                    <wp:wrapSquare wrapText="bothSides"/>
+                    <wp:docPr id="153" name="Text Box 161"/>
+                    <wp:cNvGraphicFramePr/>
+                    <a:graphic xmlns:a="http://schemas.openxmlformats.org/drawingml/2006/main">
+                      <a:graphicData uri="http://schemas.microsoft.com/office/word/2010/wordprocessingShape">
+                        <wps:wsp>
+                          <wps:cNvSpPr txBox="1"/>
+                          <wps:spPr>
+                            <a:xfrm>
+                              <a:off x="0" y="0"/>
+                              <a:ext cx="7315200" cy="1009650"/>
+                            </a:xfrm>
+                            <a:prstGeom prst="rect">
+                              <a:avLst/>
+                            </a:prstGeom>
+                            <a:noFill/>
+                            <a:ln w="6350">
+                              <a:noFill/>
+                            </a:ln>
+                            <a:effectLst/>
+                          </wps:spPr>
+                          <wps:style>
+                            <a:lnRef idx="0">
+                              <a:schemeClr val="accent1"/>
+                            </a:lnRef>
+                            <a:fillRef idx="0">
+                              <a:schemeClr val="accent1"/>
+                            </a:fillRef>
+                            <a:effectRef idx="0">
+                              <a:schemeClr val="accent1"/>
+                            </a:effectRef>
+                            <a:fontRef idx="minor">
+                              <a:schemeClr val="dk1"/>
+                            </a:fontRef>
+                          </wps:style>
+                          <wps:txbx>
+                            <w:txbxContent>
+                              <w:p>
+                                <w:pPr>
+                                  <w:pStyle w:val="NoSpacing"/>
+                                  <w:jc w:val="right"/>
+                                  <w:rPr>
+                                    <w:color w:val="156082" w:themeColor="accent1"/>
+                                    <w:sz w:val="28"/>
+                                    <w:szCs w:val="28"/>
+                                  </w:rPr>
+                                </w:pPr>
+                                <w:r>
+                                  <w:rPr>
+                                    <w:color w:val="156082" w:themeColor="accent1"/>
+                                    <w:sz w:val="28"/>
+                                    <w:szCs w:val="28"/>
+                                  </w:rPr>
+                                  <w:t>A</w:t>
+                                </w:r>
+                                <w:r>
+                                  <w:rPr>
+                                    <w:color w:val="156082" w:themeColor="accent1"/>
+                                    <w:sz w:val="28"/>
+                                    <w:szCs w:val="28"/>
+                                  </w:rPr>
+                                  <w:t>uthors:</w:t>
+                                </w:r>
+                              </w:p>
+                              <w:sdt>
+                                <w:sdtPr>
+                                  <w:rPr>
+                                    <w:color w:val="595959" w:themeColor="text1" w:themeTint="A6"/>
+                                    <w:sz w:val="20"/>
+                                    <w:szCs w:val="20"/>
+                                  </w:rPr>
+                                  <w:alias w:val="Abstract"/>
+                                  <w:tag w:val=""/>
+                                  <w:id w:val="1375273687"/>
+                                  <w:dataBinding w:prefixMappings="xmlns:ns0='http://schemas.microsoft.com/office/2006/coverPageProps' " w:xpath="/ns0:CoverPageProperties[1]/ns0:Abstract[1]" w:storeItemID="{55AF091B-3C7A-41E3-B477-F2FDAA23CFDA}"/>
+                                  <w:text w:multiLine="1"/>
+                                </w:sdtPr>
+                                <w:sdtContent>
+                                  <w:p>
+                                    <w:pPr>
+                                      <w:pStyle w:val="NoSpacing"/>
+                                      <w:jc w:val="right"/>
+                                      <w:rPr>
+                                        <w:color w:val="595959" w:themeColor="text1" w:themeTint="A6"/>
+                                        <w:sz w:val="20"/>
+                                        <w:szCs w:val="20"/>
+                                      </w:rPr>
+                                    </w:pPr>
+                                    <w:r>
+                                      <w:rPr>
+                                        <w:color w:val="595959" w:themeColor="text1" w:themeTint="A6"/>
+                                        <w:sz w:val="20"/>
+                                        <w:szCs w:val="20"/>
+                                      </w:rPr>
+                                      <w:t xml:space="preserve">Raiyan Alam, </w:t>
+                                    </w:r>
+                                    <w:r>
+                                      <w:rPr>
+                                        <w:color w:val="595959" w:themeColor="text1" w:themeTint="A6"/>
+                                        <w:sz w:val="20"/>
+                                        <w:szCs w:val="20"/>
+                                      </w:rPr>
+                                      <w:t>Denis Gitman</w:t>
+                                    </w:r>
+                                    <w:r>
+                                      <w:rPr>
+                                        <w:color w:val="595959" w:themeColor="text1" w:themeTint="A6"/>
+                                        <w:sz w:val="20"/>
+                                        <w:szCs w:val="20"/>
+                                      </w:rPr>
+                                      <w:t>,</w:t>
+                                    </w:r>
+                                    <w:r>
+                                      <w:rPr>
+                                        <w:color w:val="595959" w:themeColor="text1" w:themeTint="A6"/>
+                                        <w:sz w:val="20"/>
+                                        <w:szCs w:val="20"/>
+                                      </w:rPr>
+                                      <w:t xml:space="preserve"> </w:t>
+                                    </w:r>
+                                    <w:r>
+                                      <w:rPr>
+                                        <w:color w:val="595959" w:themeColor="text1" w:themeTint="A6"/>
+                                        <w:sz w:val="20"/>
+                                        <w:szCs w:val="20"/>
+                                      </w:rPr>
+                                      <w:t>Neel Patkar,</w:t>
+                                    </w:r>
+                                    <w:r>
+                                      <w:rPr>
+                                        <w:color w:val="595959" w:themeColor="text1" w:themeTint="A6"/>
+                                        <w:sz w:val="20"/>
+                                        <w:szCs w:val="20"/>
+                                      </w:rPr>
+                                      <w:t xml:space="preserve"> Harman Singh</w:t>
+                                    </w:r>
+                                    <w:r>
+                                      <w:rPr>
+                                        <w:color w:val="595959" w:themeColor="text1" w:themeTint="A6"/>
+                                        <w:sz w:val="20"/>
+                                        <w:szCs w:val="20"/>
+                                      </w:rPr>
+                                      <w:t>, Namit Singh</w:t>
+                                    </w:r>
+                                  </w:p>
+                                </w:sdtContent>
+                              </w:sdt>
+                            </w:txbxContent>
+                          </wps:txbx>
+                          <wps:bodyPr rot="0" spcFirstLastPara="0" vertOverflow="overflow" horzOverflow="overflow" vert="horz" wrap="square" lIns="1600200" tIns="0" rIns="685800" bIns="0" numCol="1" spcCol="0" rtlCol="0" fromWordArt="0" anchor="t" anchorCtr="0" forceAA="0" compatLnSpc="1">
+                            <a:prstTxWarp prst="textNoShape">
+                              <a:avLst/>
+                            </a:prstTxWarp>
+                            <a:spAutoFit/>
+                          </wps:bodyPr>
+                        </wps:wsp>
+                      </a:graphicData>
+                    </a:graphic>
+                    <wp14:sizeRelH relativeFrom="page">
+                      <wp14:pctWidth>94100</wp14:pctWidth>
+                    </wp14:sizeRelH>
+                    <wp14:sizeRelV relativeFrom="page">
+                      <wp14:pctHeight>10000</wp14:pctHeight>
+                    </wp14:sizeRelV>
+                  </wp:anchor>
+                </w:drawing>
+              </mc:Choice>
+              <mc:Fallback>
+                <w:pict>
+                  <v:shapetype w14:anchorId="069E4F38" id="_x0000_t202" coordsize="21600,21600" o:spt="202" path="m,l,21600r21600,l21600,xe">
+                    <v:stroke joinstyle="miter"/>
+                    <v:path gradientshapeok="t" o:connecttype="rect"/>
+                  </v:shapetype>
+                  <v:shape id="Text Box 161" o:spid="_x0000_s1026" type="#_x0000_t202" style="position:absolute;margin-left:0;margin-top:0;width:8in;height:79.5pt;z-index:251661312;visibility:visible;mso-wrap-style:square;mso-width-percent:941;mso-height-percent:100;mso-top-percent:700;mso-wrap-distance-left:9pt;mso-wrap-distance-top:0;mso-wrap-distance-right:9pt;mso-wrap-distance-bottom:0;mso-position-horizontal:center;mso-position-horizontal-relative:page;mso-position-vertical-relative:page;mso-width-percent:941;mso-height-percent:100;mso-top-percent:700;mso-width-relative:page;mso-height-relative:page;v-text-anchor:top" o:gfxdata="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" filled="f" stroked="f" strokeweight=".5pt">
+                    <v:textbox style="mso-fit-shape-to-text:t" inset="126pt,0,54pt,0">
+                      <w:txbxContent>
+                        <w:p>
+                          <w:pPr>
+                            <w:pStyle w:val="NoSpacing"/>
+                            <w:jc w:val="right"/>
+                            <w:rPr>
+                              <w:color w:val="156082" w:themeColor="accent1"/>
+                              <w:sz w:val="28"/>
+                              <w:szCs w:val="28"/>
+                            </w:rPr>
+                          </w:pPr>
+                          <w:r>
+                            <w:rPr>
+                              <w:color w:val="156082" w:themeColor="accent1"/>
+                              <w:sz w:val="28"/>
+                              <w:szCs w:val="28"/>
+                            </w:rPr>
+                            <w:t>A</w:t>
+                          </w:r>
+                          <w:r>
+                            <w:rPr>
+                              <w:color w:val="156082" w:themeColor="accent1"/>
+                              <w:sz w:val="28"/>
+                              <w:szCs w:val="28"/>
+                            </w:rPr>
+                            <w:t>uthors:</w:t>
+                          </w:r>
+                        </w:p>
+                        <w:sdt>
+                          <w:sdtPr>
+                            <w:rPr>
+                              <w:color w:val="595959" w:themeColor="text1" w:themeTint="A6"/>
+                              <w:sz w:val="20"/>
+                              <w:szCs w:val="20"/>
+                            </w:rPr>
+                            <w:alias w:val="Abstract"/>
+                            <w:tag w:val=""/>
+                            <w:id w:val="1375273687"/>
+                            <w:dataBinding w:prefixMappings="xmlns:ns0='http://schemas.microsoft.com/office/2006/coverPageProps' " w:xpath="/ns0:CoverPageProperties[1]/ns0:Abstract[1]" w:storeItemID="{55AF091B-3C7A-41E3-B477-F2FDAA23CFDA}"/>
+                            <w:text w:multiLine="1"/>
+                          </w:sdtPr>
+                          <w:sdtContent>
+                            <w:p>
+                              <w:pPr>
+                                <w:pStyle w:val="NoSpacing"/>
+                                <w:jc w:val="right"/>
+                                <w:rPr>
+                                  <w:color w:val="595959" w:themeColor="text1" w:themeTint="A6"/>
+                                  <w:sz w:val="20"/>
+                                  <w:szCs w:val="20"/>
+                                </w:rPr>
+                              </w:pPr>
+                              <w:r>
+                                <w:rPr>
+                                  <w:color w:val="595959" w:themeColor="text1" w:themeTint="A6"/>
+                                  <w:sz w:val="20"/>
+                                  <w:szCs w:val="20"/>
+                                </w:rPr>
+                                <w:t xml:space="preserve">Raiyan Alam, </w:t>
+                              </w:r>
+                              <w:r>
+                                <w:rPr>
+                                  <w:color w:val="595959" w:themeColor="text1" w:themeTint="A6"/>
+                                  <w:sz w:val="20"/>
+                                  <w:szCs w:val="20"/>
+                                </w:rPr>
+                                <w:t>Denis Gitman</w:t>
+                              </w:r>
+                              <w:r>
+                                <w:rPr>
+                                  <w:color w:val="595959" w:themeColor="text1" w:themeTint="A6"/>
+                                  <w:sz w:val="20"/>
+                                  <w:szCs w:val="20"/>
+                                </w:rPr>
+                                <w:t>,</w:t>
+                              </w:r>
+                              <w:r>
+                                <w:rPr>
+                                  <w:color w:val="595959" w:themeColor="text1" w:themeTint="A6"/>
+                                  <w:sz w:val="20"/>
+                                  <w:szCs w:val="20"/>
+                                </w:rPr>
+                                <w:t xml:space="preserve"> </w:t>
+                              </w:r>
+                              <w:r>
+                                <w:rPr>
+                                  <w:color w:val="595959" w:themeColor="text1" w:themeTint="A6"/>
+                                  <w:sz w:val="20"/>
+                                  <w:szCs w:val="20"/>
+                                </w:rPr>
+                                <w:t>Neel Patkar,</w:t>
+                              </w:r>
+                              <w:r>
+                                <w:rPr>
+                                  <w:color w:val="595959" w:themeColor="text1" w:themeTint="A6"/>
+                                  <w:sz w:val="20"/>
+                                  <w:szCs w:val="20"/>
+                                </w:rPr>
+                                <w:t xml:space="preserve"> Harman Singh</w:t>
+                              </w:r>
+                              <w:r>
+                                <w:rPr>
+                                  <w:color w:val="595959" w:themeColor="text1" w:themeTint="A6"/>
+                                  <w:sz w:val="20"/>
+                                  <w:szCs w:val="20"/>
+                                </w:rPr>
+                                <w:t>, Namit Singh</w:t>
+                              </w:r>
+                            </w:p>
+                          </w:sdtContent>
+                        </w:sdt>
+                      </w:txbxContent>
+                    </v:textbox>
+                    <w10:wrap type="square" anchorx="page" anchory="page"/>
+                  </v:shape>
+                </w:pict>
+              </mc:Fallback>
+            </mc:AlternateContent>
+          </w:r>
+          <w:r>
+            <w:rPr>
+              <w:noProof/>
+            </w:rPr>
+            <mc:AlternateContent>
+              <mc:Choice Requires="wps">
+                <w:drawing>
+                  <wp:anchor distT="0" distB="0" distL="114300" distR="114300" simplePos="0" relativeHeight="251659264" behindDoc="0" locked="0" layoutInCell="1" allowOverlap="1" wp14:anchorId="18DB7513" wp14:editId="36270C68">
+                    <wp:simplePos x="0" y="0"/>
+                    <wp:positionH relativeFrom="page">
+                      <wp:align>center</wp:align>
+                    </wp:positionH>
+                    <mc:AlternateContent>
+                      <mc:Choice Requires="wp14">
+                        <wp:positionV relativeFrom="page">
+                          <wp14:pctPosVOffset>30000</wp14:pctPosVOffset>
+                        </wp:positionV>
+                      </mc:Choice>
+                      <mc:Fallback>
+                        <wp:positionV relativeFrom="page">
+                          <wp:posOffset>3207385</wp:posOffset>
+                        </wp:positionV>
+                      </mc:Fallback>
+                    </mc:AlternateContent>
+                    <wp:extent cx="7315200" cy="3638550"/>
+                    <wp:effectExtent l="0" t="0" r="0" b="6350"/>
+                    <wp:wrapSquare wrapText="bothSides"/>
+                    <wp:docPr id="154" name="Text Box 163"/>
+                    <wp:cNvGraphicFramePr/>
+                    <a:graphic xmlns:a="http://schemas.openxmlformats.org/drawingml/2006/main">
+                      <a:graphicData uri="http://schemas.microsoft.com/office/word/2010/wordprocessingShape">
+                        <wps:wsp>
+                          <wps:cNvSpPr txBox="1"/>
+                          <wps:spPr>
+                            <a:xfrm>
+                              <a:off x="0" y="0"/>
+                              <a:ext cx="7315200" cy="3638550"/>
+                            </a:xfrm>
+                            <a:prstGeom prst="rect">
+                              <a:avLst/>
+                            </a:prstGeom>
+                            <a:noFill/>
+                            <a:ln w="6350">
+                              <a:noFill/>
+                            </a:ln>
+                            <a:effectLst/>
+                          </wps:spPr>
+                          <wps:style>
+                            <a:lnRef idx="0">
+                              <a:schemeClr val="accent1"/>
+                            </a:lnRef>
+                            <a:fillRef idx="0">
+                              <a:schemeClr val="accent1"/>
+                            </a:fillRef>
+                            <a:effectRef idx="0">
+                              <a:schemeClr val="accent1"/>
+                            </a:effectRef>
+                            <a:fontRef idx="minor">
+                              <a:schemeClr val="dk1"/>
+                            </a:fontRef>
+                          </wps:style>
+                          <wps:txbx>
+                            <w:txbxContent>
+                              <w:p>
+                                <w:pPr>
+                                  <w:jc w:val="right"/>
+                                  <w:rPr>
+                                    <w:color w:val="156082" w:themeColor="accent1"/>
+                                    <w:sz w:val="64"/>
+                                    <w:szCs w:val="64"/>
+                                  </w:rPr>
+                                </w:pPr>
+                                <w:sdt>
+                                  <w:sdtPr>
+                                    <w:rPr>
+                                      <w:caps/>
+                                      <w:color w:val="156082" w:themeColor="accent1"/>
+                                      <w:sz w:val="64"/>
+                                      <w:szCs w:val="64"/>
+                                    </w:rPr>
+                                    <w:alias w:val="Title"/>
+                                    <w:tag w:val=""/>
+                                    <w:id w:val="630141079"/>
+                                    <w:dataBinding w:prefixMappings="xmlns:ns0='http://purl.org/dc/elements/1.1/' xmlns:ns1='http://schemas.openxmlformats.org/package/2006/metadata/core-properties' " w:xpath="/ns1:coreProperties[1]/ns0:title[1]" w:storeItemID="{6C3C8BC8-F283-45AE-878A-BAB7291924A1}"/>
+                                    <w:text w:multiLine="1"/>
+                                  </w:sdtPr>
+                                  <w:sdtEndPr>
+                                    <w:rPr>
+                                      <w:caps w:val="0"/>
+                                    </w:rPr>
+                                  </w:sdtEndPr>
+                                  <w:sdtContent>
+                                    <w:r>
+                                      <w:rPr>
+                                        <w:caps/>
+                                        <w:color w:val="156082" w:themeColor="accent1"/>
+                                        <w:sz w:val="64"/>
+                                        <w:szCs w:val="64"/>
+                                      </w:rPr>
+                                      <w:t>USER MANUAL</w:t>
+                                    </w:r>
+                                  </w:sdtContent>
+                                </w:sdt>
+                              </w:p>
+                              <w:sdt>
+                                <w:sdtPr>
+                                  <w:rPr>
+                                    <w:color w:val="404040" w:themeColor="text1" w:themeTint="BF"/>
+                                    <w:sz w:val="36"/>
+                                    <w:szCs w:val="36"/>
+                                  </w:rPr>
+                                  <w:alias w:val="Subtitle"/>
+                                  <w:tag w:val=""/>
+                                  <w:id w:val="1759551507"/>
+                                  <w:dataBinding w:prefixMappings="xmlns:ns0='http://purl.org/dc/elements/1.1/' xmlns:ns1='http://schemas.openxmlformats.org/package/2006/metadata/core-properties' " w:xpath="/ns1:coreProperties[1]/ns0:subject[1]" w:storeItemID="{6C3C8BC8-F283-45AE-878A-BAB7291924A1}"/>
+                                  <w:text/>
+                                </w:sdtPr>
+                                <w:sdtContent>
+                                  <w:p>
+                                    <w:pPr>
+                                      <w:jc w:val="right"/>
+                                      <w:rPr>
+                                        <w:smallCaps/>
+                                        <w:color w:val="404040" w:themeColor="text1" w:themeTint="BF"/>
+                                        <w:sz w:val="36"/>
+                                        <w:szCs w:val="36"/>
+                                      </w:rPr>
+                                    </w:pPr>
+                                    <w:r>
+                                      <w:rPr>
+                                        <w:color w:val="404040" w:themeColor="text1" w:themeTint="BF"/>
+                                        <w:sz w:val="36"/>
+                                        <w:szCs w:val="36"/>
+                                      </w:rPr>
+                                      <w:t>G</w:t>
+                                    </w:r>
+                                    <w:r>
+                                      <w:rPr>
+                                        <w:color w:val="404040" w:themeColor="text1" w:themeTint="BF"/>
+                                        <w:sz w:val="36"/>
+                                        <w:szCs w:val="36"/>
+                                      </w:rPr>
+                                      <w:t>roup</w:t>
+                                    </w:r>
+                                    <w:r>
+                                      <w:rPr>
+                                        <w:color w:val="404040" w:themeColor="text1" w:themeTint="BF"/>
+                                        <w:sz w:val="36"/>
+                                        <w:szCs w:val="36"/>
+                                      </w:rPr>
+                                      <w:t xml:space="preserve"> 77</w:t>
+                                    </w:r>
+                                  </w:p>
+                                </w:sdtContent>
+                              </w:sdt>
+                            </w:txbxContent>
+                          </wps:txbx>
+                          <wps:bodyPr rot="0" spcFirstLastPara="0" vertOverflow="overflow" horzOverflow="overflow" vert="horz" wrap="square" lIns="1600200" tIns="0" rIns="685800" bIns="0" numCol="1" spcCol="0" rtlCol="0" fromWordArt="0" anchor="b" anchorCtr="0" forceAA="0" compatLnSpc="1">
+                            <a:prstTxWarp prst="textNoShape">
+                              <a:avLst/>
+                            </a:prstTxWarp>
+                            <a:noAutofit/>
+                          </wps:bodyPr>
+                        </wps:wsp>
+                      </a:graphicData>
+                    </a:graphic>
+                    <wp14:sizeRelH relativeFrom="page">
+                      <wp14:pctWidth>94100</wp14:pctWidth>
+                    </wp14:sizeRelH>
+                    <wp14:sizeRelV relativeFrom="page">
+                      <wp14:pctHeight>36300</wp14:pctHeight>
+                    </wp14:sizeRelV>
+                  </wp:anchor>
+                </w:drawing>
+              </mc:Choice>
+              <mc:Fallback>
+                <w:pict>
+                  <v:shape w14:anchorId="18DB7513" id="Text Box 163" o:spid="_x0000_s1027" type="#_x0000_t202" style="position:absolute;margin-left:0;margin-top:0;width:8in;height:286.5pt;z-index:251659264;visibility:visible;mso-wrap-style:square;mso-width-percent:941;mso-height-percent:363;mso-top-percent:300;mso-wrap-distance-left:9pt;mso-wrap-distance-top:0;mso-wrap-distance-right:9pt;mso-wrap-distance-bottom:0;mso-position-horizontal:center;mso-position-horizontal-relative:page;mso-position-vertical-relative:page;mso-width-percent:941;mso-height-percent:363;mso-top-percent:300;mso-width-relative:page;mso-height-relative:page;v-text-anchor:bottom" o:gfxdata="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" filled="f" stroked="f" strokeweight=".5pt">
+                    <v:textbox inset="126pt,0,54pt,0">
+                      <w:txbxContent>
+                        <w:p>
+                          <w:pPr>
+                            <w:jc w:val="right"/>
+                            <w:rPr>
+                              <w:color w:val="156082" w:themeColor="accent1"/>
+                              <w:sz w:val="64"/>
+                              <w:szCs w:val="64"/>
+                            </w:rPr>
+                          </w:pPr>
+                          <w:sdt>
+                            <w:sdtPr>
+                              <w:rPr>
+                                <w:caps/>
+                                <w:color w:val="156082" w:themeColor="accent1"/>
+                                <w:sz w:val="64"/>
+                                <w:szCs w:val="64"/>
+                              </w:rPr>
+                              <w:alias w:val="Title"/>
+                              <w:tag w:val=""/>
+                              <w:id w:val="630141079"/>
+                              <w:dataBinding w:prefixMappings="xmlns:ns0='http://purl.org/dc/elements/1.1/' xmlns:ns1='http://schemas.openxmlformats.org/package/2006/metadata/core-properties' " w:xpath="/ns1:coreProperties[1]/ns0:title[1]" w:storeItemID="{6C3C8BC8-F283-45AE-878A-BAB7291924A1}"/>
+                              <w:text w:multiLine="1"/>
+                            </w:sdtPr>
+                            <w:sdtEndPr>
+                              <w:rPr>
+                                <w:caps w:val="0"/>
+                              </w:rPr>
+                            </w:sdtEndPr>
+                            <w:sdtContent>
+                              <w:r>
+                                <w:rPr>
+                                  <w:caps/>
+                                  <w:color w:val="156082" w:themeColor="accent1"/>
+                                  <w:sz w:val="64"/>
+                                  <w:szCs w:val="64"/>
+                                </w:rPr>
+                                <w:t>USER MANUAL</w:t>
+                              </w:r>
+                            </w:sdtContent>
+                          </w:sdt>
+                        </w:p>
+                        <w:sdt>
+                          <w:sdtPr>
+                            <w:rPr>
+                              <w:color w:val="404040" w:themeColor="text1" w:themeTint="BF"/>
+                              <w:sz w:val="36"/>
+                              <w:szCs w:val="36"/>
+                            </w:rPr>
+                            <w:alias w:val="Subtitle"/>
+                            <w:tag w:val=""/>
+                            <w:id w:val="1759551507"/>
+                            <w:dataBinding w:prefixMappings="xmlns:ns0='http://purl.org/dc/elements/1.1/' xmlns:ns1='http://schemas.openxmlformats.org/package/2006/metadata/core-properties' " w:xpath="/ns1:coreProperties[1]/ns0:subject[1]" w:storeItemID="{6C3C8BC8-F283-45AE-878A-BAB7291924A1}"/>
+                            <w:text/>
+                          </w:sdtPr>
+                          <w:sdtContent>
+                            <w:p>
+                              <w:pPr>
+                                <w:jc w:val="right"/>
+                                <w:rPr>
+                                  <w:smallCaps/>
+                                  <w:color w:val="404040" w:themeColor="text1" w:themeTint="BF"/>
+                                  <w:sz w:val="36"/>
+                                  <w:szCs w:val="36"/>
+                                </w:rPr>
+                              </w:pPr>
+                              <w:r>
+                                <w:rPr>
+                                  <w:color w:val="404040" w:themeColor="text1" w:themeTint="BF"/>
+                                  <w:sz w:val="36"/>
+                                  <w:szCs w:val="36"/>
+                                </w:rPr>
+                                <w:t>G</w:t>
+                              </w:r>
+                              <w:r>
+                                <w:rPr>
+                                  <w:color w:val="404040" w:themeColor="text1" w:themeTint="BF"/>
+                                  <w:sz w:val="36"/>
+                                  <w:szCs w:val="36"/>
+                                </w:rPr>
+                                <w:t>roup</w:t>
+                              </w:r>
+                              <w:r>
+                                <w:rPr>
+                                  <w:color w:val="404040" w:themeColor="text1" w:themeTint="BF"/>
+                                  <w:sz w:val="36"/>
+                                  <w:szCs w:val="36"/>
+                                </w:rPr>
+                                <w:t xml:space="preserve"> 77</w:t>
+                              </w:r>
+                            </w:p>
+                          </w:sdtContent>
+                        </w:sdt>
+                      </w:txbxContent>
+                    </v:textbox>
+                    <w10:wrap type="square" anchorx="page" anchory="page"/>
+                  </v:shape>
+                </w:pict>
+              </mc:Fallback>
+            </mc:AlternateContent>
+          </w:r>
+        </w:p>
+        <w:p>
+          <w:pPr>
+            <w:rPr>
+              <w:noProof/>
+              <w:lang w:val="en-IN"/>
+            </w:rPr>
+          </w:pPr>
+          <w:r>
+            <w:rPr>
+              <w:noProof/>
+              <w:lang w:val="en-IN"/>
+            </w:rPr>
+            <w:br w:type="page"/>
+          </w:r>
+        </w:p>
+      </w:sdtContent>
+    </w:sdt>
+    <w:p>
+      <w:pPr>
+        <w:rPr>
+          <w:b/>
+          <w:bCs/>
+          <w:lang w:val="en-IN"/>
+        </w:rPr>
+      </w:pPr>
+      <w:r>
+        <w:rPr>
+          <w:b/>
+          <w:bCs/>
+          <w:lang w:val="en-IN"/>
+        </w:rPr>
+        <w:lastRenderedPageBreak/>
         <w:t>1. Login / Registration</w:t>
       </w:r>
     </w:p>
@@ -110,6 +983,7 @@
       </w:pPr>
       <w:r>
         <w:rPr>
+          <w:noProof/>
           <w:lang w:val="en-IN"/>
         </w:rPr>
         <w:drawing>
@@ -128,7 +1002,7 @@
                     <pic:cNvPicPr/>
                   </pic:nvPicPr>
                   <pic:blipFill>
-                    <a:blip r:embed="rId5"/>
+                    <a:blip r:embed="rId10"/>
                     <a:stretch>
                       <a:fillRect/>
                     </a:stretch>
@@ -150,6 +1024,7 @@
       </w:r>
       <w:r>
         <w:rPr>
+          <w:noProof/>
           <w:lang w:val="en-IN"/>
         </w:rPr>
         <w:drawing>
@@ -168,7 +1043,7 @@
                     <pic:cNvPicPr/>
                   </pic:nvPicPr>
                   <pic:blipFill>
-                    <a:blip r:embed="rId6"/>
+                    <a:blip r:embed="rId11"/>
                     <a:stretch>
                       <a:fillRect/>
                     </a:stretch>
@@ -255,6 +1130,7 @@
       </w:pPr>
       <w:r>
         <w:rPr>
+          <w:noProof/>
           <w:lang w:val="en-IN"/>
         </w:rPr>
         <w:lastRenderedPageBreak/>
@@ -274,7 +1150,7 @@
                     <pic:cNvPicPr/>
                   </pic:nvPicPr>
                   <pic:blipFill>
-                    <a:blip r:embed="rId7"/>
+                    <a:blip r:embed="rId12"/>
                     <a:stretch>
                       <a:fillRect/>
                     </a:stretch>
@@ -396,6 +1272,7 @@
       </w:pPr>
       <w:r>
         <w:rPr>
+          <w:noProof/>
           <w:lang w:val="en-IN"/>
         </w:rPr>
         <w:drawing>
@@ -414,7 +1291,7 @@
                     <pic:cNvPicPr/>
                   </pic:nvPicPr>
                   <pic:blipFill>
-                    <a:blip r:embed="rId7"/>
+                    <a:blip r:embed="rId12"/>
                     <a:stretch>
                       <a:fillRect/>
                     </a:stretch>
@@ -593,7 +1470,7 @@
                     <pic:cNvPicPr/>
                   </pic:nvPicPr>
                   <pic:blipFill>
-                    <a:blip r:embed="rId8"/>
+                    <a:blip r:embed="rId13"/>
                     <a:stretch>
                       <a:fillRect/>
                     </a:stretch>
@@ -660,7 +1537,7 @@
                     <pic:cNvPicPr/>
                   </pic:nvPicPr>
                   <pic:blipFill>
-                    <a:blip r:embed="rId9"/>
+                    <a:blip r:embed="rId14"/>
                     <a:stretch>
                       <a:fillRect/>
                     </a:stretch>
@@ -788,6 +1665,7 @@
       </w:r>
       <w:r>
         <w:rPr>
+          <w:noProof/>
           <w:lang w:val="en-IN"/>
         </w:rPr>
         <w:drawing>
@@ -806,7 +1684,7 @@
                     <pic:cNvPicPr/>
                   </pic:nvPicPr>
                   <pic:blipFill>
-                    <a:blip r:embed="rId10"/>
+                    <a:blip r:embed="rId15"/>
                     <a:stretch>
                       <a:fillRect/>
                     </a:stretch>
@@ -859,6 +1737,7 @@
       </w:pPr>
       <w:r>
         <w:rPr>
+          <w:noProof/>
           <w:lang w:val="en-IN"/>
         </w:rPr>
         <w:drawing>
@@ -877,7 +1756,7 @@
                     <pic:cNvPicPr/>
                   </pic:nvPicPr>
                   <pic:blipFill>
-                    <a:blip r:embed="rId11"/>
+                    <a:blip r:embed="rId16"/>
                     <a:stretch>
                       <a:fillRect/>
                     </a:stretch>
@@ -930,6 +1809,7 @@
       </w:pPr>
       <w:r>
         <w:rPr>
+          <w:noProof/>
           <w:lang w:val="en-IN"/>
         </w:rPr>
         <w:drawing>
@@ -948,7 +1828,7 @@
                     <pic:cNvPicPr/>
                   </pic:nvPicPr>
                   <pic:blipFill>
-                    <a:blip r:embed="rId12"/>
+                    <a:blip r:embed="rId17"/>
                     <a:stretch>
                       <a:fillRect/>
                     </a:stretch>
@@ -1109,6 +1989,7 @@
       </w:pPr>
       <w:r>
         <w:rPr>
+          <w:noProof/>
           <w:lang w:val="en-IN"/>
         </w:rPr>
         <w:drawing>
@@ -1127,7 +2008,7 @@
                     <pic:cNvPicPr/>
                   </pic:nvPicPr>
                   <pic:blipFill>
-                    <a:blip r:embed="rId13"/>
+                    <a:blip r:embed="rId18"/>
                     <a:stretch>
                       <a:fillRect/>
                     </a:stretch>
@@ -1227,6 +2108,7 @@
         <w:rPr>
           <w:b/>
           <w:bCs/>
+          <w:noProof/>
         </w:rPr>
         <w:lastRenderedPageBreak/>
         <w:drawing>
@@ -1245,7 +2127,7 @@
                     <pic:cNvPicPr/>
                   </pic:nvPicPr>
                   <pic:blipFill>
-                    <a:blip r:embed="rId14"/>
+                    <a:blip r:embed="rId19"/>
                     <a:stretch>
                       <a:fillRect/>
                     </a:stretch>
@@ -1297,11 +2179,20 @@
           <w:b/>
           <w:bCs/>
         </w:rPr>
-        <w:t xml:space="preserve">Dynamic Leaderboard Display </w:t>
+        <w:t xml:space="preserve">Dynamic Leaderboard </w:t>
+      </w:r>
+      <w:proofErr w:type="gramStart"/>
+      <w:r>
+        <w:rPr>
+          <w:b/>
+          <w:bCs/>
+        </w:rPr>
+        <w:t xml:space="preserve">Display </w:t>
       </w:r>
       <w:r>
         <w:t>:</w:t>
       </w:r>
+      <w:proofErr w:type="gramEnd"/>
     </w:p>
     <w:p>
       <w:pPr>
@@ -1330,6 +2221,7 @@
       <w:pPr>
         <w:ind w:left="720"/>
       </w:pPr>
+      <w:proofErr w:type="gramStart"/>
       <w:r>
         <w:rPr>
           <w:b/>
@@ -1340,6 +2232,7 @@
       <w:r>
         <w:t>:</w:t>
       </w:r>
+      <w:proofErr w:type="gramEnd"/>
     </w:p>
     <w:p>
       <w:pPr>
@@ -1372,11 +2265,20 @@
           <w:b/>
           <w:bCs/>
         </w:rPr>
-        <w:t xml:space="preserve">Refresh Button </w:t>
+        <w:t xml:space="preserve">Refresh </w:t>
+      </w:r>
+      <w:proofErr w:type="gramStart"/>
+      <w:r>
+        <w:rPr>
+          <w:b/>
+          <w:bCs/>
+        </w:rPr>
+        <w:t xml:space="preserve">Button </w:t>
       </w:r>
       <w:r>
         <w:t>:</w:t>
       </w:r>
+      <w:proofErr w:type="gramEnd"/>
     </w:p>
     <w:p>
       <w:pPr>
@@ -1398,11 +2300,20 @@
           <w:b/>
           <w:bCs/>
         </w:rPr>
-        <w:t xml:space="preserve">Row Details </w:t>
+        <w:t xml:space="preserve">Row </w:t>
+      </w:r>
+      <w:proofErr w:type="gramStart"/>
+      <w:r>
+        <w:rPr>
+          <w:b/>
+          <w:bCs/>
+        </w:rPr>
+        <w:t xml:space="preserve">Details </w:t>
       </w:r>
       <w:r>
         <w:t>:</w:t>
       </w:r>
+      <w:proofErr w:type="gramEnd"/>
     </w:p>
     <w:p>
       <w:pPr>
@@ -1419,6 +2330,7 @@
       <w:pPr>
         <w:ind w:left="720"/>
       </w:pPr>
+      <w:proofErr w:type="gramStart"/>
       <w:r>
         <w:rPr>
           <w:b/>
@@ -1429,6 +2341,7 @@
       <w:r>
         <w:t>:</w:t>
       </w:r>
+      <w:proofErr w:type="gramEnd"/>
     </w:p>
     <w:p>
       <w:pPr>
@@ -1496,11 +2409,20 @@
           <w:b/>
           <w:bCs/>
         </w:rPr>
-        <w:t xml:space="preserve">"Student XP Leaderboard" </w:t>
+        <w:t>"Student XP Leaderboard</w:t>
+      </w:r>
+      <w:proofErr w:type="gramStart"/>
+      <w:r>
+        <w:rPr>
+          <w:b/>
+          <w:bCs/>
+        </w:rPr>
+        <w:t xml:space="preserve">" </w:t>
       </w:r>
       <w:r>
         <w:t>.</w:t>
       </w:r>
+      <w:proofErr w:type="gramEnd"/>
     </w:p>
     <w:p>
       <w:pPr>
@@ -1538,6 +2460,7 @@
       </w:r>
     </w:p>
     <w:p>
+      <w:proofErr w:type="gramStart"/>
       <w:r>
         <w:rPr>
           <w:b/>
@@ -1546,10 +2469,15 @@
         <w:t xml:space="preserve">Rank </w:t>
       </w:r>
       <w:r>
-        <w:t>: The student's position based on XP.</w:t>
-      </w:r>
-    </w:p>
-    <w:p>
+        <w:t>:</w:t>
+      </w:r>
+      <w:proofErr w:type="gramEnd"/>
+      <w:r>
+        <w:t xml:space="preserve"> The student's position based on XP.</w:t>
+      </w:r>
+    </w:p>
+    <w:p>
+      <w:proofErr w:type="gramStart"/>
       <w:r>
         <w:rPr>
           <w:b/>
@@ -1558,10 +2486,15 @@
         <w:t xml:space="preserve">Username </w:t>
       </w:r>
       <w:r>
-        <w:t>: The name of the student.</w:t>
-      </w:r>
-    </w:p>
-    <w:p>
+        <w:t>:</w:t>
+      </w:r>
+      <w:proofErr w:type="gramEnd"/>
+      <w:r>
+        <w:t xml:space="preserve"> The name of the student.</w:t>
+      </w:r>
+    </w:p>
+    <w:p>
+      <w:proofErr w:type="gramStart"/>
       <w:r>
         <w:rPr>
           <w:b/>
@@ -1570,7 +2503,11 @@
         <w:t xml:space="preserve">XP </w:t>
       </w:r>
       <w:r>
-        <w:t>: The student's experience points.</w:t>
+        <w:t>:</w:t>
+      </w:r>
+      <w:proofErr w:type="gramEnd"/>
+      <w:r>
+        <w:t xml:space="preserve"> The student's experience points.</w:t>
       </w:r>
     </w:p>
     <w:p>
@@ -1620,6 +2557,7 @@
       <w:pPr>
         <w:ind w:left="1440"/>
       </w:pPr>
+      <w:proofErr w:type="gramStart"/>
       <w:r>
         <w:rPr>
           <w:b/>
@@ -1628,13 +2566,18 @@
         <w:t xml:space="preserve">Previous </w:t>
       </w:r>
       <w:r>
-        <w:t>: Navigate to the previous page of students.</w:t>
+        <w:t>:</w:t>
+      </w:r>
+      <w:proofErr w:type="gramEnd"/>
+      <w:r>
+        <w:t xml:space="preserve"> Navigate to the previous page of students.</w:t>
       </w:r>
     </w:p>
     <w:p>
       <w:pPr>
         <w:ind w:left="1440"/>
       </w:pPr>
+      <w:proofErr w:type="gramStart"/>
       <w:r>
         <w:rPr>
           <w:b/>
@@ -1643,13 +2586,18 @@
         <w:t xml:space="preserve">Next </w:t>
       </w:r>
       <w:r>
-        <w:t>: Navigate to the next page of students.</w:t>
+        <w:t>:</w:t>
+      </w:r>
+      <w:proofErr w:type="gramEnd"/>
+      <w:r>
+        <w:t xml:space="preserve"> Navigate to the next page of students.</w:t>
       </w:r>
     </w:p>
     <w:p>
       <w:pPr>
         <w:ind w:left="1440"/>
       </w:pPr>
+      <w:proofErr w:type="gramStart"/>
       <w:r>
         <w:rPr>
           <w:b/>
@@ -1658,7 +2606,11 @@
         <w:t xml:space="preserve">Refresh </w:t>
       </w:r>
       <w:r>
-        <w:t>: Reload the data from the database to reflect any changes.</w:t>
+        <w:t>:</w:t>
+      </w:r>
+      <w:proofErr w:type="gramEnd"/>
+      <w:r>
+        <w:t xml:space="preserve"> Reload the data from the database to reflect any changes.</w:t>
       </w:r>
     </w:p>
     <w:p>
@@ -1683,11 +2635,20 @@
           <w:b/>
           <w:bCs/>
         </w:rPr>
-        <w:t xml:space="preserve">View Student Details </w:t>
+        <w:t xml:space="preserve">View Student </w:t>
+      </w:r>
+      <w:proofErr w:type="gramStart"/>
+      <w:r>
+        <w:rPr>
+          <w:b/>
+          <w:bCs/>
+        </w:rPr>
+        <w:t xml:space="preserve">Details </w:t>
       </w:r>
       <w:r>
         <w:t>:</w:t>
       </w:r>
+      <w:proofErr w:type="gramEnd"/>
     </w:p>
     <w:p>
       <w:pPr>
@@ -1710,11 +2671,20 @@
           <w:b/>
           <w:bCs/>
         </w:rPr>
-        <w:t xml:space="preserve">Navigate Pages </w:t>
+        <w:t xml:space="preserve">Navigate </w:t>
+      </w:r>
+      <w:proofErr w:type="gramStart"/>
+      <w:r>
+        <w:rPr>
+          <w:b/>
+          <w:bCs/>
+        </w:rPr>
+        <w:t xml:space="preserve">Pages </w:t>
       </w:r>
       <w:r>
         <w:t>:</w:t>
       </w:r>
+      <w:proofErr w:type="gramEnd"/>
     </w:p>
     <w:p>
       <w:pPr>
@@ -1756,11 +2726,20 @@
           <w:b/>
           <w:bCs/>
         </w:rPr>
-        <w:t xml:space="preserve">Refresh Data </w:t>
+        <w:t xml:space="preserve">Refresh </w:t>
+      </w:r>
+      <w:proofErr w:type="gramStart"/>
+      <w:r>
+        <w:rPr>
+          <w:b/>
+          <w:bCs/>
+        </w:rPr>
+        <w:t xml:space="preserve">Data </w:t>
       </w:r>
       <w:r>
         <w:t>:</w:t>
       </w:r>
+      <w:proofErr w:type="gramEnd"/>
     </w:p>
     <w:p>
       <w:pPr>
@@ -1893,6 +2872,7 @@
       </w:pPr>
       <w:r>
         <w:rPr>
+          <w:noProof/>
           <w:lang w:val="en-IN"/>
         </w:rPr>
         <w:drawing>
@@ -1911,7 +2891,7 @@
                     <pic:cNvPicPr/>
                   </pic:nvPicPr>
                   <pic:blipFill>
-                    <a:blip r:embed="rId15"/>
+                    <a:blip r:embed="rId20"/>
                     <a:stretch>
                       <a:fillRect/>
                     </a:stretch>
@@ -1959,6 +2939,7 @@
       </w:pPr>
       <w:r>
         <w:rPr>
+          <w:noProof/>
           <w:lang w:val="en-IN"/>
         </w:rPr>
         <w:lastRenderedPageBreak/>
@@ -1978,7 +2959,7 @@
                     <pic:cNvPicPr/>
                   </pic:nvPicPr>
                   <pic:blipFill>
-                    <a:blip r:embed="rId16"/>
+                    <a:blip r:embed="rId21"/>
                     <a:stretch>
                       <a:fillRect/>
                     </a:stretch>
@@ -2026,6 +3007,7 @@
       </w:pPr>
       <w:r>
         <w:rPr>
+          <w:noProof/>
           <w:lang w:val="en-IN"/>
         </w:rPr>
         <w:drawing>
@@ -2044,7 +3026,7 @@
                     <pic:cNvPicPr/>
                   </pic:nvPicPr>
                   <pic:blipFill>
-                    <a:blip r:embed="rId17"/>
+                    <a:blip r:embed="rId22"/>
                     <a:stretch>
                       <a:fillRect/>
                     </a:stretch>
@@ -2104,6 +3086,7 @@
       </w:pPr>
       <w:r>
         <w:rPr>
+          <w:noProof/>
           <w:lang w:val="en-IN"/>
         </w:rPr>
         <w:drawing>
@@ -2122,7 +3105,7 @@
                     <pic:cNvPicPr/>
                   </pic:nvPicPr>
                   <pic:blipFill>
-                    <a:blip r:embed="rId18"/>
+                    <a:blip r:embed="rId23"/>
                     <a:stretch>
                       <a:fillRect/>
                     </a:stretch>
@@ -2158,31 +3141,7 @@
         <w:rPr>
           <w:lang w:val="en-IN"/>
         </w:rPr>
-        <w:t xml:space="preserve">After </w:t>
-      </w:r>
-      <w:r>
-        <w:rPr>
-          <w:lang w:val="en-IN"/>
-        </w:rPr>
-        <w:t>10</w:t>
-      </w:r>
-      <w:r>
-        <w:rPr>
-          <w:lang w:val="en-IN"/>
-        </w:rPr>
-        <w:t xml:space="preserve"> </w:t>
-      </w:r>
-      <w:r>
-        <w:rPr>
-          <w:lang w:val="en-IN"/>
-        </w:rPr>
-        <w:t>courses</w:t>
-      </w:r>
-      <w:r>
-        <w:rPr>
-          <w:lang w:val="en-IN"/>
-        </w:rPr>
-        <w:t xml:space="preserve"> have been marked as completed, the </w:t>
+        <w:t xml:space="preserve">After 10 courses have been marked as completed, the </w:t>
       </w:r>
       <w:r>
         <w:rPr>
@@ -2206,6 +3165,7 @@
       </w:pPr>
       <w:r>
         <w:rPr>
+          <w:noProof/>
           <w:lang w:val="en-IN"/>
         </w:rPr>
         <w:lastRenderedPageBreak/>
@@ -2225,7 +3185,7 @@
                     <pic:cNvPicPr/>
                   </pic:nvPicPr>
                   <pic:blipFill>
-                    <a:blip r:embed="rId19"/>
+                    <a:blip r:embed="rId24"/>
                     <a:stretch>
                       <a:fillRect/>
                     </a:stretch>
@@ -2261,19 +3221,7 @@
         <w:rPr>
           <w:lang w:val="en-IN"/>
         </w:rPr>
-        <w:t xml:space="preserve">After </w:t>
-      </w:r>
-      <w:r>
-        <w:rPr>
-          <w:lang w:val="en-IN"/>
-        </w:rPr>
-        <w:t>20</w:t>
-      </w:r>
-      <w:r>
-        <w:rPr>
-          <w:lang w:val="en-IN"/>
-        </w:rPr>
-        <w:t xml:space="preserve"> courses have been marked as completed, the </w:t>
+        <w:t xml:space="preserve">After 20 courses have been marked as completed, the </w:t>
       </w:r>
       <w:r>
         <w:rPr>
@@ -2297,6 +3245,7 @@
       </w:pPr>
       <w:r>
         <w:rPr>
+          <w:noProof/>
           <w:lang w:val="en-IN"/>
         </w:rPr>
         <w:drawing>
@@ -2315,7 +3264,7 @@
                     <pic:cNvPicPr/>
                   </pic:nvPicPr>
                   <pic:blipFill>
-                    <a:blip r:embed="rId20"/>
+                    <a:blip r:embed="rId25"/>
                     <a:stretch>
                       <a:fillRect/>
                     </a:stretch>
@@ -2378,11 +3327,63 @@
     <w:sectPr>
       <w:pgSz w:w="11906" w:h="16838"/>
       <w:pgMar w:top="1440" w:right="1440" w:bottom="1440" w:left="1440" w:header="708" w:footer="708" w:gutter="0"/>
+      <w:pgNumType w:start="0"/>
       <w:cols w:space="708"/>
+      <w:titlePg/>
       <w:docGrid w:linePitch="360"/>
     </w:sectPr>
   </w:body>
 </w:document>
+</file>
+
+<file path=word/endnotes.xml><?xml version="1.0" encoding="utf-8"?>
+<w:endnotes xmlns:wpc="http://schemas.microsoft.com/office/word/2010/wordprocessingCanvas" xmlns:cx="http://schemas.microsoft.com/office/drawing/2014/chartex" xmlns:cx1="http://schemas.microsoft.com/office/drawing/2015/9/8/chartex" xmlns:cx2="http://schemas.microsoft.com/office/drawing/2015/10/21/chartex" xmlns:cx3="http://schemas.microsoft.com/office/drawing/2016/5/9/chartex" xmlns:cx4="http://schemas.microsoft.com/office/drawing/2016/5/10/chartex" xmlns:cx5="http://schemas.microsoft.com/office/drawing/2016/5/11/chartex" xmlns:cx6="http://schemas.microsoft.com/office/drawing/2016/5/12/chartex" xmlns:cx7="http://schemas.microsoft.com/office/drawing/2016/5/13/chartex" xmlns:cx8="http://schemas.microsoft.com/office/drawing/2016/5/14/chartex" xmlns:mc="http://schemas.openxmlformats.org/markup-compatibility/2006" xmlns:aink="http://schemas.microsoft.com/office/drawing/2016/ink" xmlns:am3d="http://schemas.microsoft.com/office/drawing/2017/model3d" xmlns:o="urn:schemas-microsoft-com:office:office" xmlns:oel="http://schemas.microsoft.com/office/2019/extlst" xmlns:r="http://schemas.openxmlformats.org/officeDocument/2006/relationships" xmlns:m="http://schemas.openxmlformats.org/officeDocument/2006/math" xmlns:v="urn:schemas-microsoft-com:vml" xmlns:wp14="http://schemas.microsoft.com/office/word/2010/wordprocessingDrawing" xmlns:wp="http://schemas.openxmlformats.org/drawingml/2006/wordprocessingDrawing" xmlns:w10="urn:schemas-microsoft-com:office:word" xmlns:w="http://schemas.openxmlformats.org/wordprocessingml/2006/main" xmlns:w14="http://schemas.microsoft.com/office/word/2010/wordml" xmlns:w15="http://schemas.microsoft.com/office/word/2012/wordml" xmlns:w16cex="http://schemas.microsoft.com/office/word/2018/wordml/cex" xmlns:w16cid="http://schemas.microsoft.com/office/word/2016/wordml/cid" xmlns:w16="http://schemas.microsoft.com/office/word/2018/wordml" xmlns:w16du="http://schemas.microsoft.com/office/word/2023/wordml/word16du" xmlns:w16sdtdh="http://schemas.microsoft.com/office/word/2020/wordml/sdtdatahash" xmlns:w16sdtfl="http://schemas.microsoft.com/office/word/2024/wordml/sdtformatlock" xmlns:w16se="http://schemas.microsoft.com/office/word/2015/wordml/symex" xmlns:wpg="http://schemas.microsoft.com/office/word/2010/wordprocessingGroup" xmlns:wpi="http://schemas.microsoft.com/office/word/2010/wordprocessingInk" xmlns:wne="http://schemas.microsoft.com/office/word/2006/wordml" xmlns:wps="http://schemas.microsoft.com/office/word/2010/wordprocessingShape" mc:Ignorable="w14 w15 w16se w16cid w16 w16cex w16sdtdh w16sdtfl w16du wp14">
+  <w:endnote w:type="separator" w:id="-1">
+    <w:p>
+      <w:pPr>
+        <w:spacing w:after="0" w:line="240" w:lineRule="auto"/>
+      </w:pPr>
+      <w:r>
+        <w:separator/>
+      </w:r>
+    </w:p>
+  </w:endnote>
+  <w:endnote w:type="continuationSeparator" w:id="0">
+    <w:p>
+      <w:pPr>
+        <w:spacing w:after="0" w:line="240" w:lineRule="auto"/>
+      </w:pPr>
+      <w:r>
+        <w:continuationSeparator/>
+      </w:r>
+    </w:p>
+  </w:endnote>
+</w:endnotes>
+</file>
+
+<file path=word/footnotes.xml><?xml version="1.0" encoding="utf-8"?>
+<w:footnotes xmlns:wpc="http://schemas.microsoft.com/office/word/2010/wordprocessingCanvas" xmlns:cx="http://schemas.microsoft.com/office/drawing/2014/chartex" xmlns:cx1="http://schemas.microsoft.com/office/drawing/2015/9/8/chartex" xmlns:cx2="http://schemas.microsoft.com/office/drawing/2015/10/21/chartex" xmlns:cx3="http://schemas.microsoft.com/office/drawing/2016/5/9/chartex" xmlns:cx4="http://schemas.microsoft.com/office/drawing/2016/5/10/chartex" xmlns:cx5="http://schemas.microsoft.com/office/drawing/2016/5/11/chartex" xmlns:cx6="http://schemas.microsoft.com/office/drawing/2016/5/12/chartex" xmlns:cx7="http://schemas.microsoft.com/office/drawing/2016/5/13/chartex" xmlns:cx8="http://schemas.microsoft.com/office/drawing/2016/5/14/chartex" xmlns:mc="http://schemas.openxmlformats.org/markup-compatibility/2006" xmlns:aink="http://schemas.microsoft.com/office/drawing/2016/ink" xmlns:am3d="http://schemas.microsoft.com/office/drawing/2017/model3d" xmlns:o="urn:schemas-microsoft-com:office:office" xmlns:oel="http://schemas.microsoft.com/office/2019/extlst" xmlns:r="http://schemas.openxmlformats.org/officeDocument/2006/relationships" xmlns:m="http://schemas.openxmlformats.org/officeDocument/2006/math" xmlns:v="urn:schemas-microsoft-com:vml" xmlns:wp14="http://schemas.microsoft.com/office/word/2010/wordprocessingDrawing" xmlns:wp="http://schemas.openxmlformats.org/drawingml/2006/wordprocessingDrawing" xmlns:w10="urn:schemas-microsoft-com:office:word" xmlns:w="http://schemas.openxmlformats.org/wordprocessingml/2006/main" xmlns:w14="http://schemas.microsoft.com/office/word/2010/wordml" xmlns:w15="http://schemas.microsoft.com/office/word/2012/wordml" xmlns:w16cex="http://schemas.microsoft.com/office/word/2018/wordml/cex" xmlns:w16cid="http://schemas.microsoft.com/office/word/2016/wordml/cid" xmlns:w16="http://schemas.microsoft.com/office/word/2018/wordml" xmlns:w16du="http://schemas.microsoft.com/office/word/2023/wordml/word16du" xmlns:w16sdtdh="http://schemas.microsoft.com/office/word/2020/wordml/sdtdatahash" xmlns:w16sdtfl="http://schemas.microsoft.com/office/word/2024/wordml/sdtformatlock" xmlns:w16se="http://schemas.microsoft.com/office/word/2015/wordml/symex" xmlns:wpg="http://schemas.microsoft.com/office/word/2010/wordprocessingGroup" xmlns:wpi="http://schemas.microsoft.com/office/word/2010/wordprocessingInk" xmlns:wne="http://schemas.microsoft.com/office/word/2006/wordml" xmlns:wps="http://schemas.microsoft.com/office/word/2010/wordprocessingShape" mc:Ignorable="w14 w15 w16se w16cid w16 w16cex w16sdtdh w16sdtfl w16du wp14">
+  <w:footnote w:type="separator" w:id="-1">
+    <w:p>
+      <w:pPr>
+        <w:spacing w:after="0" w:line="240" w:lineRule="auto"/>
+      </w:pPr>
+      <w:r>
+        <w:separator/>
+      </w:r>
+    </w:p>
+  </w:footnote>
+  <w:footnote w:type="continuationSeparator" w:id="0">
+    <w:p>
+      <w:pPr>
+        <w:spacing w:after="0" w:line="240" w:lineRule="auto"/>
+      </w:pPr>
+      <w:r>
+        <w:continuationSeparator/>
+      </w:r>
+    </w:p>
+  </w:footnote>
+</w:footnotes>
 </file>
 
 <file path=word/numbering.xml><?xml version="1.0" encoding="utf-8"?>
@@ -4604,6 +5605,79 @@
       <w:spacing w:val="5"/>
     </w:rPr>
   </w:style>
+  <w:style w:type="paragraph" w:styleId="NoSpacing">
+    <w:name w:val="No Spacing"/>
+    <w:link w:val="NoSpacingChar"/>
+    <w:uiPriority w:val="1"/>
+    <w:qFormat/>
+    <w:rsid w:val="00C478A0"/>
+    <w:pPr>
+      <w:spacing w:after="0" w:line="240" w:lineRule="auto"/>
+    </w:pPr>
+    <w:rPr>
+      <w:rFonts w:eastAsiaTheme="minorEastAsia"/>
+      <w:kern w:val="0"/>
+      <w:lang w:eastAsia="en-GB"/>
+      <w14:ligatures w14:val="none"/>
+    </w:rPr>
+  </w:style>
+  <w:style w:type="character" w:customStyle="1" w:styleId="NoSpacingChar">
+    <w:name w:val="No Spacing Char"/>
+    <w:basedOn w:val="DefaultParagraphFont"/>
+    <w:link w:val="NoSpacing"/>
+    <w:uiPriority w:val="1"/>
+    <w:rsid w:val="00C478A0"/>
+    <w:rPr>
+      <w:rFonts w:eastAsiaTheme="minorEastAsia"/>
+      <w:kern w:val="0"/>
+      <w:lang w:eastAsia="en-GB"/>
+      <w14:ligatures w14:val="none"/>
+    </w:rPr>
+  </w:style>
+  <w:style w:type="paragraph" w:styleId="Header">
+    <w:name w:val="header"/>
+    <w:basedOn w:val="Normal"/>
+    <w:link w:val="HeaderChar"/>
+    <w:uiPriority w:val="99"/>
+    <w:unhideWhenUsed/>
+    <w:rsid w:val="00C478A0"/>
+    <w:pPr>
+      <w:tabs>
+        <w:tab w:val="center" w:pos="4513"/>
+        <w:tab w:val="right" w:pos="9026"/>
+      </w:tabs>
+      <w:spacing w:after="0" w:line="240" w:lineRule="auto"/>
+    </w:pPr>
+  </w:style>
+  <w:style w:type="character" w:customStyle="1" w:styleId="HeaderChar">
+    <w:name w:val="Header Char"/>
+    <w:basedOn w:val="DefaultParagraphFont"/>
+    <w:link w:val="Header"/>
+    <w:uiPriority w:val="99"/>
+    <w:rsid w:val="00C478A0"/>
+  </w:style>
+  <w:style w:type="paragraph" w:styleId="Footer">
+    <w:name w:val="footer"/>
+    <w:basedOn w:val="Normal"/>
+    <w:link w:val="FooterChar"/>
+    <w:uiPriority w:val="99"/>
+    <w:unhideWhenUsed/>
+    <w:rsid w:val="00C478A0"/>
+    <w:pPr>
+      <w:tabs>
+        <w:tab w:val="center" w:pos="4513"/>
+        <w:tab w:val="right" w:pos="9026"/>
+      </w:tabs>
+      <w:spacing w:after="0" w:line="240" w:lineRule="auto"/>
+    </w:pPr>
+  </w:style>
+  <w:style w:type="character" w:customStyle="1" w:styleId="FooterChar">
+    <w:name w:val="Footer Char"/>
+    <w:basedOn w:val="DefaultParagraphFont"/>
+    <w:link w:val="Footer"/>
+    <w:uiPriority w:val="99"/>
+    <w:rsid w:val="00C478A0"/>
+  </w:style>
 </w:styles>
 </file>
 
@@ -4900,4 +5974,23 @@
     </a:ext>
   </a:extLst>
 </a:theme>
+</file>
+
+<file path=customXml/item1.xml><?xml version="1.0" encoding="utf-8"?>
+<CoverPageProperties xmlns="http://schemas.microsoft.com/office/2006/coverPageProps">
+  <PublishDate/>
+  <Abstract>Raiyan Alam, Denis Gitman, Neel Patkar, Harman Singh, Namit Singh</Abstract>
+  <CompanyAddress/>
+  <CompanyPhone/>
+  <CompanyFax/>
+  <CompanyEmail/>
+</CoverPageProperties>
+</file>
+
+<file path=customXml/itemProps1.xml><?xml version="1.0" encoding="utf-8"?>
+<ds:datastoreItem xmlns:ds="http://schemas.openxmlformats.org/officeDocument/2006/customXml" ds:itemID="{55AF091B-3C7A-41E3-B477-F2FDAA23CFDA}">
+  <ds:schemaRefs>
+    <ds:schemaRef ds:uri="http://schemas.microsoft.com/office/2006/coverPageProps"/>
+  </ds:schemaRefs>
+</ds:datastoreItem>
 </file>
</xml_diff>